<commit_message>
update and now with updated text also
</commit_message>
<xml_diff>
--- a/docs/index.docx
+++ b/docs/index.docx
@@ -7,76 +7,165 @@
         <w:pStyle w:val="Title"/>
       </w:pPr>
       <w:r>
-        <w:t xml:space="preserve">Fear of the invader: a predatory invader may provoke stronger non-consumptive effects on a keystone native prey than a native predator</w:t>
-      </w:r>
-    </w:p>
-    <w:p>
-      <w:pPr>
-        <w:pStyle w:val="Author"/>
+        <w:t xml:space="preserve">Fear of the new: a predatory invader provokes stronger non-consumptive effects on a keystone native prey than a native predator</w:t>
+      </w:r>
+    </w:p>
+    <w:p>
+      <w:pPr>
+        <w:pStyle w:val="FirstParagraph"/>
       </w:pPr>
       <w:r>
         <w:t xml:space="preserve">Olivier V. Raven</w:t>
       </w:r>
-    </w:p>
-    <w:p>
-      <w:pPr>
-        <w:pStyle w:val="Author"/>
-      </w:pPr>
+      <w:r>
+        <w:rPr>
+          <w:vertAlign w:val="superscript"/>
+        </w:rPr>
+        <w:t xml:space="preserve">1*</w:t>
+      </w:r>
+      <w:r>
+        <w:t xml:space="preserve">, 0009-0008-6184-6831</w:t>
+      </w:r>
+      <w:r>
+        <w:br/>
+      </w:r>
       <w:r>
         <w:t xml:space="preserve">Calum MacNeil</w:t>
       </w:r>
-    </w:p>
-    <w:p>
-      <w:pPr>
-        <w:pStyle w:val="Author"/>
-      </w:pPr>
+      <w:r>
+        <w:rPr>
+          <w:vertAlign w:val="superscript"/>
+        </w:rPr>
+        <w:t xml:space="preserve">2</w:t>
+      </w:r>
+      <w:r>
+        <w:t xml:space="preserve">, 0000-0003-0402-9292</w:t>
+      </w:r>
+      <w:r>
+        <w:br/>
+      </w:r>
       <w:r>
         <w:t xml:space="preserve">Finnbar Lee</w:t>
       </w:r>
-    </w:p>
-    <w:p>
-      <w:pPr>
-        <w:pStyle w:val="Author"/>
-      </w:pPr>
+      <w:r>
+        <w:rPr>
+          <w:vertAlign w:val="superscript"/>
+        </w:rPr>
+        <w:t xml:space="preserve">2</w:t>
+      </w:r>
+      <w:r>
+        <w:t xml:space="preserve">, 0000-0002-9219-1486</w:t>
+      </w:r>
+      <w:r>
+        <w:br/>
+      </w:r>
       <w:r>
         <w:t xml:space="preserve">Robin Holmes</w:t>
       </w:r>
-    </w:p>
-    <w:p>
-      <w:pPr>
-        <w:pStyle w:val="Author"/>
-      </w:pPr>
+      <w:r>
+        <w:rPr>
+          <w:vertAlign w:val="superscript"/>
+        </w:rPr>
+        <w:t xml:space="preserve">2</w:t>
+      </w:r>
+      <w:r>
+        <w:t xml:space="preserve">, 0000-0002-8737-2717</w:t>
+      </w:r>
+      <w:r>
+        <w:br/>
+      </w:r>
       <w:r>
         <w:t xml:space="preserve">Ian A. Kusabs</w:t>
       </w:r>
-    </w:p>
-    <w:p>
-      <w:pPr>
-        <w:pStyle w:val="Author"/>
-      </w:pPr>
+      <w:r>
+        <w:rPr>
+          <w:vertAlign w:val="superscript"/>
+        </w:rPr>
+        <w:t xml:space="preserve">3</w:t>
+      </w:r>
+      <w:r>
+        <w:t xml:space="preserve">, 0000-0002-1473-7447</w:t>
+      </w:r>
+      <w:r>
+        <w:br/>
+      </w:r>
       <w:r>
         <w:t xml:space="preserve">Francis J. Burdon</w:t>
       </w:r>
-    </w:p>
-    <w:p>
-      <w:pPr>
-        <w:pStyle w:val="Author"/>
-      </w:pPr>
+      <w:r>
+        <w:rPr>
+          <w:vertAlign w:val="superscript"/>
+        </w:rPr>
+        <w:t xml:space="preserve">1</w:t>
+      </w:r>
+      <w:r>
+        <w:t xml:space="preserve">, 0000-0002-5398-4993</w:t>
+      </w:r>
+      <w:r>
+        <w:br/>
+      </w:r>
       <w:r>
         <w:t xml:space="preserve">Deniz Özkundakci</w:t>
       </w:r>
-    </w:p>
-    <w:p>
-      <w:pPr>
-        <w:pStyle w:val="Date"/>
-      </w:pPr>
-      <w:r>
-        <w:t xml:space="preserve">2026-06-17</w:t>
-      </w:r>
-    </w:p>
-    <w:p>
-      <w:pPr>
-        <w:pStyle w:val="AbstractTitle"/>
+      <w:r>
+        <w:rPr>
+          <w:vertAlign w:val="superscript"/>
+        </w:rPr>
+        <w:t xml:space="preserve">1</w:t>
+      </w:r>
+      <w:r>
+        <w:t xml:space="preserve">, 0000-0002-5442-4576</w:t>
+      </w:r>
+    </w:p>
+    <w:p>
+      <w:pPr>
+        <w:pStyle w:val="BodyText"/>
+      </w:pPr>
+      <w:r>
+        <w:rPr>
+          <w:vertAlign w:val="superscript"/>
+        </w:rPr>
+        <w:t xml:space="preserve">1</w:t>
+      </w:r>
+      <w:r>
+        <w:t xml:space="preserve"> Te Aka Mātuatua – School of Science, University of Waikato, Private Bag 3105, Hamilton 3240, New Zealand</w:t>
+      </w:r>
+      <w:r>
+        <w:br/>
+      </w:r>
+      <w:r>
+        <w:rPr>
+          <w:vertAlign w:val="superscript"/>
+        </w:rPr>
+        <w:t xml:space="preserve">2</w:t>
+      </w:r>
+      <w:r>
+        <w:t xml:space="preserve"> The Cawthron Institute, 98 Halifax Street East, Nelson 7010, Private Bag 2, Nelson 7042, New Zealand</w:t>
+      </w:r>
+      <w:r>
+        <w:br/>
+      </w:r>
+      <w:r>
+        <w:rPr>
+          <w:vertAlign w:val="superscript"/>
+        </w:rPr>
+        <w:t xml:space="preserve">3</w:t>
+      </w:r>
+      <w:r>
+        <w:t xml:space="preserve"> Ian Kusabs and Associates Limited, 21 Summit Road, Rotorua 3076, New Zealand</w:t>
+      </w:r>
+    </w:p>
+    <w:p>
+      <w:pPr>
+        <w:pStyle w:val="BodyText"/>
+      </w:pPr>
+      <w:r>
+        <w:t xml:space="preserve">*Corresponding author: olivier.raven@icloud.com; or81@students.waikato.ac.nz</w:t>
+      </w:r>
+    </w:p>
+    <w:p>
+      <w:pPr>
+        <w:pStyle w:val="Heading2"/>
       </w:pPr>
       <w:r>
         <w:t xml:space="preserve">Abstract</w:t>
@@ -84,10 +173,10 @@
     </w:p>
     <w:p>
       <w:pPr>
-        <w:pStyle w:val="Abstract"/>
-      </w:pPr>
-      <w:r>
-        <w:t xml:space="preserve">Non-consumptive effects (NCEs) of predators on prey encompass costly antipredator behaviours such as increased refuge use and reduced foraging, which can influence prey population dynamics and community structure, particularly when the prey themselves are keystone species. In Aotearoa-New Zealand, the native freshwater crayfish kōura (</w:t>
+        <w:pStyle w:val="FirstParagraph"/>
+      </w:pPr>
+      <w:r>
+        <w:t xml:space="preserve">The non-consumptive effects (NCEs) of predators on prey result in costly antipredator behaviours, including increased refuge use and reduced foraging. NCEs significantly influence prey population dynamics, community interactions, and affect ecosystem functioning, particularly when the prey are keystone species. In Aotearoa-New Zealand, the native freshwater crayfish kōura (</w:t>
       </w:r>
       <w:r>
         <w:rPr>
@@ -97,7 +186,7 @@
         <w:t xml:space="preserve">Paranephrops planifrons</w:t>
       </w:r>
       <w:r>
-        <w:t xml:space="preserve">) is a keystone species, an ecosystem engineer with a critical functional role in sediment dynamics, nutrient cycling and benthic community structure. Kōura are preyed upon by both the co-evolved native longfin eel (</w:t>
+        <w:t xml:space="preserve">) is a keystone species with an important functional role affecting sediment bioturbation, nutrient cycling, and benthic community structure. Kōura are preyed upon by multiple predators including native longfin eel (</w:t>
       </w:r>
       <w:r>
         <w:rPr>
@@ -117,7 +206,49 @@
         <w:t xml:space="preserve">Ameiurus nebulosus</w:t>
       </w:r>
       <w:r>
-        <w:t xml:space="preserve">), a species introduced less than two centuries ago. Under laboratory conditions, we tested whether visual and chemical cues from these two predators induced different refuge-seeking and feeding behaviour responses by kōura. Predator presence produced a NCE on refuge use, with kōura exposed to catfish cues showing significantly greater refuge-seeking behaviour than those exposed to eel cues. This is consistent with the generalisation theory triggered by unfamiliar predator cues rather than classic prey naivety. Our study indicates catfish incursions may provoke a greater NCEs on kōura refuge use than resident eels. As catfish range expansion continues, these NCEs represent an ecologically significant and underappreciated threat to kōura populations, compounding the direct predation pressure already documented for this invader.</w:t>
+        <w:t xml:space="preserve">). Under laboratory conditions, we tested whether visual and chemical cues from these two predators induced different refuge-seeking and feeding behaviour responses by kōura. Predator presence produced in the dark a NCE on refuge use, with kōura exposed to catfish showing significantly greater refuge-seeking behaviour than those exposed to eels. This result is consistent with the generalisation theory triggered by unfamiliar predator cues rather than classic prey naivety. Our study indicates catfish incursions may provoke a greater NCE on kōura behaviours than resident eels. As catfish range expansion continues, these NCEs may represent an ecologically significant and underappreciated threat to kōura populations, compounding the direct predation pressure already documented for this invader.</w:t>
+      </w:r>
+    </w:p>
+    <w:p>
+      <w:pPr>
+        <w:pStyle w:val="BodyText"/>
+      </w:pPr>
+      <w:r>
+        <w:rPr>
+          <w:b/>
+          <w:bCs/>
+        </w:rPr>
+        <w:t xml:space="preserve">Key words:</w:t>
+      </w:r>
+      <w:r>
+        <w:t xml:space="preserve"> </w:t>
+      </w:r>
+      <w:r>
+        <w:t xml:space="preserve">Non-consumptive effects</w:t>
+      </w:r>
+      <w:r>
+        <w:t xml:space="preserve">; </w:t>
+      </w:r>
+      <w:r>
+        <w:t xml:space="preserve">Crayfish</w:t>
+      </w:r>
+      <w:r>
+        <w:t xml:space="preserve">; </w:t>
+      </w:r>
+      <w:r>
+        <w:t xml:space="preserve">Kōura</w:t>
+      </w:r>
+      <w:r>
+        <w:t xml:space="preserve">; </w:t>
+      </w:r>
+      <w:r>
+        <w:t xml:space="preserve">Brown bullhead catfish</w:t>
+      </w:r>
+      <w:r>
+        <w:t xml:space="preserve">; </w:t>
+      </w:r>
+      <w:r>
+        <w:t xml:space="preserve">Antipredator behaviour</w:t>
       </w:r>
     </w:p>
     <w:bookmarkStart w:id="16" w:name="introduction"/>
@@ -134,7 +265,7 @@
         <w:pStyle w:val="FirstParagraph"/>
       </w:pPr>
       <w:r>
-        <w:t xml:space="preserve">Biological invasions can have profound impacts on invaded ecosystems, particularly through the introduction of novel predators that prey upon native species lacking an evolutionary history with them</w:t>
+        <w:t xml:space="preserve">Biological invasions can have profound impacts on invaded ecosystems, particularly through the introduction of novel predators that prey upon naïve native species lacking coevolved defence mechanisms</w:t>
       </w:r>
       <w:r>
         <w:t xml:space="preserve"> </w:t>
@@ -143,7 +274,16 @@
         <w:t xml:space="preserve">(Doherty et al. 2016)</w:t>
       </w:r>
       <w:r>
-        <w:t xml:space="preserve">. Native prey may be naïve not just to a specific invader, but to entire functional groups of predators, making them especially vulnerable to direct predation when an invasion introduces a predator type entirely absent from their evolutionary history [Sih2010; Carthey2014]. In addition to these consumptive effects, native prey may exhibit heightened fear responses to invasive predators, leading to the development of anti-predator behaviours such as increased refuge use and avoidance of open habitats</w:t>
+        <w:t xml:space="preserve">. Native prey may be naïve not just to a specific invader, but to entire functional groups of predators, making them especially vulnerable to direct predation when an invasion introduces a predator type entirely absent from their evolutionary history</w:t>
+      </w:r>
+      <w:r>
+        <w:t xml:space="preserve"> </w:t>
+      </w:r>
+      <w:r>
+        <w:t xml:space="preserve">(Sih et al. 2010; Carthey and Banks 2014)</w:t>
+      </w:r>
+      <w:r>
+        <w:t xml:space="preserve">. In addition to these consumptive effects, native prey may exhibit heightened fear responses to invasive predators, leading to the development of anti-predator behaviours such as increased refuge use and avoidance of open habitats</w:t>
       </w:r>
       <w:r>
         <w:t xml:space="preserve"> </w:t>
@@ -161,7 +301,7 @@
         <w:t xml:space="preserve">(Preisser et al. 2005)</w:t>
       </w:r>
       <w:r>
-        <w:t xml:space="preserve">. In contrast, native predators generally elicit different responses because prey and predators have co-evolved, resulting in behavioural and physiological adaptations that stabilise predator–prey interactions</w:t>
+        <w:t xml:space="preserve">. In contrast, native predators generally elicit different responses because prey and predators have coevolved, resulting in behavioural and physiological adaptations that stabilise predator–prey interactions</w:t>
       </w:r>
       <w:r>
         <w:t xml:space="preserve"> </w:t>
@@ -178,7 +318,16 @@
         <w:pStyle w:val="BodyText"/>
       </w:pPr>
       <w:r>
-        <w:t xml:space="preserve">Freshwater crayfish often live in turbid flowing water or in the dark depths of lakes where they rely primarily on chemical cues (kairomones) rather than visual cues to detect and respond to predatory fish</w:t>
+        <w:t xml:space="preserve">Chemical signals (kairomones) are a key component of NCEs</w:t>
+      </w:r>
+      <w:r>
+        <w:t xml:space="preserve"> </w:t>
+      </w:r>
+      <w:r>
+        <w:t xml:space="preserve">(Kasumyan 2022)</w:t>
+      </w:r>
+      <w:r>
+        <w:t xml:space="preserve">. Freshwater crayfish release and detect kairomones to help navigate aquatic environments and mediate interactions with predatory fish</w:t>
       </w:r>
       <w:r>
         <w:t xml:space="preserve"> </w:t>
@@ -187,7 +336,16 @@
         <w:t xml:space="preserve">(Blake and Hart 1993; Brönmark and Hansson 2012; Wood and Moore 2020a)</w:t>
       </w:r>
       <w:r>
-        <w:t xml:space="preserve">. These kairomones carry signals via excreta, mucus, or skin, that crayfish use to assess predator risk, responding more strongly to predators that have consumed conspecifics and to alarm cues released when prey is injured or killed</w:t>
+        <w:t xml:space="preserve">. Kairomones carry signals via excreta, mucus, or skin, that crayfish use to detect predators</w:t>
+      </w:r>
+      <w:r>
+        <w:t xml:space="preserve"> </w:t>
+      </w:r>
+      <w:r>
+        <w:t xml:space="preserve">(Appelberg et al. 1993)</w:t>
+      </w:r>
+      <w:r>
+        <w:t xml:space="preserve">. Crayfish respond more strongly to signals from predators that have consumed conspecifics and to alarm cues released when conspecifics are injured or killed</w:t>
       </w:r>
       <w:r>
         <w:t xml:space="preserve"> </w:t>
@@ -196,7 +354,7 @@
         <w:t xml:space="preserve">(Gherardi et al. 2011; Beattie and Moore 2018)</w:t>
       </w:r>
       <w:r>
-        <w:t xml:space="preserve">. Exposure to kairomones from predatory fish can generate NCEs, including reduced growth and reduced activity levels in crayfish</w:t>
+        <w:t xml:space="preserve">. The NCEs due to kairomone detection include reduced growth, reduced activity levels</w:t>
       </w:r>
       <w:r>
         <w:t xml:space="preserve"> </w:t>
@@ -205,7 +363,16 @@
         <w:t xml:space="preserve">(Adams 2007; Ramberg-Pihl and Yurewicz 2020)</w:t>
       </w:r>
       <w:r>
-        <w:t xml:space="preserve">, and even non-predatory fish can cause these behaviour changes, likely through heightened generalised awareness of risk</w:t>
+        <w:t xml:space="preserve">, and altered social dynamics like the use of refuge spaces</w:t>
+      </w:r>
+      <w:r>
+        <w:t xml:space="preserve"> </w:t>
+      </w:r>
+      <w:r>
+        <w:t xml:space="preserve">(Driscoll et al. 2020)</w:t>
+      </w:r>
+      <w:r>
+        <w:t xml:space="preserve">. Non-predatory fish can also trigger behaviour changes, likely through an increased awareness of potential risk</w:t>
       </w:r>
       <w:r>
         <w:t xml:space="preserve"> </w:t>
@@ -214,7 +381,7 @@
         <w:t xml:space="preserve">(Nyström 2005)</w:t>
       </w:r>
       <w:r>
-        <w:t xml:space="preserve">. However, the strength of these responses depends on prior experience as wild-caught individual crayfish show stronger antipredator responses than farmed conspecifics naive to predators</w:t>
+        <w:t xml:space="preserve">. However, the strength of these responses depends on prior experience as wild-caught individual crayfish show stronger antipredator responses than farmed conspecifics naïve to predators</w:t>
       </w:r>
       <w:r>
         <w:t xml:space="preserve"> </w:t>
@@ -247,7 +414,29 @@
         <w:t xml:space="preserve"> </w:t>
       </w:r>
       <w:r>
-        <w:t xml:space="preserve">(White, 1842) commonly known as kōura is a taonga (‘culturally treasured’) species for Māori, the indigenous people of Aotearoa and is valued as a food resource</w:t>
+        <w:t xml:space="preserve">(White, 1842) is a keystone species impacted by non-native species. This crayfish species is commonly known as kōura and is a</w:t>
+      </w:r>
+      <w:r>
+        <w:t xml:space="preserve"> </w:t>
+      </w:r>
+      <w:r>
+        <w:rPr>
+          <w:i/>
+          <w:iCs/>
+        </w:rPr>
+        <w:t xml:space="preserve">taonga</w:t>
+      </w:r>
+      <w:r>
+        <w:t xml:space="preserve"> </w:t>
+      </w:r>
+      <w:r>
+        <w:t xml:space="preserve">(</w:t>
+      </w:r>
+      <w:r>
+        <w:t xml:space="preserve">‘treasured’</w:t>
+      </w:r>
+      <w:r>
+        <w:t xml:space="preserve">) species for Māori, the indigenous people of Aotearoa, with strong cultural values as a food resource</w:t>
       </w:r>
       <w:r>
         <w:t xml:space="preserve"> </w:t>
@@ -256,7 +445,7 @@
         <w:t xml:space="preserve">(Kusabs and Quinn 2009)</w:t>
       </w:r>
       <w:r>
-        <w:t xml:space="preserve">. Ecologically, kōura play a critical role in freshwater ecosystems as ecosystem engineers through their effects on sediment dynamics, nutrient cycling, and benthic community structure, and have been described as keystone species in many freshwater systems</w:t>
+        <w:t xml:space="preserve">. Ecologically, kōura play a critical role as ecosystem engineers through their effects on sediment dynamics, nutrient cycling, and benthic community structure</w:t>
       </w:r>
       <w:r>
         <w:t xml:space="preserve"> </w:t>
@@ -265,7 +454,7 @@
         <w:t xml:space="preserve">(Collier et al. 1997; Parkyn et al. 2001; Usio and Townsend 2004)</w:t>
       </w:r>
       <w:r>
-        <w:t xml:space="preserve">. Currently kōura are threatened by multiple interacting stressors, including climate change, water-quality degradation and invasive species, contributing to widespread population declines</w:t>
+        <w:t xml:space="preserve">. Currently, kōura are threatened by multiple stressors, including climate change, water-quality degradation and invasive species, contributing to widespread population declines</w:t>
       </w:r>
       <w:r>
         <w:t xml:space="preserve"> </w:t>
@@ -282,7 +471,7 @@
         <w:pStyle w:val="BodyText"/>
       </w:pPr>
       <w:r>
-        <w:t xml:space="preserve">Kōura have a long co-evolutionary history with the native longfin eel (</w:t>
+        <w:t xml:space="preserve">Kōura have a long coevolutionary history with the native longfin eel (</w:t>
       </w:r>
       <w:r>
         <w:rPr>
@@ -302,7 +491,7 @@
         <w:t xml:space="preserve">A. australis</w:t>
       </w:r>
       <w:r>
-        <w:t xml:space="preserve">)</w:t>
+        <w:t xml:space="preserve">) in Aotearoa</w:t>
       </w:r>
       <w:r>
         <w:t xml:space="preserve"> </w:t>
@@ -311,7 +500,7 @@
         <w:t xml:space="preserve">(Brown 2009; MacNeil et al. 2025)</w:t>
       </w:r>
       <w:r>
-        <w:t xml:space="preserve">. Reflecting this history, kōura respond more strongly to eel kairomones than to those of introduced non-native brown trout (</w:t>
+        <w:t xml:space="preserve">. Reflecting this coevolutionary history, kōura can respond more strongly to eel kairomones than to those of introduced non-native brown trout (</w:t>
       </w:r>
       <w:r>
         <w:rPr>
@@ -321,7 +510,7 @@
         <w:t xml:space="preserve">Salmo trutta</w:t>
       </w:r>
       <w:r>
-        <w:t xml:space="preserve">), even when sourced from streams where both predators were present, suggesting that co-evolutionary history, rather than individual experience alone, shaped kōura predator recognition</w:t>
+        <w:t xml:space="preserve">), even when sourced from streams where both predators were present</w:t>
       </w:r>
       <w:r>
         <w:t xml:space="preserve"> </w:t>
@@ -330,7 +519,19 @@
         <w:t xml:space="preserve">(Shave et al. 1994)</w:t>
       </w:r>
       <w:r>
-        <w:t xml:space="preserve">. One of the invasive species that threatens kōura is the non-native brown bullhead catfish (</w:t>
+        <w:t xml:space="preserve">.</w:t>
+      </w:r>
+      <w:r>
+        <w:t xml:space="preserve"> </w:t>
+      </w:r>
+      <w:r>
+        <w:t xml:space="preserve">Shave et al. (1994)</w:t>
+      </w:r>
+      <w:r>
+        <w:t xml:space="preserve"> </w:t>
+      </w:r>
+      <w:r>
+        <w:t xml:space="preserve">suggest that kōura predator recognition is a fixed behavioural trait shaped by coevolution. An invasive fish species that threatens kōura is the brown bullhead catfish (</w:t>
       </w:r>
       <w:r>
         <w:rPr>
@@ -340,7 +541,7 @@
         <w:t xml:space="preserve">Ameiurus nebulosus</w:t>
       </w:r>
       <w:r>
-        <w:t xml:space="preserve">) (hereafter catfish) which was introduced to Aotearoa in 1877 and has since spread through many waterways on the North Island</w:t>
+        <w:t xml:space="preserve">) (hereafter catfish). Catfish were introduced to Aotearoa in 1877, and the invasive species has since spread to multiple lakes and rivers in the North Island</w:t>
       </w:r>
       <w:r>
         <w:t xml:space="preserve"> </w:t>
@@ -349,16 +550,16 @@
         <w:t xml:space="preserve">(McDowall 1990; Barnes and Hicks 2003; Dedual 2019)</w:t>
       </w:r>
       <w:r>
-        <w:t xml:space="preserve">. For example, a decade ago catfish were confirmed present in two large volcanic lakes, Lakes Rotoiti and Rotorua in the Bay of Plenty region, which also contain kōura</w:t>
-      </w:r>
-      <w:r>
-        <w:t xml:space="preserve"> </w:t>
-      </w:r>
-      <w:r>
-        <w:t xml:space="preserve">(Lee et al. 2025)</w:t>
-      </w:r>
-      <w:r>
-        <w:t xml:space="preserve">. The catfish is highly tolerant of a wide range of environmental conditions</w:t>
+        <w:t xml:space="preserve">. For example, in 2016/18, the presence of catfish was confirmed in two large volcanic lakes, Lakes Rotoiti and Rotorua in the Bay of Plenty region, which have historically contained large populations of kōura</w:t>
+      </w:r>
+      <w:r>
+        <w:t xml:space="preserve"> </w:t>
+      </w:r>
+      <w:r>
+        <w:t xml:space="preserve">(Francis 2019; Lee et al. 2025)</w:t>
+      </w:r>
+      <w:r>
+        <w:t xml:space="preserve">. Catfish are highly tolerant of a wide range of environmental conditions</w:t>
       </w:r>
       <w:r>
         <w:t xml:space="preserve"> </w:t>
@@ -370,7 +571,7 @@
         <w:t xml:space="preserve"> </w:t>
       </w:r>
       <w:r>
-        <w:t xml:space="preserve">and, due to its broad gape and opportunistic feeding behaviour, is capable of consuming a wide variety of native aquatic organisms</w:t>
+        <w:t xml:space="preserve">and their broad gape and opportunistic feeding behaviour enable the consumption of a wide variety of aquatic prey</w:t>
       </w:r>
       <w:r>
         <w:t xml:space="preserve"> </w:t>
@@ -379,7 +580,7 @@
         <w:t xml:space="preserve">(Scott and Crossman 1973; Dedual 2019)</w:t>
       </w:r>
       <w:r>
-        <w:t xml:space="preserve">. In Aotearoa, which originally has no native fish remotely similar to a catfish the recent and ongoing spread of catfish into North Island waterways represents a truly novel predation threat to which kōura may lack adequate behavioural or sensory adaptations.</w:t>
+        <w:t xml:space="preserve">. Given Aotearoa lacks native Siluriformes, the recent and ongoing spread of catfish into North Island waterways represents a truly novel predation threat to which kōura may lack adequate behavioural or sensory adaptations to respond.</w:t>
       </w:r>
     </w:p>
     <w:p>
@@ -387,7 +588,7 @@
         <w:pStyle w:val="BodyText"/>
       </w:pPr>
       <w:r>
-        <w:t xml:space="preserve">In this study, controlled laboratory experiments were used to test whether novel vs native predator presence and associated chemical cues induced changes in NCEs (refuge-seeking and feeding behaviour) by kōura. Our experiments were designed to test which of two competing hypotheses best describes kōura behavioural responses to native and invasive predator cues. 1. Kōura would show more shelter-seeking behaviour when presented with eels compared to catfish, due to naivety of the kōura towards a novel predator such as catfish</w:t>
+        <w:t xml:space="preserve">In this study, we used controlled laboratory experiments to test whether the presence of a novel and native predator induced differences in kōura NCEs, specifically refuge-seeking and feeding behaviours. Our experiments tested the following two hypotheses regarding kōura behavioural responses to predator cues: 1) Kōura would show less shelter-seeking behaviour when presented with catfish compared to eels, due to naivety towards a novel predator</w:t>
       </w:r>
       <w:r>
         <w:t xml:space="preserve"> </w:t>
@@ -396,7 +597,7 @@
         <w:t xml:space="preserve">(Carthey and Banks 2014)</w:t>
       </w:r>
       <w:r>
-        <w:t xml:space="preserve">. Or 2, kōura would respond more strongly to unfamiliar catfish cues than to the co-evolved eel, consistent with a generalised fear response to a novel predator type</w:t>
+        <w:t xml:space="preserve">; or 2) kōura would respond more strongly to unfamiliar catfish cues than to the native eel, consistent with a generalised fear response to a novel predator type</w:t>
       </w:r>
       <w:r>
         <w:t xml:space="preserve"> </w:t>
@@ -405,7 +606,7 @@
         <w:t xml:space="preserve">(Sih et al. 2023)</w:t>
       </w:r>
       <w:r>
-        <w:t xml:space="preserve">. Further, we expected that light regime would have an influence on shelter seeking behaviour of kōura, which like many crayfish, are most active nocturnally</w:t>
+        <w:t xml:space="preserve">. Further, we expected that light regime would have an influence on shelter seeking behaviour, as kōura, like many crayfish, are primarily nocturnal</w:t>
       </w:r>
       <w:r>
         <w:t xml:space="preserve"> </w:t>
@@ -414,11 +615,11 @@
         <w:t xml:space="preserve">(Devcich 1979; Johnson et al. 2014)</w:t>
       </w:r>
       <w:r>
-        <w:t xml:space="preserve">. We also predicted that kōura feeding would be more inhibited when exposed to eel kairomones than to those of the catfish, reflecting the same co-evolutionary recognition expected to drive greater refuge use in response to eels. The overall aim of the refuge and feeding behaviour studies were to contribute to understanding the behavioural mechanisms underlying kōura vulnerability to invasive catfish and how these may differ from and be additional to, those already manifested in the presence of native predators such as eels.</w:t>
+        <w:t xml:space="preserve">. We also predicted that kōura feeding rates would follow the patterns hypothesized above and either be more in the presence of catfish than eels, reflecting stronger antipredator responses to the native predator, or reduced in the presence of the unfamiliar invasive predator, reflecting a generalised fear response to the novel predator. Overall, the refuge-use and feeding experiment aimed to improve understanding of the behavioural mechanisms underlying kōura vulnerability to invasive catfish, and how these responses may differ, and add to, those displayed in the presence of native predators such as eels.</w:t>
       </w:r>
     </w:p>
     <w:bookmarkEnd w:id="16"/>
-    <w:bookmarkStart w:id="20" w:name="materials-and-methods"/>
+    <w:bookmarkStart w:id="21" w:name="materials-and-methods"/>
     <w:p>
       <w:pPr>
         <w:pStyle w:val="Heading1"/>
@@ -441,7 +642,25 @@
         <w:pStyle w:val="FirstParagraph"/>
       </w:pPr>
       <w:r>
-        <w:t xml:space="preserve">In mid-August 2025, 92 kōura were sourced from two catfish-free lakes, (Ōkāreka and Tikitapu (Blue Lake)) in the Rotorua Te Arawa Lakes area, Bay of Plenty region of the North Island. Eels are present in most of the rivers and lakes of Aotearoa (McDowall 1990) and may be present in both lakes, but scarce. In late September 2025, catfish and eels were sourced from Lake Rotoroa in Hamilton in the Waikato region of the North Island. Experiments were conducted at the Aquatic Research Centre of the University of Waikato. All three species were held separately in holding tanks and acclimated for a week in dechlorinated tap water under the following controlled regime: a 10:14 light: dark cycle reflecting the correct seasonal day-length at a stable temperature of 15.6 °C, pH 8.4 and 10 mg l⁻¹ dissolved oxygen, the latter parameters reflecting typical physiochemical condition in source lakes. Kōura and fish were fed every other day on Hikari Tropical carnivore fish food pellets (animal protein 47%). Because kōura are taonga (culturally treasured) species, permission had to be sought from relevant iwi (Māori tribal unit), as well as relevant government. All experimental procedures were conducted under University of Waikato animal ethics committee approval (protocol number: 1232; see Ethical Approval section).</w:t>
+        <w:t xml:space="preserve">In mid-August 2025, 92 kōura were sourced from two catfish-free lakes, Ōkāreka and Tikitapu, within the Rotorua Te Arawa Lakes area in the North Island of Aotearoa. Eels are rare or absent in these lakes</w:t>
+      </w:r>
+      <w:r>
+        <w:t xml:space="preserve"> </w:t>
+      </w:r>
+      <w:r>
+        <w:t xml:space="preserve">(Martin et al. 2007)</w:t>
+      </w:r>
+      <w:r>
+        <w:t xml:space="preserve">, potentially limiting the recent coevolutionary history with local kōura populations. However, eels are a native predator that has a long record of coexistence with kōura in Aotearoa</w:t>
+      </w:r>
+      <w:r>
+        <w:t xml:space="preserve"> </w:t>
+      </w:r>
+      <w:r>
+        <w:t xml:space="preserve">(McDowall 1990; Feldmann and Pole 1994; Kaulfuss et al. 2018)</w:t>
+      </w:r>
+      <w:r>
+        <w:t xml:space="preserve">. In this study our focus was on the macroevolutionary implications of the native predator compared to a novel invader, regardless of the local coevolutionary history. In late September 2025, catfish and eels were sourced from Lake Rotoroa in Hamilton in the Waikato region of the North Island. Experiments were conducted at the Aquatic Research Centre of the University of Waikato. All three species were held separately in holding tanks and acclimated for a week in the laboratory conditions. These included a 10:14 light:dark cycle reflecting the seasonal day-length and dechlorinated tap water with stable temperatures (15.6 °C), pH (8.4) and dissolved oxygen concentrations (10 mg l⁻¹). These parameters reflect typical physiochemical conditions in the source lakes. Kōura and fish were fed every other day with commercial carnivore pellets (Hikari Tropical, Kyorin Food Industries Ltd., Japan; animal protein 47%). Because kōura are a taonga (treasured) species, permission was obtained from Te Arawa Lakes Trust and Te Komiti Whakahaere. All experimental procedures were conducted under University of Waikato animal ethics committee approval (protocol number: 1232; see Ethical Approval section).</w:t>
       </w:r>
     </w:p>
     <w:bookmarkEnd w:id="17"/>
@@ -471,7 +690,7 @@
         <w:t xml:space="preserve"> </w:t>
       </w:r>
       <w:r>
-        <w:t xml:space="preserve">and restricting test animals to a single sex allowed a smaller overall number of kōura to be used. Kōura had a mean (± SD) orbital carapace length (OCL) of 26.0 mm (± 3.08) (18.35-32.95 mm range) and a mean (± SD) wet weight of 11.7 g (± 4.25) (3–23 g range). Catfish ranged in length from 260-267 mm and 2.34–3.16 kg wet weight and eels ranged in wet weight from 2.50-3.52 kg, both these size ranges being able to consume adult kōura</w:t>
+        <w:t xml:space="preserve">and restricting test animals to a single sex allowed a smaller overall number of kōura to be used. Kōura had a mean (± SD) orbital carapace length (OCL) of 26.0 mm (± 3.08) (18.35-32.95 mm range) and a mean (± SD) wet weight of 11.7 g (± 4.25) (3–23 g range). Catfish ranged in length from 260-267 mm and 2.34–3.16 kg wet weight and eels ranged in wet weight from 2.50-3.52 kg, with both these size ranges being able to consume adult kōura</w:t>
       </w:r>
       <w:r>
         <w:t xml:space="preserve"> </w:t>
@@ -499,7 +718,7 @@
         </w:r>
       </w:hyperlink>
       <w:r>
-        <w:t xml:space="preserve">). All tanks were filled with ~26 L dechlorinated tap water and had identical environmental regimes as previously detailed for acclimatisation tanks, with water flow provided by an air stone. Each tank housed a single kōura on one side of the barrier and either a single predator (catfish or eel) or no predator (control) on the other side. A halved terracotta pot (90 mm diameter × 90 mm depth) was positioned on the kōura side of the tank to serve as a potential refuge. To control for potential tank location or compartment side effects, the position of predator treatments within the aquaria was systematically rotated between experimental rounds. The experiment was repeated across five rounds, resulting in 11 catfish replicates, 11 eel replicates, and 10 control replicates and was first carried out in the light (~400 lux; n = 32) before being repeated in the dark (~70 lux; n = 32). Observations were made in the dark using red lighting positioned centrally above the tanks to minimize disturbance, as many aquatic species have limited sensitivity to red wavelengths and are unlikely to perceive this light. Following each individual experimental run, each tank was thoroughly cleaned and refilled with dechlorinated tap water before reuse. Each individual kōura was only exposed once to a fish predator and there were no mortalities of kōura or fish during experiments. All experiments were conducted within a three-week period during October 2025.</w:t>
+        <w:t xml:space="preserve">). All tanks were filled with ~26 L dechlorinated tap water and had identical environmental regimes as previously detailed for acclimatisation tanks, with water flow provided by an air stone. Each tank housed a single kōura on one side of the barrier and either a single predator (catfish or eel) or no predator (control) on the other side. A halved terracotta pot (90 mm diameter × 90 mm depth) was positioned on the kōura side of the tank to serve as a potential refuge. To control for potential tank location or compartment side effects, the position of predator treatments within the aquaria was systematically rotated between experimental rounds. The experiment was conducted across eight rounds (each lasting 5 hours), four rounds under light conditions (~400 lux, n = 32 kōura: 11 catfish, 11 eel, 10 control) and four separate rounds with different kōura under dark conditions (~70 lux, n = 32 kōura: 11 catfish, 11 eel, 10 control). Observations were made in the dark using red lighting positioned centrally above the tanks to minimize disturbance, as many aquatic species have limited sensitivity to red wavelengths and are unlikely to perceive this part of the spectrum. Following each individual experimental run, each tank was thoroughly cleaned and refilled with dechlorinated tap water before reuse. Each individual kōura was only exposed once to a fish predator and there were no mortalities of kōura or fish during experiments. All experiments were conducted within a three-week period during October 2025.</w:t>
       </w:r>
     </w:p>
     <w:p>
@@ -507,60 +726,7 @@
         <w:pStyle w:val="BodyText"/>
       </w:pPr>
       <w:r>
-        <w:t xml:space="preserve">At the beginning of each experiment, an individual kōura was placed in the middle of the tank compartment containing the refuge and observations of each kōura location were recorded at 21 time intervals within a 5 hour period (the intervals being: 0, 5, 10, 20, 30, 45, 60, 61, 65, 70, 80, 90, 120, 150, 210, 240, 245, 260, 275, 290, and 300 minutes). The 0-minute recording was the individual’s initial immediate location after its addition to the tank. Kōura location was recorded as either refuge (the animal was using the refuge, being inside it or immediately behind it and touching it) or non-refuge/ in the open (any other location in the tank where the animal was not in the refuge or touching the refuge). The fish predator was introduced into the tank on the other side of the barrier from the kōura compartment, after 60 minutes and removed after 240 minutes. The compressed intervals around 60–65 minutes and 240–245 minutes were designed to capture immediate behavioural responses at the point of predator introduction and removal respectively. The control tanks had no fish added but at 60 minutes and again at 240 minutes, the water in the ‘predator’ compartment was mechanically disturbed by agitating the water with a small hand net for approximately 30 seconds. This was to simulate the disturbance time associated with adding and removing fish in the other treatments with the same size hand net. At the end of each experiment, the kōura was removed after the final 300-minute observation.</w:t>
-      </w:r>
-    </w:p>
-    <w:p>
-      <w:pPr>
-        <w:pStyle w:val="BodyText"/>
-      </w:pPr>
-      <w:r>
-        <w:t xml:space="preserve">To analyse kōura refuge use, a beta-binomial generalized linear mixed-effects model (GLMM) was fitted using the glmmTMB package in R</w:t>
-      </w:r>
-      <w:r>
-        <w:t xml:space="preserve"> </w:t>
-      </w:r>
-      <w:r>
-        <w:t xml:space="preserve">(Brooks et al. 2017; R Core Team 2025)</w:t>
-      </w:r>
-      <w:r>
-        <w:t xml:space="preserve">. To address potential non-independence of repeated observations within tanks, raw observations were first aggregated into three experimental periods (before, during, and after predator introduction) per individual kōura, with the number of observations in refuge our of total observations per period used as the response variable. Treatment (catfish, eel, control), light condition (light, dark), and period (before, during, after) were included as fixed effects. A beta-binomial distribution was used to account for overdispersion in the binomial proportion data. Nine candidate models were compared, differing in fixed effect structure (main effects only, two-way interactions, and full three-way interaction) and random effects inclusion (no random effects, tank identity, and tank plus experimental round as random intercepts), using the corrected Akaike Information Criterion (AICc), appropriate given the ratio of sample size to estimated parameters (n/k &lt; 40;</w:t>
-      </w:r>
-      <w:r>
-        <w:t xml:space="preserve"> </w:t>
-      </w:r>
-      <w:r>
-        <w:t xml:space="preserve">Burnham and Anderson (2002)</w:t>
-      </w:r>
-      <w:r>
-        <w:t xml:space="preserve">). The best-supported model included treatment, light condition, and period as fixed effects with no random intercept, indicating that variance among tanks and rounds did not improve model fit beyond the fixed effect’s structure. Model fit of the final model was assessed using DHARMa simulation-based residuals, including tests for overdispersion and zero-inflation</w:t>
-      </w:r>
-      <w:r>
-        <w:t xml:space="preserve"> </w:t>
-      </w:r>
-      <w:r>
-        <w:t xml:space="preserve">(</w:t>
-      </w:r>
-      <w:r>
-        <w:t xml:space="preserve">Hartig et al.</w:t>
-      </w:r>
-      <w:r>
-        <w:t xml:space="preserve"> </w:t>
-      </w:r>
-      <w:r>
-        <w:t xml:space="preserve">2024)</w:t>
-      </w:r>
-      <w:r>
-        <w:t xml:space="preserve">. Marginal means and pairwise contrasts between factor levels were obtained using the emmeans package</w:t>
-      </w:r>
-      <w:r>
-        <w:t xml:space="preserve"> </w:t>
-      </w:r>
-      <w:r>
-        <w:t xml:space="preserve">(Lenth et al. 2026)</w:t>
-      </w:r>
-      <w:r>
-        <w:t xml:space="preserve">. Spearman rank correlations with Bonferroni-adjusted p-values were also used to investigate potential relationships between kōura body size (OCL) and overall refuge use (all time intervals combined) in the three treatments.</w:t>
+        <w:t xml:space="preserve">At the beginning of each experiment, an individual kōura was placed in the middle of the tank compartment containing the refuge. Kōura location was recorded at 21-time intervals over a 5-hour period, with observations spaced at progressively longer intervals to capture immediate behavioural responses at key timepoints (predator introduction at 60 min, removal at 240 min). The 0-minute recording was the individual’s initial immediate location after its addition to the tank. Kōura location was recorded as either refuge (the animal was using the refuge, being inside it or immediately behind it and touching it) or non-refuge/ in the open (any other location in the tank where the animal was not in the refuge or touching the refuge). The control tanks had no fish added but at 60 minutes and again at 240 minutes, the water in the ‘predator’ compartment was mechanically disturbed by agitating the water with a small hand net for approximately 30 seconds. This was to simulate the disturbance time associated with adding and removing fish in the other treatments with the same size hand net. At the end of each experiment, the kōura was removed after the final 300-minute observation.</w:t>
       </w:r>
     </w:p>
     <w:bookmarkEnd w:id="18"/>
@@ -578,36 +744,17 @@
         <w:pStyle w:val="FirstParagraph"/>
       </w:pPr>
       <w:r>
-        <w:t xml:space="preserve">Experiments were conducted in glass tanks (320 × 170 × 170 mm), containing 5 L dechlorinated tap water and a halved terracotta pot (90 mm diameter × 90 mm depth). Catfish and eels had been held at the same density in separate identical holding tanks for a week prior to experiment. Fish exudates were collected by placing four fish (catfish or eel) in a 10 L bucket filled with water from the holding tanks for 15 minutes to concentrate the kairomones in the water. For eel and catfish treatments, 1 L from the buckets was added to each tank already holding 5 L of tap water, and for control an additional 1 L of dechlorinated tap water was added. Next, 10 Hikari Tropical carnivore pellets were added to each tank. Trial experiments showed these pellets remained intact for over 24 hours in tap water. In three rounds, a total of 46 male kōura were measured and weighed. Their mean (± SD) OCL was 27.93 mm (± 4.80), with a range of 20.48 to 40.88 mm, and the mean (± SD) wet weight of 15.83 g (± 8.99), ranging from 6.00 to 42.00 g. Each kōura was then placed individually in a tank. For each round kōura were starved for different periods (either 0, 3 or 4 days) prior to the feeding experiment to also investigate how starvation period influenced feeding motivation. After 0 days starvation, 14 kōura were exposed to eel water (n = 4), catfish water (n = 6) or control water (n = 4). After 3 days starvation, 16 kōura were exposed to eel water (n = 6), catfish water (n = 5) or control water (n = 5). After 4 days starvation, 16 kōura were exposed to eel water (n = 5), catfish water (n = 5) or control water (n = 6). After 24 hours, when each experiment was terminated, the number of pellets eaten (to the nearest quarter pellet) was counted and the feeding rate (pellets eaten per gram of wet weight (WW) of kōura) calculated. Kōura feeding rate was analysed using a linear model with pellets consumed per gram wet weight as the response, with treatment (catfish, eel, control) and starvation period (0, 3, 4) as fixed effects. Because each starvation period was conducted in a separate experimental round, starvation period and round were fully confounded by design, precluding the inclusion of round as a random effect. Overall significance of fixed effects was assessed using Type III ANOVA (car package;</w:t>
-      </w:r>
-      <w:r>
-        <w:t xml:space="preserve"> </w:t>
-      </w:r>
-      <w:r>
-        <w:t xml:space="preserve">Fox and Weisberg (2018)</w:t>
-      </w:r>
-      <w:r>
-        <w:t xml:space="preserve">), and model assumptions were verified using residual plots and testing normality of residuals using the Shapiro-Wilk test. Pairwise comparisons between treatment and starvation level combinations were conducted using estimated marginal means.</w:t>
+        <w:t xml:space="preserve">Experiments were conducted in glass tanks (320 × 170 × 170 mm), containing 5 L dechlorinated tap water and a halved terracotta pot (90 mm diameter × 90 mm depth). Catfish and eels had been held at the same density in separate identical holding tanks for a week prior to experiment. Fish exudates were collected by placing four fish (catfish or eel) in a 10 L bucket filled with water from the holding tanks for 15 minutes to concentrate the kairomones in the water. For eel and catfish treatments, 1 L from the buckets was added to each tank already holding 5 L of tap water, and for control an additional 1 L of dechlorinated tap water was added. Next, 10 Hikari Tropical carnivore pellets were added to each tank. Experimental trials showed pellets remain intact in tap water for over 24 hours. In three rounds, a total of 46 male kōura were measured and weighed. Their mean (± SD) OCL was 27.93 mm (± 4.80), with a range of 20.48 to 40.88 mm, and the mean (± SD) wet weight of 15.83 g (± 8.99), ranging from 6.00 to 42.00 g. Each kōura was then placed individually in a tank. To investigate how starvation period influenced feeding motivation, each round kōura were starved for different periods (either 0, 3 or 4 days) prior to the feeding experiment. After 0 days starvation, 14 kōura were exposed to eel water (n = 4), catfish water (n = 6) or control water (n = 4). After 3 days starvation, 16 kōura were exposed to eel water (n = 6), catfish water (n = 5) or control water (n = 5). After 4 days starvation, 16 kōura were exposed to eel water (n = 5), catfish water (n = 5) or control water (n = 6). After 24 hours, when each experiment was terminated, the number of pellets eaten (to the nearest quarter pellet) was counted and the feeding rate (pellets eaten per gram of wet weight (WW) of kōura) calculated.</w:t>
       </w:r>
     </w:p>
     <w:bookmarkEnd w:id="19"/>
-    <w:bookmarkEnd w:id="20"/>
-    <w:bookmarkStart w:id="23" w:name="results"/>
-    <w:p>
-      <w:pPr>
-        <w:pStyle w:val="Heading1"/>
-      </w:pPr>
-      <w:r>
-        <w:t xml:space="preserve">Results</w:t>
-      </w:r>
-    </w:p>
-    <w:bookmarkStart w:id="21" w:name="refuge-experiment-1"/>
+    <w:bookmarkStart w:id="20" w:name="data-analysis"/>
     <w:p>
       <w:pPr>
         <w:pStyle w:val="Heading2"/>
       </w:pPr>
       <w:r>
-        <w:t xml:space="preserve">Refuge experiment</w:t>
+        <w:t xml:space="preserve">Data analysis</w:t>
       </w:r>
     </w:p>
     <w:p>
@@ -615,29 +762,43 @@
         <w:pStyle w:val="FirstParagraph"/>
       </w:pPr>
       <w:r>
-        <w:t xml:space="preserve">The proportion of time kōura spent in refuge varied across treatments, experimental periods, and light conditions (</w:t>
-      </w:r>
-      <w:hyperlink w:anchor="fig-emmeans-stratified-ms">
-        <w:r>
-          <w:rPr>
-            <w:rStyle w:val="Hyperlink"/>
-          </w:rPr>
-          <w:t xml:space="preserve">Figure 2</w:t>
-        </w:r>
-      </w:hyperlink>
-      <w:r>
-        <w:t xml:space="preserve">). Stratified analyses revealed that treatment effects on refuge use differed between light and dark conditions. Under light conditions, there were no significant differences in refuge use among the three treatments (</w:t>
-      </w:r>
-      <w:hyperlink w:anchor="tbl-emmeans-stratified">
-        <w:r>
-          <w:rPr>
-            <w:rStyle w:val="Hyperlink"/>
-          </w:rPr>
-          <w:t xml:space="preserve">Table 1</w:t>
-        </w:r>
-      </w:hyperlink>
-      <w:r>
-        <w:t xml:space="preserve">). In contrast, under dark condition, kōura exposed to catfish used refuge significantly more than those exposed to eels (p = 0.004), with control treatment refuge use was intermediate (p = 0.083 vs catfish, p = 0.565 vs eel). Regarding experimental periods, refuge use differed significantly between periods in light conditions, with lower refuge use before predator introduction compared to after predator removal (p = 0.021). No significant period effects were observed in dark conditions. The combined model showed that light regime had a significant effect on refuge use (p = 0.005), with kōura using refuge more in light than in dark conditions across all treatments. Overall, under light conditions, the pattern of refuge use in the control treatment was more similar to the catfish treatment, whereas under dark conditions it more resembled the eel treatment (Fig. 3; Table S1). There was also no relationship between kōura OCL and refuge use in any of the three treatments (rs = rs = -0.09, p = 0.693, rs = 0.09, p = 0.680 and rs = 0.16, p = 0.494 for catfish, eel and control treatments respectively, all NS).</w:t>
+        <w:t xml:space="preserve">To analyse kōura refuge use, beta-binomial generalized linear mixed-effects models (GLMMs) were fitted using the glmmTMB package in R</w:t>
+      </w:r>
+      <w:r>
+        <w:t xml:space="preserve"> </w:t>
+      </w:r>
+      <w:r>
+        <w:t xml:space="preserve">(Brooks et al. 2017; R Core Team 2025)</w:t>
+      </w:r>
+      <w:r>
+        <w:t xml:space="preserve">. To address potential non-independence of repeated observations within tanks, raw observations were first aggregated into three experimental periods (before, during, and after predator introduction) per individual kōura, with the number of observations in refuge out of total observations per period used as the response variable. Treatment (catfish, eel, control) and period (before, during, after) were included as fixed effects, and tank and experimental round as random intercepts. Because light condition and experimental round were fully confounded by design (rounds 1–4 in light, rounds 5–8 in darkness), separate analyses were conducted for each light condition to allow round as a random intercept and to test whether treatment effects varied under each light condition. A beta-binomial distribution was used to account for overdispersion in the binomial proportion data. Model fit was assessed using DHARMa simulation-based residuals, including tests for overdispersion and zero-inflation</w:t>
+      </w:r>
+      <w:r>
+        <w:t xml:space="preserve"> </w:t>
+      </w:r>
+      <w:r>
+        <w:t xml:space="preserve">(</w:t>
+      </w:r>
+      <w:r>
+        <w:t xml:space="preserve">Hartig et al.</w:t>
+      </w:r>
+      <w:r>
+        <w:t xml:space="preserve"> </w:t>
+      </w:r>
+      <w:r>
+        <w:t xml:space="preserve">2024)</w:t>
+      </w:r>
+      <w:r>
+        <w:t xml:space="preserve">. Marginal means and pairwise contrasts between factor levels were obtained using the emmeans package</w:t>
+      </w:r>
+      <w:r>
+        <w:t xml:space="preserve"> </w:t>
+      </w:r>
+      <w:r>
+        <w:t xml:space="preserve">(Lenth et al. 2026)</w:t>
+      </w:r>
+      <w:r>
+        <w:t xml:space="preserve">, with p-values adjusted for multiple comparisons using Sidak correction. Additionally, a combined GLMM (without round as random effect) was fitted to test the overall effect of light condition across all treatments. Spearman rank correlations with Bonferroni-adjusted p-values were used to investigate potential relationships between kōura body size (OCL) and overall refuge use (all time intervals combined) in the three treatments.</w:t>
       </w:r>
     </w:p>
     <w:p>
@@ -645,42 +806,7 @@
         <w:pStyle w:val="BodyText"/>
       </w:pPr>
       <w:r>
-        <w:t xml:space="preserve">For all treatments individual kōura were highly variable in their movement around tanks and use of refuges, even in the time intervals comprising the first 60 minutes of the experiment, before fish were introduced. The coefficient of variations (CVs) for kōura refuge use in the light and the dark before fish introduction were similarly high, being 60.4 % and 58.2 % (both n = 32) respectively, confirming high baseline variation in kōura refuge use, regardless of treatment type. Despite this inherent variation in individual kōura behaviour, clear patterns in kōura refuge use were evident over the course of the experiment. Under light conditions, the control showed the largest overall increase in refuge use (40% to 82%), driven primarily by a sharp rise in the ‘after’ period, while the catfish treatment showed a more sustained increase across all periods (52% to 73%) and the eel treatment the smallest increase (35% to 53%</w:t>
-      </w:r>
-      <w:r>
-        <w:t xml:space="preserve"> </w:t>
-      </w:r>
-      <w:hyperlink w:anchor="fig-refuge-plot-ms">
-        <w:r>
-          <w:rPr>
-            <w:rStyle w:val="Hyperlink"/>
-          </w:rPr>
-          <w:t xml:space="preserve">Figure 3</w:t>
-        </w:r>
-      </w:hyperlink>
-      <w:r>
-        <w:t xml:space="preserve">). Under dark conditions, the pattern shifted, with the catfish treatment showing the greatest increase (39% to 70%), while the eel treatment showed a modest and non-sustained increase (27% to 41% during exposure, returning to 36% after), and the control remained comparatively low throughout (37% to 47%).</w:t>
-      </w:r>
-    </w:p>
-    <w:bookmarkEnd w:id="21"/>
-    <w:bookmarkStart w:id="22" w:name="feeding-experiment-1"/>
-    <w:p>
-      <w:pPr>
-        <w:pStyle w:val="Heading2"/>
-      </w:pPr>
-      <w:r>
-        <w:t xml:space="preserve">Feeding experiment</w:t>
-      </w:r>
-    </w:p>
-    <w:p>
-      <w:pPr>
-        <w:pStyle w:val="FirstParagraph"/>
-      </w:pPr>
-      <w:r>
-        <w:t xml:space="preserve">The linear mixed model showed that starvation period had a significant effect on kōura feeding rate (3 days:</w:t>
-      </w:r>
-      <w:r>
-        <w:t xml:space="preserve"> </w:t>
+        <w:t xml:space="preserve">Kōura feeding rate was analysed using a linear mixed model with pellets consumed per gram wet weight as the response variable and starvation period (0, 3, 4) as a fixed effect, with tank identity as a random intercept to account for potential tank-level clustering. Because each starvation period was conducted in a separate experimental round, starvation period and experimental round were fully confounded by design. Consequently, round was excluded as a random effect. However, starvation period was included as a fixed effect to test for differences in feeding across hunger states, acknowledging that observed effects may reflect round-specific variation rather than hunger alone. Model selection using AICc indicated that starvation period alone provided the best fit, with treatment not improving model fit (delta AICc = 14.38). Therefore, treatment effects were excluded from the main model and instead examined separately within each starvation period using stratified linear models to avoid confounding treatment comparisons with the starvation-round confounding. Model assumptions were verified using residual diagnostics (Q-Q plots and residual plots) and testing normality of residuals using the Shapiro-Wilk test. As residuals at day 0 starvation violated normality assumptions (</w:t>
       </w:r>
       <w:r>
         <w:rPr>
@@ -693,10 +819,46 @@
         <w:t xml:space="preserve"> </w:t>
       </w:r>
       <w:r>
-        <w:t xml:space="preserve">= &lt;0.001; 4 days:</w:t>
-      </w:r>
-      <w:r>
-        <w:t xml:space="preserve"> </w:t>
+        <w:t xml:space="preserve">= 0.011), a non-parametric Kruskal-Wallis test was executed. Pairwise comparisons for starvation period were conducted using estimated marginal means with Sidak adjustment for multiple comparisons.</w:t>
+      </w:r>
+    </w:p>
+    <w:bookmarkEnd w:id="20"/>
+    <w:bookmarkEnd w:id="21"/>
+    <w:bookmarkStart w:id="24" w:name="results"/>
+    <w:p>
+      <w:pPr>
+        <w:pStyle w:val="Heading1"/>
+      </w:pPr>
+      <w:r>
+        <w:t xml:space="preserve">Results</w:t>
+      </w:r>
+    </w:p>
+    <w:bookmarkStart w:id="22" w:name="refuge-experiment-1"/>
+    <w:p>
+      <w:pPr>
+        <w:pStyle w:val="Heading2"/>
+      </w:pPr>
+      <w:r>
+        <w:t xml:space="preserve">Refuge experiment</w:t>
+      </w:r>
+    </w:p>
+    <w:p>
+      <w:pPr>
+        <w:pStyle w:val="FirstParagraph"/>
+      </w:pPr>
+      <w:r>
+        <w:t xml:space="preserve">The proportion of time kōura spent in refuge varied across treatments, experimental periods, and light conditions (</w:t>
+      </w:r>
+      <w:hyperlink w:anchor="fig-emmeans-stratified">
+        <w:r>
+          <w:rPr>
+            <w:rStyle w:val="Hyperlink"/>
+          </w:rPr>
+          <w:t xml:space="preserve">Figure 2</w:t>
+        </w:r>
+      </w:hyperlink>
+      <w:r>
+        <w:t xml:space="preserve">). Stratified analyses revealed that treatment effects on refuge use differed between light and dark conditions. Under dark condition, kōura exposed to catfish used refuge significantly more than those exposed to eels (</w:t>
       </w:r>
       <w:r>
         <w:rPr>
@@ -709,38 +871,21 @@
         <w:t xml:space="preserve"> </w:t>
       </w:r>
       <w:r>
-        <w:t xml:space="preserve">= 0.046;</w:t>
-      </w:r>
-      <w:r>
-        <w:t xml:space="preserve"> </w:t>
-      </w:r>
-      <w:hyperlink w:anchor="fig-feeding-plot-ms">
-        <w:r>
-          <w:rPr>
-            <w:rStyle w:val="Hyperlink"/>
-          </w:rPr>
-          <w:t xml:space="preserve">Figure 4</w:t>
+        <w:t xml:space="preserve">= 0.004;</w:t>
+      </w:r>
+      <w:r>
+        <w:t xml:space="preserve"> </w:t>
+      </w:r>
+      <w:hyperlink w:anchor="tbl-emmeans-stratified">
+        <w:r>
+          <w:rPr>
+            <w:rStyle w:val="Hyperlink"/>
+          </w:rPr>
+          <w:t xml:space="preserve">Table 1</w:t>
         </w:r>
       </w:hyperlink>
       <w:r>
-        <w:t xml:space="preserve">;</w:t>
-      </w:r>
-      <w:r>
-        <w:t xml:space="preserve"> </w:t>
-      </w:r>
-      <w:hyperlink w:anchor="tbl-feeding-summary">
-        <w:r>
-          <w:rPr>
-            <w:rStyle w:val="Hyperlink"/>
-          </w:rPr>
-          <w:t xml:space="preserve">Table 3</w:t>
-        </w:r>
-      </w:hyperlink>
-      <w:r>
-        <w:t xml:space="preserve">). Treatment was not included in the main model following model selection. Stratified analyses revealed no significant treatment effects across starvation periods. Although residuals at day 0 violated normality (Shapiro-Wilk</w:t>
-      </w:r>
-      <w:r>
-        <w:t xml:space="preserve"> </w:t>
+        <w:t xml:space="preserve">), however the control treatment in the dark was not significant with either the catfish or the eel treatment (</w:t>
       </w:r>
       <w:r>
         <w:rPr>
@@ -753,7 +898,7 @@
         <w:t xml:space="preserve"> </w:t>
       </w:r>
       <w:r>
-        <w:t xml:space="preserve">= 0.0112), the non-parametric Kruskal-Wallis test confirmed no treatment effect (χ² = 2.3011,</w:t>
+        <w:t xml:space="preserve">= 0.083,</w:t>
       </w:r>
       <w:r>
         <w:t xml:space="preserve"> </w:t>
@@ -769,7 +914,7 @@
         <w:t xml:space="preserve"> </w:t>
       </w:r>
       <w:r>
-        <w:t xml:space="preserve">= 0.3165). Days 3 and 4 met normality assumptions and showed no significant treatment effects (</w:t>
+        <w:t xml:space="preserve">= 0.565). In contrast, under light conditions, there were no significant differences in refuge use between the three treatments, but refuge use differed significantly between experimental periods, with lower refuge use before predator introduction compared to after predator removal (</w:t>
       </w:r>
       <w:r>
         <w:rPr>
@@ -782,12 +927,242 @@
         <w:t xml:space="preserve"> </w:t>
       </w:r>
       <w:r>
+        <w:t xml:space="preserve">= 0.021). No significant period effects were observed in dark conditions. The combined model showed that light regime had a significant effect on refuge use (</w:t>
+      </w:r>
+      <w:r>
+        <w:rPr>
+          <w:i/>
+          <w:iCs/>
+        </w:rPr>
+        <w:t xml:space="preserve">p</w:t>
+      </w:r>
+      <w:r>
+        <w:t xml:space="preserve"> </w:t>
+      </w:r>
+      <w:r>
+        <w:t xml:space="preserve">= 0.005), with kōura using refuge more in light than in dark conditions across all treatments. Overall, under light conditions, the pattern of refuge use in the control treatment was more similar to the catfish treatment, whereas under dark conditions it more resembled the eel treatment (Fig. 3; Table S1). There was also no relationship between kōura OCL and refuge use in any of the three treatments (rs = -0.09,</w:t>
+      </w:r>
+      <w:r>
+        <w:t xml:space="preserve"> </w:t>
+      </w:r>
+      <w:r>
+        <w:rPr>
+          <w:i/>
+          <w:iCs/>
+        </w:rPr>
+        <w:t xml:space="preserve">p</w:t>
+      </w:r>
+      <w:r>
+        <w:t xml:space="preserve"> </w:t>
+      </w:r>
+      <w:r>
+        <w:t xml:space="preserve">= 0.693, rs = 0.09,</w:t>
+      </w:r>
+      <w:r>
+        <w:t xml:space="preserve"> </w:t>
+      </w:r>
+      <w:r>
+        <w:rPr>
+          <w:i/>
+          <w:iCs/>
+        </w:rPr>
+        <w:t xml:space="preserve">p</w:t>
+      </w:r>
+      <w:r>
+        <w:t xml:space="preserve"> </w:t>
+      </w:r>
+      <w:r>
+        <w:t xml:space="preserve">= 0.680 and rs = 0.16,</w:t>
+      </w:r>
+      <w:r>
+        <w:t xml:space="preserve"> </w:t>
+      </w:r>
+      <w:r>
+        <w:rPr>
+          <w:i/>
+          <w:iCs/>
+        </w:rPr>
+        <w:t xml:space="preserve">p</w:t>
+      </w:r>
+      <w:r>
+        <w:t xml:space="preserve"> </w:t>
+      </w:r>
+      <w:r>
+        <w:t xml:space="preserve">= 0.494 for catfish, eel and control treatments respectively, all NS).</w:t>
+      </w:r>
+    </w:p>
+    <w:p>
+      <w:pPr>
+        <w:pStyle w:val="BodyText"/>
+      </w:pPr>
+      <w:r>
+        <w:t xml:space="preserve">For all treatments individual kōura were highly variable in their movement around tanks and use of refuges, even in the time intervals comprising the first 60 minutes of the experiment, before fish were introduced. The coefficient of variations (CVs) for kōura refuge use in the light and the dark before fish introduction were similarly high, being 60.4 % and 58.2 % (both n = 32) respectively, confirming high baseline variation in kōura refuge use, regardless of treatment type. Despite this inherent variation in individual kōura behaviour, clear patterns in kōura refuge use were evident over the course of the experiment (</w:t>
+      </w:r>
+      <w:hyperlink w:anchor="fig-refuge-plot">
+        <w:r>
+          <w:rPr>
+            <w:rStyle w:val="Hyperlink"/>
+          </w:rPr>
+          <w:t xml:space="preserve">Figure 3</w:t>
+        </w:r>
+      </w:hyperlink>
+      <w:r>
+        <w:t xml:space="preserve">). Under light conditions, the control showed the largest overall increase in refuge use (40% to 82%), driven primarily by a sharp rise in the</w:t>
+      </w:r>
+      <w:r>
+        <w:t xml:space="preserve"> </w:t>
+      </w:r>
+      <w:r>
+        <w:t xml:space="preserve">‘after’</w:t>
+      </w:r>
+      <w:r>
+        <w:t xml:space="preserve"> </w:t>
+      </w:r>
+      <w:r>
+        <w:t xml:space="preserve">period, while the catfish treatment showed a more sustained increase across all periods (52% to 73%) and the eel treatment the smallest increase (35% to 53%). Under dark conditions, the pattern shifted, with the catfish treatment showing the greatest increase (39% to 70%), while the eel treatment showed a modest and non-sustained increase (27% to 41% during</w:t>
+      </w:r>
+      <w:r>
+        <w:t xml:space="preserve"> </w:t>
+      </w:r>
+      <w:r>
+        <w:t xml:space="preserve">‘exposure’</w:t>
+      </w:r>
+      <w:r>
+        <w:t xml:space="preserve">, returning to 36%</w:t>
+      </w:r>
+      <w:r>
+        <w:t xml:space="preserve"> </w:t>
+      </w:r>
+      <w:r>
+        <w:t xml:space="preserve">‘after’</w:t>
+      </w:r>
+      <w:r>
+        <w:t xml:space="preserve">), and the control remained comparatively low throughout (37% to 47%).</w:t>
+      </w:r>
+    </w:p>
+    <w:bookmarkEnd w:id="22"/>
+    <w:bookmarkStart w:id="23" w:name="feeding-experiment-1"/>
+    <w:p>
+      <w:pPr>
+        <w:pStyle w:val="Heading2"/>
+      </w:pPr>
+      <w:r>
+        <w:t xml:space="preserve">Feeding experiment</w:t>
+      </w:r>
+    </w:p>
+    <w:p>
+      <w:pPr>
+        <w:pStyle w:val="FirstParagraph"/>
+      </w:pPr>
+      <w:r>
+        <w:t xml:space="preserve">The linear mixed model showed that starvation period had a significant effect on kōura feeding rate (3 days:</w:t>
+      </w:r>
+      <w:r>
+        <w:t xml:space="preserve"> </w:t>
+      </w:r>
+      <w:r>
+        <w:rPr>
+          <w:i/>
+          <w:iCs/>
+        </w:rPr>
+        <w:t xml:space="preserve">p</w:t>
+      </w:r>
+      <w:r>
+        <w:t xml:space="preserve"> </w:t>
+      </w:r>
+      <w:r>
+        <w:t xml:space="preserve">&lt; 0.001; 4 days:</w:t>
+      </w:r>
+      <w:r>
+        <w:t xml:space="preserve"> </w:t>
+      </w:r>
+      <w:r>
+        <w:rPr>
+          <w:i/>
+          <w:iCs/>
+        </w:rPr>
+        <w:t xml:space="preserve">p</w:t>
+      </w:r>
+      <w:r>
+        <w:t xml:space="preserve"> </w:t>
+      </w:r>
+      <w:r>
+        <w:t xml:space="preserve">= 0.046;</w:t>
+      </w:r>
+      <w:r>
+        <w:t xml:space="preserve"> </w:t>
+      </w:r>
+      <w:hyperlink w:anchor="fig-feeding-plot">
+        <w:r>
+          <w:rPr>
+            <w:rStyle w:val="Hyperlink"/>
+          </w:rPr>
+          <w:t xml:space="preserve">Figure 4</w:t>
+        </w:r>
+      </w:hyperlink>
+      <w:r>
+        <w:t xml:space="preserve">;</w:t>
+      </w:r>
+      <w:r>
+        <w:t xml:space="preserve"> </w:t>
+      </w:r>
+      <w:hyperlink w:anchor="tbl-feeding-summary">
+        <w:r>
+          <w:rPr>
+            <w:rStyle w:val="Hyperlink"/>
+          </w:rPr>
+          <w:t xml:space="preserve">Table 3</w:t>
+        </w:r>
+      </w:hyperlink>
+      <w:r>
+        <w:t xml:space="preserve">). Treatment was not included in the main model following model selection. Stratified analyses revealed no significant treatment effects across starvation periods. Although residuals at day 0 violated normality (Shapiro-Wilk</w:t>
+      </w:r>
+      <w:r>
+        <w:t xml:space="preserve"> </w:t>
+      </w:r>
+      <w:r>
+        <w:rPr>
+          <w:i/>
+          <w:iCs/>
+        </w:rPr>
+        <w:t xml:space="preserve">p</w:t>
+      </w:r>
+      <w:r>
+        <w:t xml:space="preserve"> </w:t>
+      </w:r>
+      <w:r>
+        <w:t xml:space="preserve">= 0.0112), the non-parametric Kruskal-Wallis test confirmed no treatment effect (</w:t>
+      </w:r>
+      <w:r>
+        <w:rPr>
+          <w:i/>
+          <w:iCs/>
+        </w:rPr>
+        <w:t xml:space="preserve">p</w:t>
+      </w:r>
+      <w:r>
+        <w:t xml:space="preserve"> </w:t>
+      </w:r>
+      <w:r>
+        <w:t xml:space="preserve">= 0.3165). Starvation days 3 and 4 met normality assumptions and showed no significant treatment effects (</w:t>
+      </w:r>
+      <w:r>
+        <w:rPr>
+          <w:i/>
+          <w:iCs/>
+        </w:rPr>
+        <w:t xml:space="preserve">p</w:t>
+      </w:r>
+      <w:r>
+        <w:t xml:space="preserve"> </w:t>
+      </w:r>
+      <w:r>
         <w:t xml:space="preserve">= 0.1495 and 0.1573 respectively). After 4 days starvation, the mean (±SE) kōura feeding rate (pellets g WW⁻¹) for the control was over two and a half times that of the catfish and eel treatments (0.148 ± 0.035 compared to 0.059 ± 0.039 and 0.052 ± 0.039 respectively).</w:t>
       </w:r>
     </w:p>
-    <w:bookmarkEnd w:id="22"/>
     <w:bookmarkEnd w:id="23"/>
-    <w:bookmarkStart w:id="27" w:name="discussion"/>
+    <w:bookmarkEnd w:id="24"/>
+    <w:bookmarkStart w:id="28" w:name="discussion"/>
     <w:p>
       <w:pPr>
         <w:pStyle w:val="Heading1"/>
@@ -801,7 +1176,19 @@
         <w:pStyle w:val="FirstParagraph"/>
       </w:pPr>
       <w:r>
-        <w:t xml:space="preserve">Prey modify their behaviour in response to predation risk, creating a ‘landscape’ of fear that affects foraging, movement, and habitat use independently of actual predation events</w:t>
+        <w:t xml:space="preserve">Prey modify their behaviour in response to predation risk, creating a</w:t>
+      </w:r>
+      <w:r>
+        <w:t xml:space="preserve"> </w:t>
+      </w:r>
+      <w:r>
+        <w:t xml:space="preserve">‘landscape of fear’</w:t>
+      </w:r>
+      <w:r>
+        <w:t xml:space="preserve"> </w:t>
+      </w:r>
+      <w:r>
+        <w:t xml:space="preserve">that affects foraging, movement, and habitat use independently of actual predation events</w:t>
       </w:r>
       <w:r>
         <w:t xml:space="preserve"> </w:t>
@@ -810,19 +1197,7 @@
         <w:t xml:space="preserve">(Laundré et al. 2001)</w:t>
       </w:r>
       <w:r>
-        <w:t xml:space="preserve">. However, until relatively recently, most ecological models still assumed that predator and prey populations interacted solely through predator-prey densities by killing and consuming prey despite it being evident that by forcing prey to adopt energetically costly defensive strategies, predators can also reduce prey densities through NCEs</w:t>
-      </w:r>
-      <w:r>
-        <w:t xml:space="preserve"> </w:t>
-      </w:r>
-      <w:r>
-        <w:t xml:space="preserve">(Preisser and Bolnick 2008)</w:t>
-      </w:r>
-      <w:r>
-        <w:t xml:space="preserve"> </w:t>
-      </w:r>
-      <w:r>
-        <w:t xml:space="preserve">Our study joins a number of recent studies (ie.,</w:t>
+        <w:t xml:space="preserve">. Our study adds to a growing body of literature (i.e.,</w:t>
       </w:r>
       <w:r>
         <w:t xml:space="preserve"> </w:t>
@@ -831,7 +1206,7 @@
         <w:t xml:space="preserve">(Sniegula et al. 2025)</w:t>
       </w:r>
       <w:r>
-        <w:t xml:space="preserve">) showing invasive predators can generate stronger NCEs on native prey than native predators, which consequently have more profound far- reaching impacts on invaded ecosystems. Our study suggests the introduction of a novel predator effectively changes the prey’s fear landscape in ways that a co-evolved predator does not. Kōura are a keystone species in Aotearoa and an ecosystem engineer and so when a predator alters kōura behaviour, this in turn could affect resources or other species through non-consumptive pathways</w:t>
+        <w:t xml:space="preserve">) showing invasive predators can generate stronger NCEs on native prey than native predators, with potentially far-reaching consequences on invaded ecosystems. The results in our experiments suggest the introduction of a novel predator may change the prey’s fear landscape in ways that a native predator does not. Kōura are a keystone species that act as ecosystem engineers in Aotearoa freshwaters, meaning that predator-induced changed in kōura behaviour may indirectly affect ecosystem-level properties (e.g., resources or other species) through non-consumptive pathways</w:t>
       </w:r>
       <w:r>
         <w:t xml:space="preserve"> </w:t>
@@ -840,7 +1215,7 @@
         <w:t xml:space="preserve">(Peacor and Werner 2001)</w:t>
       </w:r>
       <w:r>
-        <w:t xml:space="preserve">. Such trait-mediated indirect effects represent a form of behavioural trophic cascade</w:t>
+        <w:t xml:space="preserve">. Such indirect effects represent a form of behavioural trophic cascade</w:t>
       </w:r>
       <w:r>
         <w:t xml:space="preserve"> </w:t>
@@ -849,7 +1224,7 @@
         <w:t xml:space="preserve">(Schmitz et al. 1997)</w:t>
       </w:r>
       <w:r>
-        <w:t xml:space="preserve">, whereby predator presence alone drives ecosystem-level change. Our results also highlight that prey naivety does not always show a failure to respond but can instead produce a generalised over-response consistent with the generalisation theory</w:t>
+        <w:t xml:space="preserve">, whereby predator presence alone drives ecosystem-level change. Our results also highlight that prey naivety does not necessarily manifest as a failure to respond to novel predators. Instead, naïve prey may exhibit an over-avoiding response consistent with generalisation theory</w:t>
       </w:r>
       <w:r>
         <w:t xml:space="preserve"> </w:t>
@@ -858,10 +1233,10 @@
         <w:t xml:space="preserve">(Sih et al. 2010; Ehlman et al. 2019)</w:t>
       </w:r>
       <w:r>
-        <w:t xml:space="preserve">, which is important for predicting the ecological impacts of invasive species.</w:t>
-      </w:r>
-    </w:p>
-    <w:bookmarkStart w:id="24" w:name="refuge-use"/>
+        <w:t xml:space="preserve">, which potentially has important implications for predicting the ecological impacts of invasive species.</w:t>
+      </w:r>
+    </w:p>
+    <w:bookmarkStart w:id="25" w:name="refuge-use"/>
     <w:p>
       <w:pPr>
         <w:pStyle w:val="Heading2"/>
@@ -875,7 +1250,7 @@
         <w:pStyle w:val="FirstParagraph"/>
       </w:pPr>
       <w:r>
-        <w:t xml:space="preserve">Kōura demonstrated greater refuge-seeking behaviour when exposed to the novel catfish than to native eel. This result is notable because it contradicts the classic prey naivety hypothesis, which predicts that prey fail to respond to novel predators</w:t>
+        <w:t xml:space="preserve">Under dark conditions, kōura demonstrated greater refuge-seeking behaviour when exposed to the novel catfish than to native eel. This result is notable because it contradicts the classic prey naivety hypothesis, which predicts that prey underestimate or fail to appropriately respond to novel predators due to a lack of shared evolutionary history</w:t>
       </w:r>
       <w:r>
         <w:t xml:space="preserve"> </w:t>
@@ -884,7 +1259,7 @@
         <w:t xml:space="preserve">(Carthey and Banks 2014)</w:t>
       </w:r>
       <w:r>
-        <w:t xml:space="preserve">. Over-responses to novel predators are less commonly reported but are consistent with fear generalisation theory, whereby prior experience with native predators primes a generalised heightened vigilance response to any unfamiliar threat</w:t>
+        <w:t xml:space="preserve">. Instead, kōura seemingly exhibited an enhanced defensive response to the novel predator. Such over-responses to unfamiliar predators are less commonly reported but are consistent with fear generalisation theory, whereby experience with native predators primes a generalised heightened vigilance response to any unfamiliar threat</w:t>
       </w:r>
       <w:r>
         <w:t xml:space="preserve"> </w:t>
@@ -902,7 +1277,7 @@
         <w:t xml:space="preserve">(Dawkins and Krebs 1979; Lima and Dill 1990)</w:t>
       </w:r>
       <w:r>
-        <w:t xml:space="preserve">. Such generalised responses to novel stimuli tend to be overcautious and energetically costly and are characteristic of prey with no evolutionary history with the encountered predator</w:t>
+        <w:t xml:space="preserve">. Such generalised responses are often overcautious and energetically costly because prey may initially treat uncertain threats as highly dangerous until further experience is acquired</w:t>
       </w:r>
       <w:r>
         <w:t xml:space="preserve"> </w:t>
@@ -911,7 +1286,7 @@
         <w:t xml:space="preserve">(Sih et al. 2010)</w:t>
       </w:r>
       <w:r>
-        <w:t xml:space="preserve">. Unlike classic prey naivety scenarios where the novel predator poses no actual threat, catfish genuinely predate kōura, meaning the heightened refuge response carries a real energetic cost but is not disproportionate to actual risk. Elevated refuge use is itself a meaningful NCE, reducing foraging time with potential consequences for growth, reproduction, and population persistence</w:t>
+        <w:t xml:space="preserve">. Unlike classic prey naivety scenarios where the novel predator poses no actual threat, catfish genuinely predate kōura, meaning the heightened refuge response carries a real energetic cost but is not disproportionate to the actual risk of predation. Elevated refuge use is itself a meaningful NCE, reducing foraging time with potential consequences for growth, reproduction, and population persistence</w:t>
       </w:r>
       <w:r>
         <w:t xml:space="preserve"> </w:t>
@@ -920,7 +1295,7 @@
         <w:t xml:space="preserve">(Preisser et al. 2005; Sheriff et al. 2020)</w:t>
       </w:r>
       <w:r>
-        <w:t xml:space="preserve">. However, this behaviour may simultaneously confer protection against direct predation; experimental evidence shows that shelter significantly reduces catfish predation on crayfish</w:t>
+        <w:t xml:space="preserve">. However, this behaviour may simultaneously confer protection against direct predation as experimental evidence shows that shelter significantly reduces catfish predation on crayfish</w:t>
       </w:r>
       <w:r>
         <w:t xml:space="preserve"> </w:t>
@@ -929,7 +1304,7 @@
         <w:t xml:space="preserve">(Adams 2007; Zhao et al. 2024)</w:t>
       </w:r>
       <w:r>
-        <w:t xml:space="preserve">, suggesting that enhancing or restoring habitat complexity in catfish-invaded lakes could mitigate both direct predation and fear-driven reductions in foraging, though direct field testing is needed.</w:t>
+        <w:t xml:space="preserve">. This result suggests that enhancing or restoring habitat complexity in catfish-invaded lakes could mitigate both direct predation and fear-driven reductions in foraging, though direct field testing is needed.</w:t>
       </w:r>
     </w:p>
     <w:p>
@@ -937,7 +1312,7 @@
         <w:pStyle w:val="BodyText"/>
       </w:pPr>
       <w:r>
-        <w:t xml:space="preserve">Before treatments were added, refuge use was similar across treatments but highly variable, reflecting substantial individual behavioural variation. The control treatment showed increasing refuge use over time, particularly under light conditions, which is unsurprising given that kōura are nocturnally adapted and need to remain hidden during daylight to avoid visual predators such as birds</w:t>
+        <w:t xml:space="preserve">Before fish were added to the tanks, refuge use by koūra was similar across treatments but highly variable at the individual level, reflecting substantial behavioural variation. The control treatment showed increasing refuge use over time, particularly under light conditions, which is unsurprising given that kōura are nocturnally adapted and need to remain hidden during daylight to avoid visual predators such as cormorants</w:t>
       </w:r>
       <w:r>
         <w:t xml:space="preserve"> </w:t>
@@ -946,7 +1321,7 @@
         <w:t xml:space="preserve">(Devcich 1979)</w:t>
       </w:r>
       <w:r>
-        <w:t xml:space="preserve">. While neither predator treatment differed significantly from the control, this likely reflects the influence of light regime on baseline refuge use rather than a true absence of NCEs; under light conditions control refuge use approached that of the catfish treatment, while under dark conditions it more closely resembled the eel treatment, effectively inflating variance around the control mean. Despite this, the consistent pattern of catfish provoking greater refuge use than eels under both light and dark conditions supports a genuine difference in NCEs between novel and native predator exposure.</w:t>
+        <w:t xml:space="preserve">. Importantly, treatment effects on refuge use depended on light condition. Under dark conditions, when kōura are naturally more active, catfish exposure resulted in significantly greater refuge use than eel exposure. Control refuge use was intermediate between the two predator treatments, though the reasons for this pattern are unclear from the current data. The contrasting responses of kōura to catfish and eels indicates biologically meaningful differences in NCE between exposure to a novel and native predator.</w:t>
       </w:r>
     </w:p>
     <w:p>
@@ -954,7 +1329,16 @@
         <w:pStyle w:val="BodyText"/>
       </w:pPr>
       <w:r>
-        <w:t xml:space="preserve">In contrast to catfish exposure, kōura reduced their refuge use when exposed to eels. This likely reflects the co-evolutionary history the two species share, as kōura are able to recognise eel chemical and visual cues and respond in an appropriate rather than precautionary way</w:t>
+        <w:t xml:space="preserve">Unlike the response when exposed to catfish, kōura reduced their refuge use in the presence of eels. This contrasting response likely reflects the long evolutionary relationship between kōura and eels, though the strength of coevolutionary adaptation in these specific lakes remains uncertain. The lakes naturally have restricted access to the coast limiting the number of eels present and historical vulcanism has affected these dynamics with a potential historical separation approximately 700 years ago following the Kaharoa eruption (~AD 1314;</w:t>
+      </w:r>
+      <w:r>
+        <w:t xml:space="preserve"> </w:t>
+      </w:r>
+      <w:r>
+        <w:t xml:space="preserve">(Hogg et al. 2003)</w:t>
+      </w:r>
+      <w:r>
+        <w:t xml:space="preserve">). Nevertheless, kōura probably were able to recognise chemical and visual cues from the eels and respond in a proportionate rather than precautionary way</w:t>
       </w:r>
       <w:r>
         <w:t xml:space="preserve"> </w:t>
@@ -972,7 +1356,7 @@
         <w:t xml:space="preserve">(Wood and Moore 2020b)</w:t>
       </w:r>
       <w:r>
-        <w:t xml:space="preserve">. This calibrated response makes ecological sense as longfin eels are the most widely distributed fish in Aotearoa’s freshwaters</w:t>
+        <w:t xml:space="preserve">. This calibrated response makes ecological sense as longfin eels are the most widely distributed fish in the freshwaters of Aotearoa</w:t>
       </w:r>
       <w:r>
         <w:t xml:space="preserve"> </w:t>
@@ -981,7 +1365,7 @@
         <w:t xml:space="preserve">(McDowall 1990)</w:t>
       </w:r>
       <w:r>
-        <w:t xml:space="preserve">, and a kōura living in constant fear of eels would have severely limited opportunity to forage. Co-evolutionary pressure may therefore have favoured a nuanced, context-dependent response to eels rather than a blanket avoidance strategy. This pattern was most pronounced in the dark conditions, where all three treatments began similarly but changed progressively over the course of the experiment. The catfish treatment steadily increased in refuge use, while eel treatment stayed alongside the control, declining to baseline levels by the end of the during period. This suggests that under conditions most relevant to kōura natural activity, chemical recognition of the familiar eel predator is sufficient to enable a calibrated, low-cost response, while the unfamiliar catfish continues to elicit sustained precautionary refuge use</w:t>
+        <w:t xml:space="preserve">, and a persistent high-intensity refuge response to eels would likely impose substantial foraging costs. Whether shaped by deep coevolutionary history or by recognition of eels as an established native predator, kōura show a nuanced, context-dependent response to eels rather than an over-generalised avoidance strategy. This pattern was most pronounced in the dark conditions, where kōura refuge use in all three treatments began similarly but changed progressively over the course of the experiment. Kōura in the catfish treatment steadily increased their refuge use, while kōura in the eel treatment showed similar behaviour to those in the control treatment, with decreases to baseline levels by the end of the observation period. This result suggests that under conditions most relevant to natural activity by kōura, chemical recognition of the familiar eel predator is sufficient to enable a calibrated, low-cost response, while the unfamiliar catfish continues to elicit sustained precautionary refuge use</w:t>
       </w:r>
       <w:r>
         <w:t xml:space="preserve"> </w:t>
@@ -990,17 +1374,29 @@
         <w:t xml:space="preserve">(Shave et al. 1994; Wood and Moore 2020a)</w:t>
       </w:r>
       <w:r>
-        <w:t xml:space="preserve">. Beyond predator recognition, the reduced refuge use observed in eel-exposed kōura may not simply reflect a lack of response, but could instead represent active escape-searching behaviour, kōura moving away from an area where they perceived themselves as vulnerable in the confined tank space, rather than retreating to a refuge that may offer limited protection against a predator capable of pursuing prey into confined spaces.</w:t>
-      </w:r>
-    </w:p>
-    <w:bookmarkEnd w:id="24"/>
-    <w:bookmarkStart w:id="25" w:name="feeding"/>
+        <w:t xml:space="preserve">. Beyond predator recognition, the reduced refuge use observed in eel-exposed kōura may not reflect a lack of response but could instead represent active escape-searching behaviour (i.e. a</w:t>
+      </w:r>
+      <w:r>
+        <w:t xml:space="preserve"> </w:t>
+      </w:r>
+      <w:r>
+        <w:t xml:space="preserve">“flight”</w:t>
+      </w:r>
+      <w:r>
+        <w:t xml:space="preserve"> </w:t>
+      </w:r>
+      <w:r>
+        <w:t xml:space="preserve">response). If this was the behavioural motivation, kōura would be attempting to move away from an area where they perceived themselves as vulnerable in the confined tank space, rather than retreating to a refuge where they might be prone to a known predator.</w:t>
+      </w:r>
+    </w:p>
+    <w:bookmarkEnd w:id="25"/>
+    <w:bookmarkStart w:id="26" w:name="feeding-behaviour"/>
     <w:p>
       <w:pPr>
         <w:pStyle w:val="Heading2"/>
       </w:pPr>
       <w:r>
-        <w:t xml:space="preserve">Feeding</w:t>
+        <w:t xml:space="preserve">Feeding behaviour</w:t>
       </w:r>
     </w:p>
     <w:p>
@@ -1008,7 +1404,7 @@
         <w:pStyle w:val="FirstParagraph"/>
       </w:pPr>
       <w:r>
-        <w:t xml:space="preserve">NCEs are not a single process but emerge from the interaction between sensory ecology and environmental context, and the absence of a kairomone effect on feeding in this study likely reflects a combination of methodological constraints rather than an absence of NCEs on foraging behaviour. The feeding experiment which unlike the refuge-use experiment, relied purely on non-visual cues, did not demonstrate a clear fish predator NCE on kōura. This may have been due to the concentration of predator kairomones not being high enough to exceed detection thresholds</w:t>
+        <w:t xml:space="preserve">NCEs are not a single process but emerge from the interaction between sensory ecology and environmental context. The absence of a kairomone effect on feeding in this study likely reflects a combination of methodological constraints rather than an absence of NCEs on foraging behaviour. The feeding experiment, in which predators were presented solely through chemical cues without visual information, did not demonstrate a clear fish predator NCE on kōura. This may have been due to the concentration of predator kairomones not being high enough to exceed detection thresholds</w:t>
       </w:r>
       <w:r>
         <w:t xml:space="preserve"> </w:t>
@@ -1017,7 +1413,7 @@
         <w:t xml:space="preserve">(Brown et al. 2004)</w:t>
       </w:r>
       <w:r>
-        <w:t xml:space="preserve">, the relatively short pre-experiment starvation period for kōura and the restricted time frame of the experiment or a combination of all three factors. Kōura can readily detect necrotic fish tissue and readily leave refuges to scavenge on catfish, eel, and marine fish carcasses with little discrimination between fish species, indicating that chemosensory responses in kōura may depend on cue type, context, and concentration rather than predator identity alone</w:t>
+        <w:t xml:space="preserve">, the starvation conditions during the experiment, the restricted time frame of the experiment, or a combination of these factors. Kōura can readily detect necrotic fish tissue and readily leave refuges to scavenge on catfish, eel, and marine fish carcasses with little discrimination between fish species, indicating that chemosensory responses in kōura may depend on cue type, context, and concentration rather than predator identity alone</w:t>
       </w:r>
       <w:r>
         <w:t xml:space="preserve"> </w:t>
@@ -1026,7 +1422,7 @@
         <w:t xml:space="preserve">(MacNeil et al. 2025)</w:t>
       </w:r>
       <w:r>
-        <w:t xml:space="preserve">. The concentration of live fish exudates in our experiment relative to natural conditions is difficult to determine, while kairomones were concentrated by confining fish in a bucket, in our experimental tanks they were subsequently diluted in 5 L of water and not replenished over 24 hours. Whether the resulting concentration reflects, exceeds or falls below ecologically relevant levels in lakes where kōura and predators coexist remains unclear, and future studies should attempt to quantify natural kairomone concentrations to better calibrate experimental designs</w:t>
+        <w:t xml:space="preserve">. The concentration of live fish exudates in our experiment relative to natural conditions is difficult to determine, while kairomones were concentrated by confining fish in a bucket, in our experimental tanks they were subsequently diluted in 5 L of water, not replenished, and potentially degraded over the 24-hour period. Whether the resulting concentration reflects, exceeds or falls below ecologically relevant levels in lakes where kōura and predators coexist remains unclear, and future studies should attempt to quantify natural kairomone concentrations to better calibrate experimental designs</w:t>
       </w:r>
       <w:r>
         <w:t xml:space="preserve"> </w:t>
@@ -1053,7 +1449,7 @@
         <w:t xml:space="preserve">(Beattie and Moore 2018)</w:t>
       </w:r>
       <w:r>
-        <w:t xml:space="preserve">. Fish predators in our experiments were kept for a prolonged period on the same diet as kōura, which may have further diminished or blunted the threatening nature of signals received from kairomones</w:t>
+        <w:t xml:space="preserve">. Fish predators in our experiments were maintained on the same diet as kōura for an extended acclimation period prior to exposure (see Methods), which may have further dampened or negated the threat signals received from kairomones</w:t>
       </w:r>
       <w:r>
         <w:t xml:space="preserve"> </w:t>
@@ -1089,17 +1485,20 @@
         <w:t xml:space="preserve">(Clinchy et al. 2012)</w:t>
       </w:r>
       <w:r>
-        <w:t xml:space="preserve">. Finally, feeding was measured as a single endpoint after 24 hours, providing no information on whether kōura initially suppressed feeding after kairomone exposure before eventually resuming normal feeding activity (</w:t>
-      </w:r>
-      <w:r>
-        <w:t xml:space="preserve">Wright et al. (2010)</w:t>
-      </w:r>
-      <w:r>
-        <w:t xml:space="preserve">). Further experiments using higher kairomone concentrations, longer starvation periods, and continuous feeding monitoring would help clarify whether non-visual predator cues generate NCEs on kōura foraging behaviour.</w:t>
-      </w:r>
-    </w:p>
-    <w:bookmarkEnd w:id="25"/>
-    <w:bookmarkStart w:id="26" w:name="conclusions"/>
+        <w:t xml:space="preserve">. Finally, feeding was measured as a single endpoint after 24 hours, providing no information on whether kōura initially suppressed feeding after kairomone exposure before eventually resuming normal feeding activity</w:t>
+      </w:r>
+      <w:r>
+        <w:t xml:space="preserve"> </w:t>
+      </w:r>
+      <w:r>
+        <w:t xml:space="preserve">(Wright et al. 2010)</w:t>
+      </w:r>
+      <w:r>
+        <w:t xml:space="preserve">. Further experiments using higher kairomone concentrations, longer starvation periods, and continuous feeding monitoring would help clarify whether non-visual predator cues generate NCEs on kōura foraging behaviour.</w:t>
+      </w:r>
+    </w:p>
+    <w:bookmarkEnd w:id="26"/>
+    <w:bookmarkStart w:id="27" w:name="conclusions"/>
     <w:p>
       <w:pPr>
         <w:pStyle w:val="Heading2"/>
@@ -1122,7 +1521,7 @@
         <w:t xml:space="preserve">(Sih et al. 2011)</w:t>
       </w:r>
       <w:r>
-        <w:t xml:space="preserve">. This study provides experimental evidence that the invasive brown bullhead catfish exerts stronger NCEs on the native freshwater crayfish kōura than the co-evolved native longfin eel. The heightened refuge-seeking response to catfish likely reflects a generalised antipredator response triggered by unfamiliar chemical and visual cues, consistent with a fear generalisation framework. In contrast, the reduced response to eels suggests that co-evolutionary experience enables kōura to make more calibrated risk assessments. Comparative studies of kōura sourced from catfish-invaded versus catfish-free catchments would be worthwhile to assess whether repeated exposure over multiple generations has resulted in rapid evolution or behavioural plasticity in antipredator responses, and whether catfish-experienced kōura show more calibrated responses to catfish presence than naïve kōura. Such evolutionary dynamics could have important implications for predicting kōura persistence in catfish-invaded systems</w:t>
+        <w:t xml:space="preserve">. The present study provides experimental evidence that invasive brown bullhead catfish have the potential to exert stronger NCEs on kōura, an endemic freshwater crayfish when compared to their native predator, the longfin eel. The heightened refuge-seeking response to catfish likely reflects a generalised antipredator response triggered by unfamiliar chemical and visual cues, consistent with a fear generalisation framework. In contrast, the reduced response to eels suggests that familiarity with native predators enables kōura to make more proportionate risk assessments, although their behaviour may have also been an antipredator strategy. Future studies should particularly include kōura from eel-inhabited waterways, which would determine whether populations with a recent coevolutionary history with native eels display similar proportionate responses, thereby confirming whether the patterns observed here reflect broader adaptive differences across kōura populations with distinct predatory histories. Additionally, comparative studies of kōura sourced from catfish-invaded versus catfish-free catchments would be worthwhile to assess whether repeated exposure over multiple generations has resulted in rapid evolution or behavioural plasticity in antipredator responses, and whether catfish-experienced kōura show more calibrated responses to catfish presence than naïve kōura. Such evolutionary dynamics could have important implications for predicting kōura persistence in catfish-invaded systems</w:t>
       </w:r>
       <w:r>
         <w:t xml:space="preserve"> </w:t>
@@ -1131,12 +1530,12 @@
         <w:t xml:space="preserve">(Sih et al. 2010)</w:t>
       </w:r>
       <w:r>
-        <w:t xml:space="preserve">. From a management perspective, translocation of kōura from catfish-experienced source populations into catchments facing imminent catfish invasion may represent a more feasible strategy for seeding populations with individuals capable of more calibrated responses. Although we found no significant NCE of fish exudates on feeding behaviour, our study suggests further investigations of non-visual predator cues on kōura foraging behaviour is warranted. Because kōura are keystone species and ecosystem engineers, even a small increase in refuge use driven by catfish presence could have cascading effects on sediment dynamics, decomposition, and nutrient cycling in invaded lakes. As brown bullhead catfish continue to spread across Aotearoa’s rivers and lakes, management strategies aimed at protecting kōura should account for the behavioural cost of catfish NCEs alongside direct predation pressure as an underappreciated and ecologically significant dimension to this invasion.</w:t>
-      </w:r>
-    </w:p>
-    <w:bookmarkEnd w:id="26"/>
+        <w:t xml:space="preserve">. From a management perspective, translocation of kōura from catfish-experienced source populations into catchments facing imminent catfish invasion may represent a more feasible strategy for seeding populations with individuals capable of more adaptive responses. Although we found no significant NCE of fish exudates on feeding behaviour, our study suggests further investigations of non-visual predator cues on kōura foraging behaviour is warranted. Because kōura are a keystone species that ecosystem engineer, even a small increase in refuge use driven by catfish presence could have cascading effects on sediment dynamics, decomposition, and nutrient cycling in invaded lakes. As brown bullhead catfish continue to spread across Aotearoa’s rivers and lakes, management strategies aimed at protecting kōura should account for the behavioural cost of catfish NCEs alongside direct predation pressure as an underappreciated and ecologically significant dimension to this invasion.</w:t>
+      </w:r>
+    </w:p>
     <w:bookmarkEnd w:id="27"/>
-    <w:bookmarkStart w:id="33" w:name="acknowledgements"/>
+    <w:bookmarkEnd w:id="28"/>
+    <w:bookmarkStart w:id="34" w:name="acknowledgements"/>
     <w:p>
       <w:pPr>
         <w:pStyle w:val="Heading1"/>
@@ -1153,7 +1552,7 @@
         <w:t xml:space="preserve">We thank Te Arawa Lakes Trust and Te Komiti Whakahaere for the opportunity to collect and study the treasured kōura. We are grateful to Soweeta Fort-D’ath and William Anaru (Te Arawa Lakes Trust), and Tihini Grant (Ngāti Pikiao). We also thank Nick Ling and Ben Roche (University of Waikato) for assisting with catfish and eel collection.</w:t>
       </w:r>
     </w:p>
-    <w:bookmarkStart w:id="28" w:name="funding-statement"/>
+    <w:bookmarkStart w:id="29" w:name="funding-statement"/>
     <w:p>
       <w:pPr>
         <w:pStyle w:val="Heading2"/>
@@ -1167,11 +1566,11 @@
         <w:pStyle w:val="FirstParagraph"/>
       </w:pPr>
       <w:r>
-        <w:t xml:space="preserve">This research was supported by the Fish Futures programme funded through a Ministry of Business, Innovation and Employment grant (CAWX2101).</w:t>
-      </w:r>
-    </w:p>
-    <w:bookmarkEnd w:id="28"/>
-    <w:bookmarkStart w:id="29" w:name="authors-contributions"/>
+        <w:t xml:space="preserve">This research was supported by the Fish Futures programme funded through a Ministry of Business, Innovation and Employment grant (CAWX2101) with additional funding provided by the Bay of Plenty Regional Council under the Toihuarewa Waimāori - Bay of Plenty Regional Council Chair in Lake and Freshwater Science programme.</w:t>
+      </w:r>
+    </w:p>
+    <w:bookmarkEnd w:id="29"/>
+    <w:bookmarkStart w:id="30" w:name="authors-contributions"/>
     <w:p>
       <w:pPr>
         <w:pStyle w:val="Heading2"/>
@@ -1185,11 +1584,11 @@
         <w:pStyle w:val="FirstParagraph"/>
       </w:pPr>
       <w:r>
-        <w:t xml:space="preserve">Study conception and design were undertaken by O.V.R, C.M. and R.H. Experiments were executed by O.V.R. and C.M. Data analysis was performed by O.V.R. and F.L. Local ecological knowledge kōura were supplied by I.A.K.K. Manuscript drafting was led by O.V.R. and C.M. All authors contributed to manuscript revision, approved the results, and the final manuscript.</w:t>
-      </w:r>
-    </w:p>
-    <w:bookmarkEnd w:id="29"/>
-    <w:bookmarkStart w:id="30" w:name="ethical-approval"/>
+        <w:t xml:space="preserve">Study conception and design were undertaken by O.V.R., C.M., and R.H. Experiments were executed by O.V.R. and C.M. Data analysis was performed by O.V.R. and F.L. I.A.K.K. initiated the concept of this study for inclusion in the FishFutures programme, obtained iwi consent, and provided local ecological knowledge and kōura specimens. Manuscript drafting was led by O.V.R. All authors contributed to manuscript revision, approved the results, and agreed on the final manuscript.</w:t>
+      </w:r>
+    </w:p>
+    <w:bookmarkEnd w:id="30"/>
+    <w:bookmarkStart w:id="31" w:name="ethical-approval"/>
     <w:p>
       <w:pPr>
         <w:pStyle w:val="Heading2"/>
@@ -1206,8 +1605,8 @@
         <w:t xml:space="preserve">This study received ethical approval by University of Waikato animal ethics committee, protocol number: 1232. Additional permission to conduct experiments with kōura was granted by Te Arawa Lakes Trust and Te Komiti Whakahaere.</w:t>
       </w:r>
     </w:p>
-    <w:bookmarkEnd w:id="30"/>
-    <w:bookmarkStart w:id="31" w:name="declarations"/>
+    <w:bookmarkEnd w:id="31"/>
+    <w:bookmarkStart w:id="32" w:name="declarations"/>
     <w:p>
       <w:pPr>
         <w:pStyle w:val="Heading2"/>
@@ -1224,8 +1623,8 @@
         <w:t xml:space="preserve">The corresponding author has declared that none of the authors has any competing interests.</w:t>
       </w:r>
     </w:p>
-    <w:bookmarkEnd w:id="31"/>
-    <w:bookmarkStart w:id="32" w:name="data-availability-statement"/>
+    <w:bookmarkEnd w:id="32"/>
+    <w:bookmarkStart w:id="33" w:name="data-availability-statement"/>
     <w:p>
       <w:pPr>
         <w:pStyle w:val="Heading2"/>
@@ -1242,9 +1641,9 @@
         <w:t xml:space="preserve">The code and derived data supporting the findings of this study are openly available on GitHub (https://github.com/OlivierRaven/Koura_Fear)and a rendered version of the analysis is hosted at https://olivierraven.github.io/Koura_Fear/. The primary raw dataset is archived on Zenodo (https://doi.org/10.5281/zenodo.19716761). Peer review documents, including the cover letter and reviewer responses, are available in the manuscript repository in the interest of open and transparent science.</w:t>
       </w:r>
     </w:p>
-    <w:bookmarkEnd w:id="32"/>
     <w:bookmarkEnd w:id="33"/>
-    <w:bookmarkStart w:id="36" w:name="tables"/>
+    <w:bookmarkEnd w:id="34"/>
+    <w:bookmarkStart w:id="37" w:name="tables"/>
     <w:p>
       <w:pPr>
         <w:pStyle w:val="Heading1"/>
@@ -1266,7 +1665,7 @@
       <w:tr>
         <w:tc>
           <w:tcPr/>
-          <w:bookmarkStart w:id="34" w:name="tbl-emmeans-stratified"/>
+          <w:bookmarkStart w:id="35" w:name="tbl-emmeans-stratified"/>
           <w:p>
             <w:pPr>
               <w:jc w:val="center"/>
@@ -2679,7 +3078,7 @@
               </w:tc>
             </w:tr>
           </w:tbl>
-          <w:bookmarkEnd w:id="34"/>
+          <w:bookmarkEnd w:id="35"/>
           <w:p/>
         </w:tc>
       </w:tr>
@@ -2700,7 +3099,7 @@
         </w:rPr>
         <w:t xml:space="preserve"> </w:t>
       </w:r>
-      <w:hyperlink r:id="rId35">
+      <w:hyperlink r:id="rId36">
         <w:r>
           <w:rPr>
             <w:rStyle w:val="Hyperlink"/>
@@ -2710,7 +3109,7 @@
         </w:r>
       </w:hyperlink>
     </w:p>
-    <w:bookmarkEnd w:id="36"/>
+    <w:bookmarkEnd w:id="37"/>
     <w:bookmarkStart w:id="57" w:name="figures"/>
     <w:p>
       <w:pPr>
@@ -2733,7 +3132,7 @@
       <w:tr>
         <w:tc>
           <w:tcPr/>
-          <w:bookmarkStart w:id="40" w:name="fig-aquarium-setup"/>
+          <w:bookmarkStart w:id="41" w:name="fig-aquarium-setup"/>
           <w:p>
             <w:pPr>
               <w:pStyle w:val="Compact"/>
@@ -2744,18 +3143,18 @@
                 <wp:inline>
                   <wp:extent cx="5727700" cy="4480989"/>
                   <wp:effectExtent b="0" l="0" r="0" t="0"/>
-                  <wp:docPr descr="" title="" id="38" name="Picture"/>
+                  <wp:docPr descr="" title="" id="39" name="Picture"/>
                   <a:graphic>
                     <a:graphicData uri="http://schemas.openxmlformats.org/drawingml/2006/picture">
                       <pic:pic>
                         <pic:nvPicPr>
-                          <pic:cNvPr descr="images/setup_combined.png" id="39" name="Picture"/>
+                          <pic:cNvPr descr="images/setup_combined.png" id="40" name="Picture"/>
                           <pic:cNvPicPr>
                             <a:picLocks noChangeArrowheads="1" noChangeAspect="1"/>
                           </pic:cNvPicPr>
                         </pic:nvPicPr>
                         <pic:blipFill>
-                          <a:blip r:embed="rId37"/>
+                          <a:blip r:embed="rId38"/>
                           <a:stretch>
                             <a:fillRect/>
                           </a:stretch>
@@ -2795,11 +3194,10 @@
               <w:t xml:space="preserve">Figure 1: (a) Aquarium layout for kōura refuge seeking behaviour experiment. Each experimental round consisted of eight aquaria run simultaneously. Each tank contained a single kōura (K) and refuge (half terracotta plant pot) on one side of a mesh divider. On the other side was either a single catfish (C), eel (E) or a control with no fish. The mesh divider allowed visual and chemical cues while preventing direct physical contact between tank occupants. (b) Experiments were repeated in light and dark (red light), with photographs showing a catfish in the light regime (left) and and an eel in the dark regime (red light) (right) separated from kōura by mesh dividers.</w:t>
             </w:r>
           </w:p>
-          <w:bookmarkEnd w:id="40"/>
+          <w:bookmarkEnd w:id="41"/>
         </w:tc>
       </w:tr>
     </w:tbl>
-    <w:bookmarkStart w:id="46" w:name="cell-fig-emmeans-stratified-ms"/>
     <w:tbl>
       <w:tblPr>
         <w:tblStyle w:val="Table"/>
@@ -2813,7 +3211,7 @@
       <w:tr>
         <w:tc>
           <w:tcPr/>
-          <w:bookmarkStart w:id="44" w:name="fig-emmeans-stratified-ms"/>
+          <w:bookmarkStart w:id="45" w:name="fig-emmeans-stratified"/>
           <w:p>
             <w:pPr>
               <w:pStyle w:val="Compact"/>
@@ -2822,20 +3220,20 @@
             <w:r>
               <w:drawing>
                 <wp:inline>
-                  <wp:extent cx="4587290" cy="3669832"/>
+                  <wp:extent cx="5727700" cy="2863850"/>
                   <wp:effectExtent b="0" l="0" r="0" t="0"/>
-                  <wp:docPr descr="" title="" id="42" name="Picture"/>
+                  <wp:docPr descr="" title="" id="43" name="Picture"/>
                   <a:graphic>
                     <a:graphicData uri="http://schemas.openxmlformats.org/drawingml/2006/picture">
                       <pic:pic>
                         <pic:nvPicPr>
-                          <pic:cNvPr descr="outputs/fig-emmeans-stratified.png" id="43" name="Picture"/>
+                          <pic:cNvPr descr="index_files/figure-docx/analysis-fig-emmeans-stratified-output-1.png" id="44" name="Picture"/>
                           <pic:cNvPicPr>
                             <a:picLocks noChangeArrowheads="1" noChangeAspect="1"/>
                           </pic:cNvPicPr>
                         </pic:nvPicPr>
                         <pic:blipFill>
-                          <a:blip r:embed="rId41"/>
+                          <a:blip r:embed="rId42"/>
                           <a:stretch>
                             <a:fillRect/>
                           </a:stretch>
@@ -2843,7 +3241,7 @@
                         <pic:spPr bwMode="auto">
                           <a:xfrm>
                             <a:off x="0" y="0"/>
-                            <a:ext cx="4587290" cy="3669832"/>
+                            <a:ext cx="5727700" cy="2863850"/>
                           </a:xfrm>
                           <a:prstGeom prst="rect">
                             <a:avLst/>
@@ -2875,7 +3273,7 @@
               <w:t xml:space="preserve">Figure 2: Predicted marginal probabilities of refuge use by treatment and experimental period in light and dark conditions. Results are shown separately for light (top) and dark (bottom) conditions, each fitted with a beta-binomial GLMM. Points represent model-estimated marginal means with 95% confidence intervals shown as error bars. Different letters (a, b) indicate statistically significant differences based on Tukey-adjusted pairwise comparisons within each factor. The dashed line at 0.5 marks the threshold where kōura spend half their time in refuge.</w:t>
             </w:r>
           </w:p>
-          <w:bookmarkEnd w:id="44"/>
+          <w:bookmarkEnd w:id="45"/>
         </w:tc>
       </w:tr>
     </w:tbl>
@@ -2895,18 +3293,27 @@
         </w:rPr>
         <w:t xml:space="preserve"> </w:t>
       </w:r>
-      <w:hyperlink r:id="rId45">
+      <w:hyperlink r:id="rId46">
         <w:r>
           <w:rPr>
             <w:rStyle w:val="Hyperlink"/>
             <w:vertAlign w:val="subscript"/>
           </w:rPr>
-          <w:t xml:space="preserve">Article Notebook</w:t>
+          <w:t xml:space="preserve">Analysis Notebook</w:t>
         </w:r>
       </w:hyperlink>
     </w:p>
-    <w:bookmarkEnd w:id="46"/>
-    <w:bookmarkStart w:id="51" w:name="cell-fig-refuge-plot-ms"/>
+    <w:p>
+      <w:pPr>
+        <w:pStyle w:val="SourceCode"/>
+      </w:pPr>
+      <w:r>
+        <w:rPr>
+          <w:rStyle w:val="VerbatimChar"/>
+        </w:rPr>
+        <w:t xml:space="preserve">systemfonts and textshaping have been compiled with different versions of Freetype. Because of this, textshaping will not use the font cache provided by systemfonts</w:t>
+      </w:r>
+    </w:p>
     <w:tbl>
       <w:tblPr>
         <w:tblStyle w:val="Table"/>
@@ -2920,7 +3327,7 @@
       <w:tr>
         <w:tc>
           <w:tcPr/>
-          <w:bookmarkStart w:id="50" w:name="fig-refuge-plot-ms"/>
+          <w:bookmarkStart w:id="50" w:name="fig-refuge-plot"/>
           <w:p>
             <w:pPr>
               <w:pStyle w:val="Compact"/>
@@ -2936,7 +3343,7 @@
                     <a:graphicData uri="http://schemas.openxmlformats.org/drawingml/2006/picture">
                       <pic:pic>
                         <pic:nvPicPr>
-                          <pic:cNvPr descr="outputs/fig-refuge-plot.png" id="49" name="Picture"/>
+                          <pic:cNvPr descr="index_files/figure-docx/analysis-fig-refuge-plot-output-2.png" id="49" name="Picture"/>
                           <pic:cNvPicPr>
                             <a:picLocks noChangeArrowheads="1" noChangeAspect="1"/>
                           </pic:cNvPicPr>
@@ -3002,18 +3409,16 @@
         </w:rPr>
         <w:t xml:space="preserve"> </w:t>
       </w:r>
-      <w:hyperlink r:id="rId45">
+      <w:hyperlink r:id="rId51">
         <w:r>
           <w:rPr>
             <w:rStyle w:val="Hyperlink"/>
             <w:vertAlign w:val="subscript"/>
           </w:rPr>
-          <w:t xml:space="preserve">Article Notebook</w:t>
+          <w:t xml:space="preserve">Analysis Notebook</w:t>
         </w:r>
       </w:hyperlink>
     </w:p>
-    <w:bookmarkEnd w:id="51"/>
-    <w:bookmarkStart w:id="56" w:name="cell-fig-feeding-plot-ms"/>
     <w:tbl>
       <w:tblPr>
         <w:tblStyle w:val="Table"/>
@@ -3027,7 +3432,7 @@
       <w:tr>
         <w:tc>
           <w:tcPr/>
-          <w:bookmarkStart w:id="55" w:name="fig-feeding-plot-ms"/>
+          <w:bookmarkStart w:id="55" w:name="fig-feeding-plot"/>
           <w:p>
             <w:pPr>
               <w:pStyle w:val="Compact"/>
@@ -3036,14 +3441,14 @@
             <w:r>
               <w:drawing>
                 <wp:inline>
-                  <wp:extent cx="4587290" cy="3669832"/>
+                  <wp:extent cx="4595937" cy="3676749"/>
                   <wp:effectExtent b="0" l="0" r="0" t="0"/>
                   <wp:docPr descr="" title="" id="53" name="Picture"/>
                   <a:graphic>
                     <a:graphicData uri="http://schemas.openxmlformats.org/drawingml/2006/picture">
                       <pic:pic>
                         <pic:nvPicPr>
-                          <pic:cNvPr descr="outputs/fig-feeding-plot.png" id="54" name="Picture"/>
+                          <pic:cNvPr descr="index_files/figure-docx/analysis-fig-feeding-plot-output-2.png" id="54" name="Picture"/>
                           <pic:cNvPicPr>
                             <a:picLocks noChangeArrowheads="1" noChangeAspect="1"/>
                           </pic:cNvPicPr>
@@ -3057,7 +3462,7 @@
                         <pic:spPr bwMode="auto">
                           <a:xfrm>
                             <a:off x="0" y="0"/>
-                            <a:ext cx="4587290" cy="3669832"/>
+                            <a:ext cx="4595937" cy="3676749"/>
                           </a:xfrm>
                           <a:prstGeom prst="rect">
                             <a:avLst/>
@@ -3109,19 +3514,18 @@
         </w:rPr>
         <w:t xml:space="preserve"> </w:t>
       </w:r>
-      <w:hyperlink r:id="rId45">
+      <w:hyperlink r:id="rId56">
         <w:r>
           <w:rPr>
             <w:rStyle w:val="Hyperlink"/>
             <w:vertAlign w:val="subscript"/>
           </w:rPr>
-          <w:t xml:space="preserve">Article Notebook</w:t>
+          <w:t xml:space="preserve">Analysis Notebook</w:t>
         </w:r>
       </w:hyperlink>
     </w:p>
-    <w:bookmarkEnd w:id="56"/>
     <w:bookmarkEnd w:id="57"/>
-    <w:bookmarkStart w:id="176" w:name="supplementary-information"/>
+    <w:bookmarkStart w:id="186" w:name="supplementary-information"/>
     <w:p>
       <w:pPr>
         <w:pStyle w:val="Heading1"/>
@@ -3595,7 +3999,7 @@
         </w:r>
       </w:hyperlink>
     </w:p>
-    <w:bookmarkStart w:id="175" w:name="refs"/>
+    <w:bookmarkStart w:id="185" w:name="refs"/>
     <w:bookmarkStart w:id="63" w:name="ref-Abrams2000"/>
     <w:p>
       <w:pPr>
@@ -3644,7 +4048,23 @@
         <w:pStyle w:val="Bibliography"/>
       </w:pPr>
       <w:r>
-        <w:t xml:space="preserve">Adams SB (2007) Direct and indirect effects of channel catfish (ictalurus punctatus) on native crayfishes (cambaridae) in experimental tanks. The American Midland Naturalist 158:85–96.</w:t>
+        <w:t xml:space="preserve">Adams SB (2007) Direct and indirect effects of channel catfish (</w:t>
+      </w:r>
+      <w:r>
+        <w:rPr>
+          <w:i/>
+          <w:iCs/>
+        </w:rPr>
+        <w:t xml:space="preserve">Ictalurus punctatus</w:t>
+      </w:r>
+      <w:r>
+        <w:t xml:space="preserve">) on native crayfishes (</w:t>
+      </w:r>
+      <w:r>
+        <w:t xml:space="preserve">Cambaridae</w:t>
+      </w:r>
+      <w:r>
+        <w:t xml:space="preserve">) in experimental tanks. The American Midland Naturalist 158:85–96.</w:t>
       </w:r>
       <w:r>
         <w:t xml:space="preserve"> </w:t>
@@ -3659,28 +4079,82 @@
       </w:hyperlink>
     </w:p>
     <w:bookmarkEnd w:id="67"/>
-    <w:bookmarkStart w:id="68" w:name="ref-Barnes2003"/>
+    <w:bookmarkStart w:id="68" w:name="ref-Appelberg1993"/>
     <w:p>
       <w:pPr>
         <w:pStyle w:val="Bibliography"/>
       </w:pPr>
       <w:r>
-        <w:t xml:space="preserve">Barnes GE, Hicks BJ (2003) Brown bullhead catfish (ameiurus nebulosus) in lake taupo (managing invasive freshwater fish in new zealand). Department of Conservation</w:t>
+        <w:t xml:space="preserve">Appelberg M, Soederbaeck B, Odelstroem T (1993) Predator detection and perception of predation risk in the crayfish</w:t>
+      </w:r>
+      <w:r>
+        <w:t xml:space="preserve"> </w:t>
+      </w:r>
+      <w:r>
+        <w:rPr>
+          <w:i/>
+          <w:iCs/>
+        </w:rPr>
+        <w:t xml:space="preserve">Astacus astacus</w:t>
+      </w:r>
+      <w:r>
+        <w:t xml:space="preserve"> </w:t>
+      </w:r>
+      <w:r>
+        <w:t xml:space="preserve">l. Nordic journal of freshwater research 68:55–62</w:t>
       </w:r>
     </w:p>
     <w:bookmarkEnd w:id="68"/>
-    <w:bookmarkStart w:id="70" w:name="ref-Beattie2018"/>
+    <w:bookmarkStart w:id="69" w:name="ref-Barnes2003"/>
     <w:p>
       <w:pPr>
         <w:pStyle w:val="Bibliography"/>
       </w:pPr>
       <w:r>
+        <w:t xml:space="preserve">Barnes GE, Hicks BJ (2003) Brown bullhead catfish (</w:t>
+      </w:r>
+      <w:r>
+        <w:rPr>
+          <w:i/>
+          <w:iCs/>
+        </w:rPr>
+        <w:t xml:space="preserve">Ameiurus nebulosus</w:t>
+      </w:r>
+      <w:r>
+        <w:t xml:space="preserve">) in</w:t>
+      </w:r>
+      <w:r>
+        <w:t xml:space="preserve"> </w:t>
+      </w:r>
+      <w:r>
+        <w:t xml:space="preserve">Lake Taupo</w:t>
+      </w:r>
+      <w:r>
+        <w:t xml:space="preserve"> </w:t>
+      </w:r>
+      <w:r>
+        <w:t xml:space="preserve">(</w:t>
+      </w:r>
+      <w:r>
+        <w:t xml:space="preserve">Managing Invasive Freshwater Fish in New Zealand</w:t>
+      </w:r>
+      <w:r>
+        <w:t xml:space="preserve">). Department of Conservation</w:t>
+      </w:r>
+    </w:p>
+    <w:bookmarkEnd w:id="69"/>
+    <w:bookmarkStart w:id="71" w:name="ref-Beattie2018"/>
+    <w:p>
+      <w:pPr>
+        <w:pStyle w:val="Bibliography"/>
+      </w:pPr>
+      <w:r>
         <w:t xml:space="preserve">Beattie MC, Moore PA (2018) Predator recognition of chemical cues in crayfish: Diet and experience influence the ability to detect predation threats. Behaviour 155:505–530.</w:t>
       </w:r>
       <w:r>
         <w:t xml:space="preserve"> </w:t>
       </w:r>
-      <w:hyperlink r:id="rId69">
+      <w:hyperlink r:id="rId70">
         <w:r>
           <w:rPr>
             <w:rStyle w:val="Hyperlink"/>
@@ -3689,19 +4163,35 @@
         </w:r>
       </w:hyperlink>
     </w:p>
-    <w:bookmarkEnd w:id="70"/>
-    <w:bookmarkStart w:id="72" w:name="ref-Blake1993"/>
+    <w:bookmarkEnd w:id="71"/>
+    <w:bookmarkStart w:id="73" w:name="ref-Blake1993"/>
     <w:p>
       <w:pPr>
         <w:pStyle w:val="Bibliography"/>
       </w:pPr>
       <w:r>
-        <w:t xml:space="preserve">Blake MA, Hart PJB (1993) The behavioural responses of juvenile signal crayfish pacifastacus leniusculus to stimuli from perch and eels. Freshwater Biology 29:89–97.</w:t>
-      </w:r>
-      <w:r>
-        <w:t xml:space="preserve"> </w:t>
-      </w:r>
-      <w:hyperlink r:id="rId71">
+        <w:t xml:space="preserve">Blake MA, Hart PJB (1993) The behavioural responses of juvenile signal crayfish</w:t>
+      </w:r>
+      <w:r>
+        <w:t xml:space="preserve"> </w:t>
+      </w:r>
+      <w:r>
+        <w:rPr>
+          <w:i/>
+          <w:iCs/>
+        </w:rPr>
+        <w:t xml:space="preserve">Pacifastacus leniusculus</w:t>
+      </w:r>
+      <w:r>
+        <w:t xml:space="preserve"> </w:t>
+      </w:r>
+      <w:r>
+        <w:t xml:space="preserve">to stimuli from perch and eels. Freshwater Biology 29:89–97.</w:t>
+      </w:r>
+      <w:r>
+        <w:t xml:space="preserve"> </w:t>
+      </w:r>
+      <w:hyperlink r:id="rId72">
         <w:r>
           <w:rPr>
             <w:rStyle w:val="Hyperlink"/>
@@ -3710,8 +4200,8 @@
         </w:r>
       </w:hyperlink>
     </w:p>
-    <w:bookmarkEnd w:id="72"/>
-    <w:bookmarkStart w:id="73" w:name="ref-Bronmark2012"/>
+    <w:bookmarkEnd w:id="73"/>
+    <w:bookmarkStart w:id="74" w:name="ref-Bronmark2012"/>
     <w:p>
       <w:pPr>
         <w:pStyle w:val="Bibliography"/>
@@ -3720,19 +4210,31 @@
         <w:t xml:space="preserve">Brönmark C, Hansson L-A (2012) Chemical ecology in aquatic systems. Oxford University Press</w:t>
       </w:r>
     </w:p>
-    <w:bookmarkEnd w:id="73"/>
-    <w:bookmarkStart w:id="75" w:name="ref-Brooks2017"/>
+    <w:bookmarkEnd w:id="74"/>
+    <w:bookmarkStart w:id="76" w:name="ref-Brooks2017"/>
     <w:p>
       <w:pPr>
         <w:pStyle w:val="Bibliography"/>
       </w:pPr>
       <w:r>
-        <w:t xml:space="preserve">Brooks E Mollie, Kristensen K, Benthem J Koen, et al (2017) glmmTMB balances speed and flexibility among packages for zero-inflated generalized linear mixed modeling. The R Journal 9:378.</w:t>
-      </w:r>
-      <w:r>
-        <w:t xml:space="preserve"> </w:t>
-      </w:r>
-      <w:hyperlink r:id="rId74">
+        <w:t xml:space="preserve">Brooks E Mollie, Kristensen K, Benthem J Koen, et al (2017)</w:t>
+      </w:r>
+      <w:r>
+        <w:t xml:space="preserve"> </w:t>
+      </w:r>
+      <w:r>
+        <w:t xml:space="preserve">glmmTMB</w:t>
+      </w:r>
+      <w:r>
+        <w:t xml:space="preserve"> </w:t>
+      </w:r>
+      <w:r>
+        <w:t xml:space="preserve">balances speed and flexibility among packages for zero-inflated generalized linear mixed modeling. The R Journal 9:378.</w:t>
+      </w:r>
+      <w:r>
+        <w:t xml:space="preserve"> </w:t>
+      </w:r>
+      <w:hyperlink r:id="rId75">
         <w:r>
           <w:rPr>
             <w:rStyle w:val="Hyperlink"/>
@@ -3741,8 +4243,8 @@
         </w:r>
       </w:hyperlink>
     </w:p>
-    <w:bookmarkEnd w:id="75"/>
-    <w:bookmarkStart w:id="77" w:name="ref-Brown2004"/>
+    <w:bookmarkEnd w:id="76"/>
+    <w:bookmarkStart w:id="78" w:name="ref-Brown2004"/>
     <w:p>
       <w:pPr>
         <w:pStyle w:val="Bibliography"/>
@@ -3753,7 +4255,7 @@
       <w:r>
         <w:t xml:space="preserve"> </w:t>
       </w:r>
-      <w:hyperlink r:id="rId76">
+      <w:hyperlink r:id="rId77">
         <w:r>
           <w:rPr>
             <w:rStyle w:val="Hyperlink"/>
@@ -3762,8 +4264,8 @@
         </w:r>
       </w:hyperlink>
     </w:p>
-    <w:bookmarkEnd w:id="77"/>
-    <w:bookmarkStart w:id="79" w:name="ref-Brown2009"/>
+    <w:bookmarkEnd w:id="78"/>
+    <w:bookmarkStart w:id="80" w:name="ref-Brown2009"/>
     <w:p>
       <w:pPr>
         <w:pStyle w:val="Bibliography"/>
@@ -3774,316 +4276,741 @@
       <w:r>
         <w:t xml:space="preserve"> </w:t>
       </w:r>
-      <w:hyperlink r:id="rId78">
-        <w:r>
-          <w:rPr>
-            <w:rStyle w:val="Hyperlink"/>
-          </w:rPr>
-          <w:t xml:space="preserve">Habitat determinants and predatory interactions of the endemic freshwater crayfish (koura, paranephrops planifrons) in the lower north island, new zealand</w:t>
+      <w:hyperlink r:id="rId79">
+        <w:r>
+          <w:rPr>
+            <w:rStyle w:val="Hyperlink"/>
+          </w:rPr>
+          <w:t xml:space="preserve">Habitat determinants and predatory interactions of the endemic freshwater crayfish (koura,</w:t>
+        </w:r>
+        <w:r>
+          <w:rPr>
+            <w:rStyle w:val="Hyperlink"/>
+          </w:rPr>
+          <w:t xml:space="preserve"> </w:t>
+        </w:r>
+        <w:r>
+          <w:rPr>
+            <w:rStyle w:val="Hyperlink"/>
+            <w:i/>
+            <w:iCs/>
+          </w:rPr>
+          <w:t xml:space="preserve">Paranephrops planifrons</w:t>
+        </w:r>
+        <w:r>
+          <w:rPr>
+            <w:rStyle w:val="Hyperlink"/>
+          </w:rPr>
+          <w:t xml:space="preserve">) in the lower</w:t>
+        </w:r>
+        <w:r>
+          <w:rPr>
+            <w:rStyle w:val="Hyperlink"/>
+          </w:rPr>
+          <w:t xml:space="preserve"> </w:t>
+        </w:r>
+        <w:r>
+          <w:rPr>
+            <w:rStyle w:val="Hyperlink"/>
+          </w:rPr>
+          <w:t xml:space="preserve">North Island</w:t>
+        </w:r>
+        <w:r>
+          <w:rPr>
+            <w:rStyle w:val="Hyperlink"/>
+          </w:rPr>
+          <w:t xml:space="preserve">,</w:t>
+        </w:r>
+        <w:r>
+          <w:rPr>
+            <w:rStyle w:val="Hyperlink"/>
+          </w:rPr>
+          <w:t xml:space="preserve"> </w:t>
+        </w:r>
+        <w:r>
+          <w:rPr>
+            <w:rStyle w:val="Hyperlink"/>
+          </w:rPr>
+          <w:t xml:space="preserve">New Zealand</w:t>
         </w:r>
       </w:hyperlink>
       <w:r>
         <w:t xml:space="preserve">. Massey University</w:t>
       </w:r>
     </w:p>
-    <w:bookmarkEnd w:id="79"/>
-    <w:bookmarkStart w:id="81" w:name="ref-Burnham2002"/>
+    <w:bookmarkEnd w:id="80"/>
+    <w:bookmarkStart w:id="82" w:name="ref-Carthey2014"/>
     <w:p>
       <w:pPr>
         <w:pStyle w:val="Bibliography"/>
       </w:pPr>
-      <w:hyperlink r:id="rId80">
-        <w:r>
-          <w:rPr>
-            <w:rStyle w:val="Hyperlink"/>
-          </w:rPr>
-          <w:t xml:space="preserve">Burnham K. P., Anderson DR (2002). Springer New York</w:t>
+      <w:r>
+        <w:t xml:space="preserve">Carthey AJR, Banks PB (2014) Naïveté in novel ecological interactions: Lessons from theory and experimental evidence. Biological Reviews 89:932–949.</w:t>
+      </w:r>
+      <w:r>
+        <w:t xml:space="preserve"> </w:t>
+      </w:r>
+      <w:hyperlink r:id="rId81">
+        <w:r>
+          <w:rPr>
+            <w:rStyle w:val="Hyperlink"/>
+          </w:rPr>
+          <w:t xml:space="preserve">https://doi.org/10.1111/brv.12087</w:t>
         </w:r>
       </w:hyperlink>
     </w:p>
-    <w:bookmarkEnd w:id="81"/>
-    <w:bookmarkStart w:id="83" w:name="ref-Carthey2014"/>
+    <w:bookmarkEnd w:id="82"/>
+    <w:bookmarkStart w:id="84" w:name="ref-Clinchy2013"/>
     <w:p>
       <w:pPr>
         <w:pStyle w:val="Bibliography"/>
       </w:pPr>
       <w:r>
-        <w:t xml:space="preserve">Carthey AJR, Banks PB (2014) Naïveté in novel ecological interactions: Lessons from theory and experimental evidence. Biological Reviews 89:932–949.</w:t>
-      </w:r>
-      <w:r>
-        <w:t xml:space="preserve"> </w:t>
-      </w:r>
-      <w:hyperlink r:id="rId82">
-        <w:r>
-          <w:rPr>
-            <w:rStyle w:val="Hyperlink"/>
-          </w:rPr>
-          <w:t xml:space="preserve">https://doi.org/10.1111/brv.12087</w:t>
+        <w:t xml:space="preserve">Clinchy M, Sheriff MJ, Zanette LY (2012) Predator‐induced stress and the ecology of fear. Functional Ecology 27:56–65.</w:t>
+      </w:r>
+      <w:r>
+        <w:t xml:space="preserve"> </w:t>
+      </w:r>
+      <w:hyperlink r:id="rId83">
+        <w:r>
+          <w:rPr>
+            <w:rStyle w:val="Hyperlink"/>
+          </w:rPr>
+          <w:t xml:space="preserve">https://doi.org/10.1111/1365-2435.12007</w:t>
         </w:r>
       </w:hyperlink>
     </w:p>
-    <w:bookmarkEnd w:id="83"/>
-    <w:bookmarkStart w:id="85" w:name="ref-Clinchy2013"/>
+    <w:bookmarkEnd w:id="84"/>
+    <w:bookmarkStart w:id="85" w:name="ref-Collier1997"/>
     <w:p>
       <w:pPr>
         <w:pStyle w:val="Bibliography"/>
       </w:pPr>
       <w:r>
-        <w:t xml:space="preserve">Clinchy M, Sheriff MJ, Zanette LY (2012) Predator‐induced stress and the ecology of fear. Functional Ecology 27:56–65.</w:t>
-      </w:r>
-      <w:r>
-        <w:t xml:space="preserve"> </w:t>
-      </w:r>
-      <w:hyperlink r:id="rId84">
-        <w:r>
-          <w:rPr>
-            <w:rStyle w:val="Hyperlink"/>
-          </w:rPr>
-          <w:t xml:space="preserve">https://doi.org/10.1111/1365-2435.12007</w:t>
+        <w:t xml:space="preserve">Collier KJ, Parkyn SM, Rabeni CF (1997) Koura: A keystone species. Water and Atmosphere 5:18–20</w:t>
+      </w:r>
+    </w:p>
+    <w:bookmarkEnd w:id="85"/>
+    <w:bookmarkStart w:id="87" w:name="ref-Dawkins1979"/>
+    <w:p>
+      <w:pPr>
+        <w:pStyle w:val="Bibliography"/>
+      </w:pPr>
+      <w:r>
+        <w:t xml:space="preserve">Dawkins R, Krebs JR (1979) Arms races between and within species. Proceedings of the Royal Society of London B Biological Sciences 205:489–511.</w:t>
+      </w:r>
+      <w:r>
+        <w:t xml:space="preserve"> </w:t>
+      </w:r>
+      <w:hyperlink r:id="rId86">
+        <w:r>
+          <w:rPr>
+            <w:rStyle w:val="Hyperlink"/>
+          </w:rPr>
+          <w:t xml:space="preserve">https://doi.org/10.1098/rspb.1979.0081</w:t>
         </w:r>
       </w:hyperlink>
     </w:p>
-    <w:bookmarkEnd w:id="85"/>
-    <w:bookmarkStart w:id="86" w:name="ref-Collier1997"/>
+    <w:bookmarkEnd w:id="87"/>
+    <w:bookmarkStart w:id="89" w:name="ref-Dedual2019"/>
     <w:p>
       <w:pPr>
         <w:pStyle w:val="Bibliography"/>
       </w:pPr>
       <w:r>
-        <w:t xml:space="preserve">Collier KJ, Parkyn SM, Rabeni CF (1997) Koura: A keystone species. Water and Atmosphere 5:18–20</w:t>
-      </w:r>
-    </w:p>
-    <w:bookmarkEnd w:id="86"/>
-    <w:bookmarkStart w:id="88" w:name="ref-Dawkins1979"/>
+        <w:t xml:space="preserve">Dedual M (2019)</w:t>
+      </w:r>
+      <w:r>
+        <w:t xml:space="preserve"> </w:t>
+      </w:r>
+      <w:hyperlink r:id="rId88">
+        <w:r>
+          <w:rPr>
+            <w:rStyle w:val="Hyperlink"/>
+          </w:rPr>
+          <w:t xml:space="preserve">Summary of the impacts and control methods of</w:t>
+        </w:r>
+        <w:r>
+          <w:rPr>
+            <w:rStyle w:val="Hyperlink"/>
+          </w:rPr>
+          <w:t xml:space="preserve"> </w:t>
+        </w:r>
+        <w:r>
+          <w:rPr>
+            <w:rStyle w:val="Hyperlink"/>
+          </w:rPr>
+          <w:t xml:space="preserve">Brown Bullhead</w:t>
+        </w:r>
+        <w:r>
+          <w:rPr>
+            <w:rStyle w:val="Hyperlink"/>
+          </w:rPr>
+          <w:t xml:space="preserve"> </w:t>
+        </w:r>
+        <w:r>
+          <w:rPr>
+            <w:rStyle w:val="Hyperlink"/>
+          </w:rPr>
+          <w:t xml:space="preserve">catfish (</w:t>
+        </w:r>
+        <w:r>
+          <w:rPr>
+            <w:rStyle w:val="Hyperlink"/>
+            <w:i/>
+            <w:iCs/>
+          </w:rPr>
+          <w:t xml:space="preserve">Ameiurus nebulosus</w:t>
+        </w:r>
+        <w:r>
+          <w:rPr>
+            <w:rStyle w:val="Hyperlink"/>
+          </w:rPr>
+          <w:t xml:space="preserve"> </w:t>
+        </w:r>
+        <w:r>
+          <w:rPr>
+            <w:rStyle w:val="Hyperlink"/>
+          </w:rPr>
+          <w:t xml:space="preserve">Lesueur</w:t>
+        </w:r>
+        <w:r>
+          <w:rPr>
+            <w:rStyle w:val="Hyperlink"/>
+          </w:rPr>
+          <w:t xml:space="preserve"> </w:t>
+        </w:r>
+        <w:r>
+          <w:rPr>
+            <w:rStyle w:val="Hyperlink"/>
+          </w:rPr>
+          <w:t xml:space="preserve">1815) in</w:t>
+        </w:r>
+        <w:r>
+          <w:rPr>
+            <w:rStyle w:val="Hyperlink"/>
+          </w:rPr>
+          <w:t xml:space="preserve"> </w:t>
+        </w:r>
+        <w:r>
+          <w:rPr>
+            <w:rStyle w:val="Hyperlink"/>
+          </w:rPr>
+          <w:t xml:space="preserve">New Zealand</w:t>
+        </w:r>
+        <w:r>
+          <w:rPr>
+            <w:rStyle w:val="Hyperlink"/>
+          </w:rPr>
+          <w:t xml:space="preserve"> </w:t>
+        </w:r>
+        <w:r>
+          <w:rPr>
+            <w:rStyle w:val="Hyperlink"/>
+          </w:rPr>
+          <w:t xml:space="preserve">and overseas</w:t>
+        </w:r>
+      </w:hyperlink>
+      <w:r>
+        <w:t xml:space="preserve">.</w:t>
+      </w:r>
+      <w:r>
+        <w:t xml:space="preserve"> </w:t>
+      </w:r>
+      <w:r>
+        <w:t xml:space="preserve">Bay of Plenty</w:t>
+      </w:r>
+      <w:r>
+        <w:t xml:space="preserve"> </w:t>
+      </w:r>
+      <w:r>
+        <w:t xml:space="preserve">Regional Council</w:t>
+      </w:r>
+    </w:p>
+    <w:bookmarkEnd w:id="89"/>
+    <w:bookmarkStart w:id="90" w:name="ref-Devcich1979"/>
     <w:p>
       <w:pPr>
         <w:pStyle w:val="Bibliography"/>
       </w:pPr>
       <w:r>
-        <w:t xml:space="preserve">Dawkins R, Krebs JR (1979) Arms races between and within species. Proceedings of the Royal Society of London B Biological Sciences 205:489–511.</w:t>
-      </w:r>
-      <w:r>
-        <w:t xml:space="preserve"> </w:t>
-      </w:r>
-      <w:hyperlink r:id="rId87">
-        <w:r>
-          <w:rPr>
-            <w:rStyle w:val="Hyperlink"/>
-          </w:rPr>
-          <w:t xml:space="preserve">https://doi.org/10.1098/rspb.1979.0081</w:t>
+        <w:t xml:space="preserve">Devcich AA (1979) An ecological study of</w:t>
+      </w:r>
+      <w:r>
+        <w:t xml:space="preserve"> </w:t>
+      </w:r>
+      <w:r>
+        <w:rPr>
+          <w:i/>
+          <w:iCs/>
+        </w:rPr>
+        <w:t xml:space="preserve">Paranephrops planifrons</w:t>
+      </w:r>
+      <w:r>
+        <w:t xml:space="preserve"> </w:t>
+      </w:r>
+      <w:r>
+        <w:t xml:space="preserve">White</w:t>
+      </w:r>
+      <w:r>
+        <w:t xml:space="preserve"> </w:t>
+      </w:r>
+      <w:r>
+        <w:t xml:space="preserve">(</w:t>
+      </w:r>
+      <w:r>
+        <w:t xml:space="preserve">Decapoda</w:t>
+      </w:r>
+      <w:r>
+        <w:t xml:space="preserve">:</w:t>
+      </w:r>
+      <w:r>
+        <w:t xml:space="preserve"> </w:t>
+      </w:r>
+      <w:r>
+        <w:t xml:space="preserve">Parastacidae</w:t>
+      </w:r>
+      <w:r>
+        <w:t xml:space="preserve">) in</w:t>
+      </w:r>
+      <w:r>
+        <w:t xml:space="preserve"> </w:t>
+      </w:r>
+      <w:r>
+        <w:t xml:space="preserve">Lake Rotoiti</w:t>
+      </w:r>
+      <w:r>
+        <w:t xml:space="preserve">,</w:t>
+      </w:r>
+      <w:r>
+        <w:t xml:space="preserve"> </w:t>
+      </w:r>
+      <w:r>
+        <w:t xml:space="preserve">North Island</w:t>
+      </w:r>
+      <w:r>
+        <w:t xml:space="preserve">. PhD thesis, University of Waikato</w:t>
+      </w:r>
+    </w:p>
+    <w:bookmarkEnd w:id="90"/>
+    <w:bookmarkStart w:id="92" w:name="ref-Doherty2016"/>
+    <w:p>
+      <w:pPr>
+        <w:pStyle w:val="Bibliography"/>
+      </w:pPr>
+      <w:r>
+        <w:t xml:space="preserve">Doherty TS, Glen AS, Nimmo DG, et al (2016) Invasive predators and global biodiversity loss. Proceedings of the National Academy of Sciences 113:11261–11265.</w:t>
+      </w:r>
+      <w:r>
+        <w:t xml:space="preserve"> </w:t>
+      </w:r>
+      <w:hyperlink r:id="rId91">
+        <w:r>
+          <w:rPr>
+            <w:rStyle w:val="Hyperlink"/>
+          </w:rPr>
+          <w:t xml:space="preserve">https://doi.org/10.1073/pnas.1602480113</w:t>
         </w:r>
       </w:hyperlink>
     </w:p>
-    <w:bookmarkEnd w:id="88"/>
-    <w:bookmarkStart w:id="90" w:name="ref-Dedual2019"/>
+    <w:bookmarkEnd w:id="92"/>
+    <w:bookmarkStart w:id="94" w:name="ref-Driscoll2020"/>
     <w:p>
       <w:pPr>
         <w:pStyle w:val="Bibliography"/>
       </w:pPr>
       <w:r>
-        <w:t xml:space="preserve">Dedual M (2019)</w:t>
-      </w:r>
-      <w:r>
-        <w:t xml:space="preserve"> </w:t>
-      </w:r>
-      <w:hyperlink r:id="rId89">
-        <w:r>
-          <w:rPr>
-            <w:rStyle w:val="Hyperlink"/>
-          </w:rPr>
-          <w:t xml:space="preserve">Summary of the impacts and control methods of brown bullhead catfish (ameiurus nebulosus lesueur 1815) in new zealand and overseas</w:t>
+        <w:t xml:space="preserve">Driscoll J, Kola M, Mathews L (2020) Perception of alarm cues influences the outcome of shelter competition in crayfish20. Ethology 126:584–592.</w:t>
+      </w:r>
+      <w:r>
+        <w:t xml:space="preserve"> </w:t>
+      </w:r>
+      <w:hyperlink r:id="rId93">
+        <w:r>
+          <w:rPr>
+            <w:rStyle w:val="Hyperlink"/>
+          </w:rPr>
+          <w:t xml:space="preserve">https://doi.org/10.1111/eth.13011</w:t>
         </w:r>
       </w:hyperlink>
-      <w:r>
-        <w:t xml:space="preserve">. Bay of Plenty Regional Council</w:t>
-      </w:r>
-    </w:p>
-    <w:bookmarkEnd w:id="90"/>
-    <w:bookmarkStart w:id="91" w:name="ref-Devcich1979"/>
+    </w:p>
+    <w:bookmarkEnd w:id="94"/>
+    <w:bookmarkStart w:id="96" w:name="ref-Ehlman2019"/>
     <w:p>
       <w:pPr>
         <w:pStyle w:val="Bibliography"/>
       </w:pPr>
       <w:r>
-        <w:t xml:space="preserve">Devcich AA (1979) An ecological study of paranephrops planifrons white (decapoda: Parastacidae) in lake rotoiti, north island. PhD thesis, University of Waikato</w:t>
-      </w:r>
-    </w:p>
-    <w:bookmarkEnd w:id="91"/>
-    <w:bookmarkStart w:id="93" w:name="ref-Doherty2016"/>
+        <w:t xml:space="preserve">Ehlman SM, Trimmer PC, Sih A (2019) Prey responses to exotic predators: Effects of old risks and new cues. The American Naturalist 193:575–587.</w:t>
+      </w:r>
+      <w:r>
+        <w:t xml:space="preserve"> </w:t>
+      </w:r>
+      <w:hyperlink r:id="rId95">
+        <w:r>
+          <w:rPr>
+            <w:rStyle w:val="Hyperlink"/>
+          </w:rPr>
+          <w:t xml:space="preserve">https://doi.org/10.1086/702252</w:t>
+        </w:r>
+      </w:hyperlink>
+    </w:p>
+    <w:bookmarkEnd w:id="96"/>
+    <w:bookmarkStart w:id="98" w:name="ref-Feldmann1994"/>
     <w:p>
       <w:pPr>
         <w:pStyle w:val="Bibliography"/>
       </w:pPr>
       <w:r>
-        <w:t xml:space="preserve">Doherty TS, Glen AS, Nimmo DG, et al (2016) Invasive predators and global biodiversity loss. Proceedings of the National Academy of Sciences 113:11261–11265.</w:t>
-      </w:r>
-      <w:r>
-        <w:t xml:space="preserve"> </w:t>
-      </w:r>
-      <w:hyperlink r:id="rId92">
-        <w:r>
-          <w:rPr>
-            <w:rStyle w:val="Hyperlink"/>
-          </w:rPr>
-          <w:t xml:space="preserve">https://doi.org/10.1073/pnas.1602480113</w:t>
+        <w:t xml:space="preserve">Feldmann RM, Pole M (1994) A new species of</w:t>
+      </w:r>
+      <w:r>
+        <w:t xml:space="preserve"> </w:t>
+      </w:r>
+      <w:r>
+        <w:rPr>
+          <w:i/>
+          <w:iCs/>
+        </w:rPr>
+        <w:t xml:space="preserve">Paranephrops</w:t>
+      </w:r>
+      <w:r>
+        <w:t xml:space="preserve"> </w:t>
+      </w:r>
+      <w:r>
+        <w:t xml:space="preserve">White</w:t>
+      </w:r>
+      <w:r>
+        <w:t xml:space="preserve">, 1842: A fossil freshwater crayfish (</w:t>
+      </w:r>
+      <w:r>
+        <w:t xml:space="preserve">Decapoda</w:t>
+      </w:r>
+      <w:r>
+        <w:t xml:space="preserve">:</w:t>
+      </w:r>
+      <w:r>
+        <w:t xml:space="preserve"> </w:t>
+      </w:r>
+      <w:r>
+        <w:t xml:space="preserve">Parastacidae</w:t>
+      </w:r>
+      <w:r>
+        <w:t xml:space="preserve">) from the</w:t>
+      </w:r>
+      <w:r>
+        <w:t xml:space="preserve"> </w:t>
+      </w:r>
+      <w:r>
+        <w:t xml:space="preserve">Manuherikia Group</w:t>
+      </w:r>
+      <w:r>
+        <w:t xml:space="preserve"> </w:t>
+      </w:r>
+      <w:r>
+        <w:t xml:space="preserve">(</w:t>
+      </w:r>
+      <w:r>
+        <w:t xml:space="preserve">Miocene</w:t>
+      </w:r>
+      <w:r>
+        <w:t xml:space="preserve">),</w:t>
+      </w:r>
+      <w:r>
+        <w:t xml:space="preserve"> </w:t>
+      </w:r>
+      <w:r>
+        <w:t xml:space="preserve">Central Otago</w:t>
+      </w:r>
+      <w:r>
+        <w:t xml:space="preserve">,</w:t>
+      </w:r>
+      <w:r>
+        <w:t xml:space="preserve"> </w:t>
+      </w:r>
+      <w:r>
+        <w:t xml:space="preserve">New Zealand</w:t>
+      </w:r>
+      <w:r>
+        <w:t xml:space="preserve">. New Zealand Journal of Geology and Geophysics 37:163–167.</w:t>
+      </w:r>
+      <w:r>
+        <w:t xml:space="preserve"> </w:t>
+      </w:r>
+      <w:hyperlink r:id="rId97">
+        <w:r>
+          <w:rPr>
+            <w:rStyle w:val="Hyperlink"/>
+          </w:rPr>
+          <w:t xml:space="preserve">https://doi.org/10.1080/00288306.1994.9514611</w:t>
         </w:r>
       </w:hyperlink>
     </w:p>
-    <w:bookmarkEnd w:id="93"/>
-    <w:bookmarkStart w:id="95" w:name="ref-Ehlman2019"/>
+    <w:bookmarkEnd w:id="98"/>
+    <w:bookmarkStart w:id="100" w:name="ref-Figler2005"/>
     <w:p>
       <w:pPr>
         <w:pStyle w:val="Bibliography"/>
       </w:pPr>
       <w:r>
-        <w:t xml:space="preserve">Ehlman SM, Trimmer PC, Sih A (2019) Prey responses to exotic predators: Effects of old risks and new cues. The American Naturalist 193:575–587.</w:t>
-      </w:r>
-      <w:r>
-        <w:t xml:space="preserve"> </w:t>
-      </w:r>
-      <w:hyperlink r:id="rId94">
-        <w:r>
-          <w:rPr>
-            <w:rStyle w:val="Hyperlink"/>
-          </w:rPr>
-          <w:t xml:space="preserve">https://doi.org/10.1086/702252</w:t>
+        <w:t xml:space="preserve">Figler MH, Blank GS, Peeke HVS (2005) Shelter competition between resident male red swamp crayfish</w:t>
+      </w:r>
+      <w:r>
+        <w:t xml:space="preserve"> </w:t>
+      </w:r>
+      <w:r>
+        <w:rPr>
+          <w:i/>
+          <w:iCs/>
+        </w:rPr>
+        <w:t xml:space="preserve">Procambarus clarkii</w:t>
+      </w:r>
+      <w:r>
+        <w:t xml:space="preserve"> </w:t>
+      </w:r>
+      <w:r>
+        <w:t xml:space="preserve">(</w:t>
+      </w:r>
+      <w:r>
+        <w:t xml:space="preserve">Girard</w:t>
+      </w:r>
+      <w:r>
+        <w:t xml:space="preserve">) and conspecific intruders varying by sex and reproductive status. Marine and Freshwater Behaviour and Physiology 38:237–248.</w:t>
+      </w:r>
+      <w:r>
+        <w:t xml:space="preserve"> </w:t>
+      </w:r>
+      <w:hyperlink r:id="rId99">
+        <w:r>
+          <w:rPr>
+            <w:rStyle w:val="Hyperlink"/>
+          </w:rPr>
+          <w:t xml:space="preserve">https://doi.org/10.1080/10236240500376477</w:t>
         </w:r>
       </w:hyperlink>
     </w:p>
-    <w:bookmarkEnd w:id="95"/>
-    <w:bookmarkStart w:id="97" w:name="ref-Figler2005"/>
+    <w:bookmarkEnd w:id="100"/>
+    <w:bookmarkStart w:id="102" w:name="ref-Francis_2019"/>
     <w:p>
       <w:pPr>
         <w:pStyle w:val="Bibliography"/>
       </w:pPr>
       <w:r>
-        <w:t xml:space="preserve">Figler MH, Blank GS, Peeke HVS (2005) Shelter competition between resident male red swamp crayfish procambarus clarkii (girard) and conspecific intruders varying by sex and reproductive status. Marine and Freshwater Behaviour and Physiology 38:237–248.</w:t>
-      </w:r>
-      <w:r>
-        <w:t xml:space="preserve"> </w:t>
-      </w:r>
-      <w:hyperlink r:id="rId96">
-        <w:r>
-          <w:rPr>
-            <w:rStyle w:val="Hyperlink"/>
-          </w:rPr>
-          <w:t xml:space="preserve">https://doi.org/10.1080/10236240500376477</w:t>
+        <w:t xml:space="preserve">Francis LB (2019)</w:t>
+      </w:r>
+      <w:r>
+        <w:t xml:space="preserve"> </w:t>
+      </w:r>
+      <w:hyperlink r:id="rId101">
+        <w:r>
+          <w:rPr>
+            <w:rStyle w:val="Hyperlink"/>
+          </w:rPr>
+          <w:t xml:space="preserve">Evaluating the effects of invasive brown bullhead catfish (ameiurus nebulosus) on kōura (freshwater crayfish, paranephrops planifrons) in lake rotoiti</w:t>
         </w:r>
       </w:hyperlink>
-    </w:p>
-    <w:bookmarkEnd w:id="97"/>
-    <w:bookmarkStart w:id="98" w:name="ref-Fox2018"/>
+      <w:r>
+        <w:t xml:space="preserve">. Thesis, The University of Waikato</w:t>
+      </w:r>
+    </w:p>
+    <w:bookmarkEnd w:id="102"/>
+    <w:bookmarkStart w:id="104" w:name="ref-Gherardi2011"/>
     <w:p>
       <w:pPr>
         <w:pStyle w:val="Bibliography"/>
       </w:pPr>
       <w:r>
-        <w:t xml:space="preserve">Fox J, Weisberg S (2018) An r companion to applied regression. SAGE Publications</w:t>
-      </w:r>
-    </w:p>
-    <w:bookmarkEnd w:id="98"/>
-    <w:bookmarkStart w:id="100" w:name="ref-Gherardi2011"/>
+        <w:t xml:space="preserve">Gherardi F, Mavuti KM, Pacini N, et al (2011) The smell of danger: Chemical recognition of fish predators by the invasive crayfish</w:t>
+      </w:r>
+      <w:r>
+        <w:t xml:space="preserve"> </w:t>
+      </w:r>
+      <w:r>
+        <w:rPr>
+          <w:i/>
+          <w:iCs/>
+        </w:rPr>
+        <w:t xml:space="preserve">Procambarus clarkii</w:t>
+      </w:r>
+      <w:r>
+        <w:t xml:space="preserve">. Freshwater Biology 56:1567–1578.</w:t>
+      </w:r>
+      <w:r>
+        <w:t xml:space="preserve"> </w:t>
+      </w:r>
+      <w:hyperlink r:id="rId103">
+        <w:r>
+          <w:rPr>
+            <w:rStyle w:val="Hyperlink"/>
+          </w:rPr>
+          <w:t xml:space="preserve">https://doi.org/10.1111/j.1365-2427.2011.02595.x</w:t>
+        </w:r>
+      </w:hyperlink>
+    </w:p>
+    <w:bookmarkEnd w:id="104"/>
+    <w:bookmarkStart w:id="106" w:name="ref-Hartig2024"/>
     <w:p>
       <w:pPr>
         <w:pStyle w:val="Bibliography"/>
       </w:pPr>
       <w:r>
-        <w:t xml:space="preserve">Gherardi F, Mavuti KM, Pacini N, et al (2011) The smell of danger: Chemical recognition of fish predators by the invasive crayfish procambarus clarkii. Freshwater Biology 56:1567–1578.</w:t>
-      </w:r>
-      <w:r>
-        <w:t xml:space="preserve"> </w:t>
-      </w:r>
-      <w:hyperlink r:id="rId99">
-        <w:r>
-          <w:rPr>
-            <w:rStyle w:val="Hyperlink"/>
-          </w:rPr>
-          <w:t xml:space="preserve">https://doi.org/10.1111/j.1365-2427.2011.02595.x</w:t>
+        <w:t xml:space="preserve">Hartig F, Lohse L, leite M de S</w:t>
+      </w:r>
+      <w:r>
+        <w:t xml:space="preserve"> </w:t>
+      </w:r>
+      <w:r>
+        <w:t xml:space="preserve">(2024)</w:t>
+      </w:r>
+      <w:r>
+        <w:t xml:space="preserve"> </w:t>
+      </w:r>
+      <w:hyperlink r:id="rId105">
+        <w:r>
+          <w:rPr>
+            <w:rStyle w:val="Hyperlink"/>
+          </w:rPr>
+          <w:t xml:space="preserve">DHARMa: Residual diagnostics for hierarchical (multi-level / mixed) regression models</w:t>
         </w:r>
       </w:hyperlink>
     </w:p>
-    <w:bookmarkEnd w:id="100"/>
-    <w:bookmarkStart w:id="102" w:name="ref-Hartig2024"/>
+    <w:bookmarkEnd w:id="106"/>
+    <w:bookmarkStart w:id="108" w:name="ref-Hazlett2003"/>
     <w:p>
       <w:pPr>
         <w:pStyle w:val="Bibliography"/>
       </w:pPr>
       <w:r>
-        <w:t xml:space="preserve">Hartig F, Lohse L, leite M de S</w:t>
-      </w:r>
-      <w:r>
-        <w:t xml:space="preserve"> </w:t>
-      </w:r>
-      <w:r>
-        <w:t xml:space="preserve">(2024)</w:t>
-      </w:r>
-      <w:r>
-        <w:t xml:space="preserve"> </w:t>
-      </w:r>
-      <w:hyperlink r:id="rId101">
-        <w:r>
-          <w:rPr>
-            <w:rStyle w:val="Hyperlink"/>
-          </w:rPr>
-          <w:t xml:space="preserve">DHARMa: Residual diagnostics for hierarchical (multi-level / mixed) regression models</w:t>
+        <w:t xml:space="preserve">Hazlett BA (2003) The effects of starvation on crayfish responses to alarm odor. Ethology 109:587–592.</w:t>
+      </w:r>
+      <w:r>
+        <w:t xml:space="preserve"> </w:t>
+      </w:r>
+      <w:hyperlink r:id="rId107">
+        <w:r>
+          <w:rPr>
+            <w:rStyle w:val="Hyperlink"/>
+          </w:rPr>
+          <w:t xml:space="preserve">https://doi.org/10.1046/j.1439-0310.2003.00902.x</w:t>
         </w:r>
       </w:hyperlink>
     </w:p>
-    <w:bookmarkEnd w:id="102"/>
-    <w:bookmarkStart w:id="104" w:name="ref-Hazlett2003"/>
+    <w:bookmarkEnd w:id="108"/>
+    <w:bookmarkStart w:id="110" w:name="ref-Hicks1997"/>
     <w:p>
       <w:pPr>
         <w:pStyle w:val="Bibliography"/>
       </w:pPr>
       <w:r>
-        <w:t xml:space="preserve">Hazlett BA (2003) The effects of starvation on crayfish responses to alarm odor. Ethology 109:587–592.</w:t>
-      </w:r>
-      <w:r>
-        <w:t xml:space="preserve"> </w:t>
-      </w:r>
-      <w:hyperlink r:id="rId103">
-        <w:r>
-          <w:rPr>
-            <w:rStyle w:val="Hyperlink"/>
-          </w:rPr>
-          <w:t xml:space="preserve">https://doi.org/10.1046/j.1439-0310.2003.00902.x</w:t>
+        <w:t xml:space="preserve">Hicks BJ (1997) Food webs in forest and pasture streams in the</w:t>
+      </w:r>
+      <w:r>
+        <w:t xml:space="preserve"> </w:t>
+      </w:r>
+      <w:r>
+        <w:t xml:space="preserve">Waikato</w:t>
+      </w:r>
+      <w:r>
+        <w:t xml:space="preserve"> </w:t>
+      </w:r>
+      <w:r>
+        <w:t xml:space="preserve">region,</w:t>
+      </w:r>
+      <w:r>
+        <w:t xml:space="preserve"> </w:t>
+      </w:r>
+      <w:r>
+        <w:t xml:space="preserve">New Zealand</w:t>
+      </w:r>
+      <w:r>
+        <w:t xml:space="preserve">: A study based on analyses of stable isotopes of carbon and nitrogen, and fish gut contents. New Zealand Journal of Marine and Freshwater Research 31:651–664.</w:t>
+      </w:r>
+      <w:r>
+        <w:t xml:space="preserve"> </w:t>
+      </w:r>
+      <w:hyperlink r:id="rId109">
+        <w:r>
+          <w:rPr>
+            <w:rStyle w:val="Hyperlink"/>
+          </w:rPr>
+          <w:t xml:space="preserve">https://doi.org/10.1080/00288330.1997.9516796</w:t>
         </w:r>
       </w:hyperlink>
     </w:p>
-    <w:bookmarkEnd w:id="104"/>
-    <w:bookmarkStart w:id="106" w:name="ref-Hicks1997"/>
+    <w:bookmarkEnd w:id="110"/>
+    <w:bookmarkStart w:id="112" w:name="ref-Hogg2003"/>
     <w:p>
       <w:pPr>
         <w:pStyle w:val="Bibliography"/>
       </w:pPr>
       <w:r>
-        <w:t xml:space="preserve">Hicks BJ (1997) Food webs in forest and pasture streams in the waikato region, new zealand: A study based on analyses of stable isotopes of carbon and nitrogen, and fish gut contents. New Zealand Journal of Marine and Freshwater Research 31:651–664.</w:t>
-      </w:r>
-      <w:r>
-        <w:t xml:space="preserve"> </w:t>
-      </w:r>
-      <w:hyperlink r:id="rId105">
-        <w:r>
-          <w:rPr>
-            <w:rStyle w:val="Hyperlink"/>
-          </w:rPr>
-          <w:t xml:space="preserve">https://doi.org/10.1080/00288330.1997.9516796</w:t>
+        <w:t xml:space="preserve">Hogg AG, Higham TFG, Lowe DJ, et al (2003) A wiggle-match date for</w:t>
+      </w:r>
+      <w:r>
+        <w:t xml:space="preserve"> </w:t>
+      </w:r>
+      <w:r>
+        <w:t xml:space="preserve">Polynesian</w:t>
+      </w:r>
+      <w:r>
+        <w:t xml:space="preserve"> </w:t>
+      </w:r>
+      <w:r>
+        <w:t xml:space="preserve">settlement of</w:t>
+      </w:r>
+      <w:r>
+        <w:t xml:space="preserve"> </w:t>
+      </w:r>
+      <w:r>
+        <w:t xml:space="preserve">New Zealand</w:t>
+      </w:r>
+      <w:r>
+        <w:t xml:space="preserve">. Antiquity 77:116–125.</w:t>
+      </w:r>
+      <w:r>
+        <w:t xml:space="preserve"> </w:t>
+      </w:r>
+      <w:hyperlink r:id="rId111">
+        <w:r>
+          <w:rPr>
+            <w:rStyle w:val="Hyperlink"/>
+          </w:rPr>
+          <w:t xml:space="preserve">https://doi.org/10.1017/s0003598x00061408</w:t>
         </w:r>
       </w:hyperlink>
     </w:p>
-    <w:bookmarkEnd w:id="106"/>
-    <w:bookmarkStart w:id="108" w:name="ref-Johnson2014"/>
+    <w:bookmarkEnd w:id="112"/>
+    <w:bookmarkStart w:id="114" w:name="ref-Johnson2014"/>
     <w:p>
       <w:pPr>
         <w:pStyle w:val="Bibliography"/>
       </w:pPr>
       <w:r>
-        <w:t xml:space="preserve">Johnson MF, Rice SP, Reid I (2014) The activity of signal crayfish (pacifastacus leniusculus) in relation to thermal and hydraulic dynamics of an alluvial stream, UK. Hydrobiologia 724:41–54.</w:t>
-      </w:r>
-      <w:r>
-        <w:t xml:space="preserve"> </w:t>
-      </w:r>
-      <w:hyperlink r:id="rId107">
+        <w:t xml:space="preserve">Johnson MF, Rice SP, Reid I (2014) The activity of signal crayfish (</w:t>
+      </w:r>
+      <w:r>
+        <w:rPr>
+          <w:i/>
+          <w:iCs/>
+        </w:rPr>
+        <w:t xml:space="preserve">Pacifastacus leniusculus</w:t>
+      </w:r>
+      <w:r>
+        <w:t xml:space="preserve">) in relation to thermal and hydraulic dynamics of an alluvial stream,</w:t>
+      </w:r>
+      <w:r>
+        <w:t xml:space="preserve"> </w:t>
+      </w:r>
+      <w:r>
+        <w:t xml:space="preserve">UK</w:t>
+      </w:r>
+      <w:r>
+        <w:t xml:space="preserve">. Hydrobiologia 724:41–54.</w:t>
+      </w:r>
+      <w:r>
+        <w:t xml:space="preserve"> </w:t>
+      </w:r>
+      <w:hyperlink r:id="rId113">
         <w:r>
           <w:rPr>
             <w:rStyle w:val="Hyperlink"/>
@@ -4092,19 +5019,107 @@
         </w:r>
       </w:hyperlink>
     </w:p>
-    <w:bookmarkEnd w:id="108"/>
-    <w:bookmarkStart w:id="110" w:name="ref-Kindlinger2017"/>
+    <w:bookmarkEnd w:id="114"/>
+    <w:bookmarkStart w:id="116" w:name="ref-Kasumyan2022"/>
     <w:p>
       <w:pPr>
         <w:pStyle w:val="Bibliography"/>
       </w:pPr>
       <w:r>
+        <w:t xml:space="preserve">Kasumyan AO (2022) Fish as sources of kairomones-chemical signals for aquatic animals. Journal of Ichthyology 62:289–315.</w:t>
+      </w:r>
+      <w:r>
+        <w:t xml:space="preserve"> </w:t>
+      </w:r>
+      <w:hyperlink r:id="rId115">
+        <w:r>
+          <w:rPr>
+            <w:rStyle w:val="Hyperlink"/>
+          </w:rPr>
+          <w:t xml:space="preserve">https://doi.org/10.1134/s0032945222020084</w:t>
+        </w:r>
+      </w:hyperlink>
+    </w:p>
+    <w:bookmarkEnd w:id="116"/>
+    <w:bookmarkStart w:id="118" w:name="ref-Kaulfuss2018"/>
+    <w:p>
+      <w:pPr>
+        <w:pStyle w:val="Bibliography"/>
+      </w:pPr>
+      <w:r>
+        <w:t xml:space="preserve">Kaulfuss U, Lee DE, Wartho J-A, et al (2018) Geology and palaeontology of the</w:t>
+      </w:r>
+      <w:r>
+        <w:t xml:space="preserve"> </w:t>
+      </w:r>
+      <w:r>
+        <w:t xml:space="preserve">Hindon Maar Complex</w:t>
+      </w:r>
+      <w:r>
+        <w:t xml:space="preserve">: A</w:t>
+      </w:r>
+      <w:r>
+        <w:t xml:space="preserve"> </w:t>
+      </w:r>
+      <w:r>
+        <w:t xml:space="preserve">Miocene</w:t>
+      </w:r>
+      <w:r>
+        <w:t xml:space="preserve"> </w:t>
+      </w:r>
+      <w:r>
+        <w:t xml:space="preserve">terrestrial fossil</w:t>
+      </w:r>
+      <w:r>
+        <w:t xml:space="preserve"> </w:t>
+      </w:r>
+      <w:r>
+        <w:rPr>
+          <w:i/>
+          <w:iCs/>
+        </w:rPr>
+        <w:t xml:space="preserve">Lagerstätte</w:t>
+      </w:r>
+      <w:r>
+        <w:t xml:space="preserve"> </w:t>
+      </w:r>
+      <w:r>
+        <w:t xml:space="preserve">in southern</w:t>
+      </w:r>
+      <w:r>
+        <w:t xml:space="preserve"> </w:t>
+      </w:r>
+      <w:r>
+        <w:t xml:space="preserve">New Zealand</w:t>
+      </w:r>
+      <w:r>
+        <w:t xml:space="preserve">. Palaeogeography, Palaeoclimatology, Palaeoecology 500:52–68.</w:t>
+      </w:r>
+      <w:r>
+        <w:t xml:space="preserve"> </w:t>
+      </w:r>
+      <w:hyperlink r:id="rId117">
+        <w:r>
+          <w:rPr>
+            <w:rStyle w:val="Hyperlink"/>
+          </w:rPr>
+          <w:t xml:space="preserve">https://doi.org/10.1016/j.palaeo.2018.03.022</w:t>
+        </w:r>
+      </w:hyperlink>
+    </w:p>
+    <w:bookmarkEnd w:id="118"/>
+    <w:bookmarkStart w:id="120" w:name="ref-Kindlinger2017"/>
+    <w:p>
+      <w:pPr>
+        <w:pStyle w:val="Bibliography"/>
+      </w:pPr>
+      <w:r>
         <w:t xml:space="preserve">Kindinger TL, Albins MA (2017) Consumptive and non-consumptive effects of an invasive marine predator on native coral-reef herbivores. Biological Invasions 19:131–146.</w:t>
       </w:r>
       <w:r>
         <w:t xml:space="preserve"> </w:t>
       </w:r>
-      <w:hyperlink r:id="rId109">
+      <w:hyperlink r:id="rId119">
         <w:r>
           <w:rPr>
             <w:rStyle w:val="Hyperlink"/>
@@ -4113,19 +5128,31 @@
         </w:r>
       </w:hyperlink>
     </w:p>
-    <w:bookmarkEnd w:id="110"/>
-    <w:bookmarkStart w:id="112" w:name="ref-Kusabs2026"/>
+    <w:bookmarkEnd w:id="120"/>
+    <w:bookmarkStart w:id="122" w:name="ref-Kusabs2026"/>
     <w:p>
       <w:pPr>
         <w:pStyle w:val="Bibliography"/>
       </w:pPr>
       <w:r>
-        <w:t xml:space="preserve">Kusabs IAK, Duggan IC, Bruere AC, et al (2026) Invasive catfish linked to the decline of freshwater crayfish in two aotearoa new zealand lakes. Biological Invasions 28:</w:t>
-      </w:r>
-      <w:r>
-        <w:t xml:space="preserve"> </w:t>
-      </w:r>
-      <w:hyperlink r:id="rId111">
+        <w:t xml:space="preserve">Kusabs IAK, Duggan IC, Bruere AC, et al (2026) Invasive catfish linked to the decline of freshwater crayfish in two</w:t>
+      </w:r>
+      <w:r>
+        <w:t xml:space="preserve"> </w:t>
+      </w:r>
+      <w:r>
+        <w:t xml:space="preserve">Aotearoa New Zealand</w:t>
+      </w:r>
+      <w:r>
+        <w:t xml:space="preserve"> </w:t>
+      </w:r>
+      <w:r>
+        <w:t xml:space="preserve">lakes. Biological Invasions 28:</w:t>
+      </w:r>
+      <w:r>
+        <w:t xml:space="preserve"> </w:t>
+      </w:r>
+      <w:hyperlink r:id="rId121">
         <w:r>
           <w:rPr>
             <w:rStyle w:val="Hyperlink"/>
@@ -4134,19 +5161,71 @@
         </w:r>
       </w:hyperlink>
     </w:p>
-    <w:bookmarkEnd w:id="112"/>
-    <w:bookmarkStart w:id="114" w:name="ref-Kusabs2009"/>
+    <w:bookmarkEnd w:id="122"/>
+    <w:bookmarkStart w:id="124" w:name="ref-Kusabs2009"/>
     <w:p>
       <w:pPr>
         <w:pStyle w:val="Bibliography"/>
       </w:pPr>
       <w:r>
-        <w:t xml:space="preserve">Kusabs IA, Quinn JM (2009) Use of a traditional maori harvesting method, the tau kōura, for monitoring kōura (freshwater crayfish, paranephrops planifrons) in lake rotoiti, north island, new zealand. New Zealand Journal of Marine and Freshwater Research 43:713–722.</w:t>
-      </w:r>
-      <w:r>
-        <w:t xml:space="preserve"> </w:t>
-      </w:r>
-      <w:hyperlink r:id="rId113">
+        <w:t xml:space="preserve">Kusabs IA, Quinn JM (2009) Use of a traditional</w:t>
+      </w:r>
+      <w:r>
+        <w:t xml:space="preserve"> </w:t>
+      </w:r>
+      <w:r>
+        <w:t xml:space="preserve">Māori</w:t>
+      </w:r>
+      <w:r>
+        <w:t xml:space="preserve"> </w:t>
+      </w:r>
+      <w:r>
+        <w:t xml:space="preserve">harvesting method, the tau kōura, for monitoring kōura (freshwater crayfish,</w:t>
+      </w:r>
+      <w:r>
+        <w:t xml:space="preserve"> </w:t>
+      </w:r>
+      <w:r>
+        <w:rPr>
+          <w:i/>
+          <w:iCs/>
+        </w:rPr>
+        <w:t xml:space="preserve">Paranephrops planifrons</w:t>
+      </w:r>
+      <w:r>
+        <w:t xml:space="preserve">) in</w:t>
+      </w:r>
+      <w:r>
+        <w:t xml:space="preserve"> </w:t>
+      </w:r>
+      <w:r>
+        <w:t xml:space="preserve">Lake Rotoiti</w:t>
+      </w:r>
+      <w:r>
+        <w:t xml:space="preserve">,</w:t>
+      </w:r>
+      <w:r>
+        <w:t xml:space="preserve"> </w:t>
+      </w:r>
+      <w:r>
+        <w:t xml:space="preserve">North Island</w:t>
+      </w:r>
+      <w:r>
+        <w:t xml:space="preserve">,</w:t>
+      </w:r>
+      <w:r>
+        <w:t xml:space="preserve"> </w:t>
+      </w:r>
+      <w:r>
+        <w:t xml:space="preserve">New Zealand</w:t>
+      </w:r>
+      <w:r>
+        <w:t xml:space="preserve">. New Zealand Journal of Marine and Freshwater Research 43:713–722.</w:t>
+      </w:r>
+      <w:r>
+        <w:t xml:space="preserve"> </w:t>
+      </w:r>
+      <w:hyperlink r:id="rId123">
         <w:r>
           <w:rPr>
             <w:rStyle w:val="Hyperlink"/>
@@ -4155,8 +5234,8 @@
         </w:r>
       </w:hyperlink>
     </w:p>
-    <w:bookmarkEnd w:id="114"/>
-    <w:bookmarkStart w:id="116" w:name="ref-Laundre2001"/>
+    <w:bookmarkEnd w:id="124"/>
+    <w:bookmarkStart w:id="126" w:name="ref-Laundre2001"/>
     <w:p>
       <w:pPr>
         <w:pStyle w:val="Bibliography"/>
@@ -4174,12 +5253,30 @@
         <w:t xml:space="preserve"> </w:t>
       </w:r>
       <w:r>
-        <w:t xml:space="preserve">in yellowstone national park, u.s.a. Canadian Journal of Zoology 79:1401–1409.</w:t>
-      </w:r>
-      <w:r>
-        <w:t xml:space="preserve"> </w:t>
-      </w:r>
-      <w:hyperlink r:id="rId115">
+        <w:t xml:space="preserve">in</w:t>
+      </w:r>
+      <w:r>
+        <w:t xml:space="preserve"> </w:t>
+      </w:r>
+      <w:r>
+        <w:t xml:space="preserve">Yellowstone National Park</w:t>
+      </w:r>
+      <w:r>
+        <w:t xml:space="preserve">,</w:t>
+      </w:r>
+      <w:r>
+        <w:t xml:space="preserve"> </w:t>
+      </w:r>
+      <w:r>
+        <w:t xml:space="preserve">U.S.A.</w:t>
+      </w:r>
+      <w:r>
+        <w:t xml:space="preserve"> Canadian Journal of Zoology 79:1401–1409.</w:t>
+      </w:r>
+      <w:r>
+        <w:t xml:space="preserve"> </w:t>
+      </w:r>
+      <w:hyperlink r:id="rId125">
         <w:r>
           <w:rPr>
             <w:rStyle w:val="Hyperlink"/>
@@ -4188,8 +5285,8 @@
         </w:r>
       </w:hyperlink>
     </w:p>
-    <w:bookmarkEnd w:id="116"/>
-    <w:bookmarkStart w:id="118" w:name="ref-Lee2025"/>
+    <w:bookmarkEnd w:id="126"/>
+    <w:bookmarkStart w:id="128" w:name="ref-Lee2025"/>
     <w:p>
       <w:pPr>
         <w:pStyle w:val="Bibliography"/>
@@ -4200,7 +5297,7 @@
       <w:r>
         <w:t xml:space="preserve"> </w:t>
       </w:r>
-      <w:hyperlink r:id="rId117">
+      <w:hyperlink r:id="rId127">
         <w:r>
           <w:rPr>
             <w:rStyle w:val="Hyperlink"/>
@@ -4209,8 +5306,8 @@
         </w:r>
       </w:hyperlink>
     </w:p>
-    <w:bookmarkEnd w:id="118"/>
-    <w:bookmarkStart w:id="120" w:name="ref-Lenth2026"/>
+    <w:bookmarkEnd w:id="128"/>
+    <w:bookmarkStart w:id="130" w:name="ref-Lenth2026"/>
     <w:p>
       <w:pPr>
         <w:pStyle w:val="Bibliography"/>
@@ -4221,17 +5318,23 @@
       <w:r>
         <w:t xml:space="preserve"> </w:t>
       </w:r>
-      <w:hyperlink r:id="rId119">
-        <w:r>
-          <w:rPr>
-            <w:rStyle w:val="Hyperlink"/>
-          </w:rPr>
-          <w:t xml:space="preserve">Emmeans: Estimated marginal means, aka least-squares means</w:t>
+      <w:hyperlink r:id="rId129">
+        <w:r>
+          <w:rPr>
+            <w:rStyle w:val="Hyperlink"/>
+          </w:rPr>
+          <w:t xml:space="preserve">emmeans</w:t>
+        </w:r>
+        <w:r>
+          <w:rPr>
+            <w:rStyle w:val="Hyperlink"/>
+          </w:rPr>
+          <w:t xml:space="preserve">: Estimated marginal means, aka least-squares means</w:t>
         </w:r>
       </w:hyperlink>
     </w:p>
-    <w:bookmarkEnd w:id="120"/>
-    <w:bookmarkStart w:id="122" w:name="ref-Lima1990"/>
+    <w:bookmarkEnd w:id="130"/>
+    <w:bookmarkStart w:id="132" w:name="ref-Lima1990"/>
     <w:p>
       <w:pPr>
         <w:pStyle w:val="Bibliography"/>
@@ -4242,7 +5345,7 @@
       <w:r>
         <w:t xml:space="preserve"> </w:t>
       </w:r>
-      <w:hyperlink r:id="rId121">
+      <w:hyperlink r:id="rId131">
         <w:r>
           <w:rPr>
             <w:rStyle w:val="Hyperlink"/>
@@ -4251,19 +5354,28 @@
         </w:r>
       </w:hyperlink>
     </w:p>
-    <w:bookmarkEnd w:id="122"/>
-    <w:bookmarkStart w:id="124" w:name="ref-MacNeil2025"/>
+    <w:bookmarkEnd w:id="132"/>
+    <w:bookmarkStart w:id="134" w:name="ref-MacNeil2025"/>
     <w:p>
       <w:pPr>
         <w:pStyle w:val="Bibliography"/>
       </w:pPr>
       <w:r>
-        <w:t xml:space="preserve">MacNeil C, Lee F, Kusabs I, Holmes R (2025) The biter bit; scavenging behaviour of native freshwater crayfish on the carrion of native and introduced fish predators in aotearoa-new zealand. Knowledge &amp; Management of Aquatic Ecosystems 29.</w:t>
-      </w:r>
-      <w:r>
-        <w:t xml:space="preserve"> </w:t>
-      </w:r>
-      <w:hyperlink r:id="rId123">
+        <w:t xml:space="preserve">MacNeil C, Lee F, Kusabs I, Holmes R (2025) The biter bit; scavenging behaviour of native freshwater crayfish on the carrion of native and introduced fish predators in</w:t>
+      </w:r>
+      <w:r>
+        <w:t xml:space="preserve"> </w:t>
+      </w:r>
+      <w:r>
+        <w:t xml:space="preserve">Aotearoa-New Zealand</w:t>
+      </w:r>
+      <w:r>
+        <w:t xml:space="preserve">. Knowledge &amp;amp; Management of Aquatic Ecosystems 29.</w:t>
+      </w:r>
+      <w:r>
+        <w:t xml:space="preserve"> </w:t>
+      </w:r>
+      <w:hyperlink r:id="rId133">
         <w:r>
           <w:rPr>
             <w:rStyle w:val="Hyperlink"/>
@@ -4272,8 +5384,8 @@
         </w:r>
       </w:hyperlink>
     </w:p>
-    <w:bookmarkEnd w:id="124"/>
-    <w:bookmarkStart w:id="126" w:name="ref-Martin2014"/>
+    <w:bookmarkEnd w:id="134"/>
+    <w:bookmarkStart w:id="136" w:name="ref-Martin2014"/>
     <w:p>
       <w:pPr>
         <w:pStyle w:val="Bibliography"/>
@@ -4284,7 +5396,7 @@
       <w:r>
         <w:t xml:space="preserve"> </w:t>
       </w:r>
-      <w:hyperlink r:id="rId125">
+      <w:hyperlink r:id="rId135">
         <w:r>
           <w:rPr>
             <w:rStyle w:val="Hyperlink"/>
@@ -4293,29 +5405,125 @@
         </w:r>
       </w:hyperlink>
     </w:p>
-    <w:bookmarkEnd w:id="126"/>
-    <w:bookmarkStart w:id="128" w:name="ref-McDowall1990"/>
+    <w:bookmarkEnd w:id="136"/>
+    <w:bookmarkStart w:id="138" w:name="ref-Martin2007"/>
     <w:p>
       <w:pPr>
         <w:pStyle w:val="Bibliography"/>
       </w:pPr>
       <w:r>
+        <w:t xml:space="preserve">Martin M, Boubée J, Kusabs I (2007)</w:t>
+      </w:r>
+      <w:r>
+        <w:t xml:space="preserve"> </w:t>
+      </w:r>
+      <w:hyperlink r:id="rId137">
+        <w:r>
+          <w:rPr>
+            <w:rStyle w:val="Hyperlink"/>
+          </w:rPr>
+          <w:t xml:space="preserve">Taonga and mahinga kai of the</w:t>
+        </w:r>
+        <w:r>
+          <w:rPr>
+            <w:rStyle w:val="Hyperlink"/>
+          </w:rPr>
+          <w:t xml:space="preserve"> </w:t>
+        </w:r>
+        <w:r>
+          <w:rPr>
+            <w:rStyle w:val="Hyperlink"/>
+          </w:rPr>
+          <w:t xml:space="preserve">Te Arawa</w:t>
+        </w:r>
+        <w:r>
+          <w:rPr>
+            <w:rStyle w:val="Hyperlink"/>
+          </w:rPr>
+          <w:t xml:space="preserve"> </w:t>
+        </w:r>
+        <w:r>
+          <w:rPr>
+            <w:rStyle w:val="Hyperlink"/>
+          </w:rPr>
+          <w:t xml:space="preserve">lakes: A review of current knowledge - tuna</w:t>
+        </w:r>
+      </w:hyperlink>
+      <w:r>
+        <w:t xml:space="preserve">.</w:t>
+      </w:r>
+      <w:r>
+        <w:t xml:space="preserve"> </w:t>
+      </w:r>
+      <w:r>
+        <w:t xml:space="preserve">National Institute of Water</w:t>
+      </w:r>
+      <w:r>
+        <w:t xml:space="preserve"> </w:t>
+      </w:r>
+      <w:r>
+        <w:t xml:space="preserve">&amp;</w:t>
+      </w:r>
+      <w:r>
+        <w:t xml:space="preserve"> </w:t>
+      </w:r>
+      <w:r>
+        <w:t xml:space="preserve">Atmospheric Research Ltd</w:t>
+      </w:r>
+      <w:r>
+        <w:t xml:space="preserve">,</w:t>
+      </w:r>
+      <w:r>
+        <w:t xml:space="preserve"> </w:t>
+      </w:r>
+      <w:r>
+        <w:t xml:space="preserve">Hamilton</w:t>
+      </w:r>
+      <w:r>
+        <w:t xml:space="preserve">,</w:t>
+      </w:r>
+      <w:r>
+        <w:t xml:space="preserve"> </w:t>
+      </w:r>
+      <w:r>
+        <w:t xml:space="preserve">New Zealand</w:t>
+      </w:r>
+    </w:p>
+    <w:bookmarkEnd w:id="138"/>
+    <w:bookmarkStart w:id="140" w:name="ref-McDowall1990"/>
+    <w:p>
+      <w:pPr>
+        <w:pStyle w:val="Bibliography"/>
+      </w:pPr>
+      <w:r>
         <w:t xml:space="preserve">McDowall RM (1990)</w:t>
       </w:r>
       <w:r>
         <w:t xml:space="preserve"> </w:t>
       </w:r>
-      <w:hyperlink r:id="rId127">
-        <w:r>
-          <w:rPr>
-            <w:rStyle w:val="Hyperlink"/>
-          </w:rPr>
-          <w:t xml:space="preserve">New zealand freshwater fishes: A natural history and guide</w:t>
+      <w:hyperlink r:id="rId139">
+        <w:r>
+          <w:rPr>
+            <w:rStyle w:val="Hyperlink"/>
+          </w:rPr>
+          <w:t xml:space="preserve">New Zealand</w:t>
+        </w:r>
+        <w:r>
+          <w:rPr>
+            <w:rStyle w:val="Hyperlink"/>
+          </w:rPr>
+          <w:t xml:space="preserve"> </w:t>
+        </w:r>
+        <w:r>
+          <w:rPr>
+            <w:rStyle w:val="Hyperlink"/>
+          </w:rPr>
+          <w:t xml:space="preserve">freshwater fishes: A natural history and guide</w:t>
         </w:r>
       </w:hyperlink>
     </w:p>
-    <w:bookmarkEnd w:id="128"/>
-    <w:bookmarkStart w:id="130" w:name="ref-Nystrom2005"/>
+    <w:bookmarkEnd w:id="140"/>
+    <w:bookmarkStart w:id="142" w:name="ref-Nystrom2005"/>
     <w:p>
       <w:pPr>
         <w:pStyle w:val="Bibliography"/>
@@ -4326,7 +5534,7 @@
       <w:r>
         <w:t xml:space="preserve"> </w:t>
       </w:r>
-      <w:hyperlink r:id="rId129">
+      <w:hyperlink r:id="rId141">
         <w:r>
           <w:rPr>
             <w:rStyle w:val="Hyperlink"/>
@@ -4335,19 +5543,31 @@
         </w:r>
       </w:hyperlink>
     </w:p>
-    <w:bookmarkEnd w:id="130"/>
-    <w:bookmarkStart w:id="132" w:name="ref-Parkyn2001"/>
+    <w:bookmarkEnd w:id="142"/>
+    <w:bookmarkStart w:id="144" w:name="ref-Parkyn2001"/>
     <w:p>
       <w:pPr>
         <w:pStyle w:val="Bibliography"/>
       </w:pPr>
       <w:r>
-        <w:t xml:space="preserve">Parkyn SM, Collier KJ, Hicks BJ (2001) New zealand stream crayfish: Functional omnivores but trophic predators? Freshwater Biology 46:641–652.</w:t>
-      </w:r>
-      <w:r>
-        <w:t xml:space="preserve"> </w:t>
-      </w:r>
-      <w:hyperlink r:id="rId131">
+        <w:t xml:space="preserve">Parkyn SM, Collier KJ, Hicks BJ (2001)</w:t>
+      </w:r>
+      <w:r>
+        <w:t xml:space="preserve"> </w:t>
+      </w:r>
+      <w:r>
+        <w:t xml:space="preserve">New Zealand</w:t>
+      </w:r>
+      <w:r>
+        <w:t xml:space="preserve"> </w:t>
+      </w:r>
+      <w:r>
+        <w:t xml:space="preserve">stream crayfish: Functional omnivores but trophic predators? Freshwater Biology 46:641–652.</w:t>
+      </w:r>
+      <w:r>
+        <w:t xml:space="preserve"> </w:t>
+      </w:r>
+      <w:hyperlink r:id="rId143">
         <w:r>
           <w:rPr>
             <w:rStyle w:val="Hyperlink"/>
@@ -4356,8 +5576,8 @@
         </w:r>
       </w:hyperlink>
     </w:p>
-    <w:bookmarkEnd w:id="132"/>
-    <w:bookmarkStart w:id="134" w:name="ref-Peacor2001"/>
+    <w:bookmarkEnd w:id="144"/>
+    <w:bookmarkStart w:id="146" w:name="ref-Peacor2001"/>
     <w:p>
       <w:pPr>
         <w:pStyle w:val="Bibliography"/>
@@ -4368,7 +5588,7 @@
       <w:r>
         <w:t xml:space="preserve"> </w:t>
       </w:r>
-      <w:hyperlink r:id="rId133">
+      <w:hyperlink r:id="rId145">
         <w:r>
           <w:rPr>
             <w:rStyle w:val="Hyperlink"/>
@@ -4377,428 +5597,520 @@
         </w:r>
       </w:hyperlink>
     </w:p>
-    <w:bookmarkEnd w:id="134"/>
-    <w:bookmarkStart w:id="136" w:name="ref-Preisser2008"/>
+    <w:bookmarkEnd w:id="146"/>
+    <w:bookmarkStart w:id="148" w:name="ref-Preisser2005"/>
     <w:p>
       <w:pPr>
         <w:pStyle w:val="Bibliography"/>
       </w:pPr>
       <w:r>
-        <w:t xml:space="preserve">Preisser EL, Bolnick DI (2008) The many faces of fear: Comparing the pathways and impacts of nonconsumptive predator effects on prey populations. PLoS ONE 3:e2465.</w:t>
-      </w:r>
-      <w:r>
-        <w:t xml:space="preserve"> </w:t>
-      </w:r>
-      <w:hyperlink r:id="rId135">
-        <w:r>
-          <w:rPr>
-            <w:rStyle w:val="Hyperlink"/>
-          </w:rPr>
-          <w:t xml:space="preserve">https://doi.org/10.1371/journal.pone.0002465</w:t>
+        <w:t xml:space="preserve">Preisser EL, Bolnick DI, Benard MF (2005) Scared to death? The effects of intimidation and consumption in predator-prey interactions. Ecology 86:501–509.</w:t>
+      </w:r>
+      <w:r>
+        <w:t xml:space="preserve"> </w:t>
+      </w:r>
+      <w:hyperlink r:id="rId147">
+        <w:r>
+          <w:rPr>
+            <w:rStyle w:val="Hyperlink"/>
+          </w:rPr>
+          <w:t xml:space="preserve">https://doi.org/10.1890/04-0719</w:t>
         </w:r>
       </w:hyperlink>
     </w:p>
-    <w:bookmarkEnd w:id="136"/>
-    <w:bookmarkStart w:id="138" w:name="ref-Preisser2005"/>
+    <w:bookmarkEnd w:id="148"/>
+    <w:bookmarkStart w:id="150" w:name="ref-RCoreTeam2025"/>
     <w:p>
       <w:pPr>
         <w:pStyle w:val="Bibliography"/>
       </w:pPr>
       <w:r>
-        <w:t xml:space="preserve">Preisser EL, Bolnick DI, Benard MF (2005) Scared to death? The effects of intimidation and consumption in predator–prey interactions. Ecology 86:501–509.</w:t>
-      </w:r>
-      <w:r>
-        <w:t xml:space="preserve"> </w:t>
-      </w:r>
-      <w:hyperlink r:id="rId137">
-        <w:r>
-          <w:rPr>
-            <w:rStyle w:val="Hyperlink"/>
-          </w:rPr>
-          <w:t xml:space="preserve">https://doi.org/10.1890/04-0719</w:t>
+        <w:t xml:space="preserve">R Core Team (2025)</w:t>
+      </w:r>
+      <w:r>
+        <w:t xml:space="preserve"> </w:t>
+      </w:r>
+      <w:hyperlink r:id="rId149">
+        <w:r>
+          <w:rPr>
+            <w:rStyle w:val="Hyperlink"/>
+          </w:rPr>
+          <w:t xml:space="preserve">R: A language and environment for statistical computing</w:t>
         </w:r>
       </w:hyperlink>
     </w:p>
-    <w:bookmarkEnd w:id="138"/>
-    <w:bookmarkStart w:id="140" w:name="ref-RCoreTeam2025"/>
+    <w:bookmarkEnd w:id="150"/>
+    <w:bookmarkStart w:id="152" w:name="ref-RambergPihl2020"/>
     <w:p>
       <w:pPr>
         <w:pStyle w:val="Bibliography"/>
       </w:pPr>
       <w:r>
-        <w:t xml:space="preserve">R Core Team (2025)</w:t>
-      </w:r>
-      <w:r>
-        <w:t xml:space="preserve"> </w:t>
-      </w:r>
-      <w:hyperlink r:id="rId139">
-        <w:r>
-          <w:rPr>
-            <w:rStyle w:val="Hyperlink"/>
-          </w:rPr>
-          <w:t xml:space="preserve">R: A language and environment for statistical computing</w:t>
+        <w:t xml:space="preserve">Ramberg-Pihl NC, Yurewicz KL (2020) Behavioral responses of northern crayfish (</w:t>
+      </w:r>
+      <w:r>
+        <w:rPr>
+          <w:i/>
+          <w:iCs/>
+        </w:rPr>
+        <w:t xml:space="preserve">Faxonius virilis</w:t>
+      </w:r>
+      <w:r>
+        <w:t xml:space="preserve">) to conspecific alarm cues and predator cues from smallmouth bass (</w:t>
+      </w:r>
+      <w:r>
+        <w:rPr>
+          <w:i/>
+          <w:iCs/>
+        </w:rPr>
+        <w:t xml:space="preserve">Micropterus dolomieu</w:t>
+      </w:r>
+      <w:r>
+        <w:t xml:space="preserve">). Marine and Freshwater Behaviour and Physiology 53:1–16.</w:t>
+      </w:r>
+      <w:r>
+        <w:t xml:space="preserve"> </w:t>
+      </w:r>
+      <w:hyperlink r:id="rId151">
+        <w:r>
+          <w:rPr>
+            <w:rStyle w:val="Hyperlink"/>
+          </w:rPr>
+          <w:t xml:space="preserve">https://doi.org/10.1080/10236244.2020.1717338</w:t>
         </w:r>
       </w:hyperlink>
     </w:p>
-    <w:bookmarkEnd w:id="140"/>
-    <w:bookmarkStart w:id="142" w:name="ref-RambergPihl2020"/>
+    <w:bookmarkEnd w:id="152"/>
+    <w:bookmarkStart w:id="154" w:name="ref-Ryan2009"/>
     <w:p>
       <w:pPr>
         <w:pStyle w:val="Bibliography"/>
       </w:pPr>
       <w:r>
-        <w:t xml:space="preserve">Ramberg-Pihl NC, Yurewicz KL (2020) Behavioral responses of northern crayfish (faxonius virilis) to conspecific alarm cues and predator cues from smallmouth bass (micropterus dolomieu). Marine and Freshwater Behaviour and Physiology 53:1–16.</w:t>
-      </w:r>
-      <w:r>
-        <w:t xml:space="preserve"> </w:t>
-      </w:r>
-      <w:hyperlink r:id="rId141">
-        <w:r>
-          <w:rPr>
-            <w:rStyle w:val="Hyperlink"/>
-          </w:rPr>
-          <w:t xml:space="preserve">https://doi.org/10.1080/10236244.2020.1717338</w:t>
+        <w:t xml:space="preserve">Ryan P (2009)</w:t>
+      </w:r>
+      <w:r>
+        <w:t xml:space="preserve"> </w:t>
+      </w:r>
+      <w:hyperlink r:id="rId153">
+        <w:r>
+          <w:rPr>
+            <w:rStyle w:val="Hyperlink"/>
+          </w:rPr>
+          <w:t xml:space="preserve">Eels |</w:t>
+        </w:r>
+        <w:r>
+          <w:rPr>
+            <w:rStyle w:val="Hyperlink"/>
+          </w:rPr>
+          <w:t xml:space="preserve"> </w:t>
+        </w:r>
+        <w:r>
+          <w:rPr>
+            <w:rStyle w:val="Hyperlink"/>
+          </w:rPr>
+          <w:t xml:space="preserve">Te Ara Encyclopedia of New Zealand</w:t>
         </w:r>
       </w:hyperlink>
     </w:p>
-    <w:bookmarkEnd w:id="142"/>
-    <w:bookmarkStart w:id="144" w:name="ref-Ryan2009"/>
+    <w:bookmarkEnd w:id="154"/>
+    <w:bookmarkStart w:id="156" w:name="ref-Schmitz1997"/>
     <w:p>
       <w:pPr>
         <w:pStyle w:val="Bibliography"/>
       </w:pPr>
       <w:r>
-        <w:t xml:space="preserve">Ryan P (2009)</w:t>
-      </w:r>
-      <w:r>
-        <w:t xml:space="preserve"> </w:t>
-      </w:r>
-      <w:hyperlink r:id="rId143">
-        <w:r>
-          <w:rPr>
-            <w:rStyle w:val="Hyperlink"/>
-          </w:rPr>
-          <w:t xml:space="preserve">Eels | te ara encyclopedia of new zealand</w:t>
+        <w:t xml:space="preserve">Schmitz OJ, Beckerman AP, O’Brien KM (1997) Behaviorally mediated trophic cascades: Effects of predation risk on food web interactions. Ecology 78:1388–1399.</w:t>
+      </w:r>
+      <w:r>
+        <w:t xml:space="preserve"> </w:t>
+      </w:r>
+      <w:hyperlink r:id="rId155">
+        <w:r>
+          <w:rPr>
+            <w:rStyle w:val="Hyperlink"/>
+          </w:rPr>
+          <w:t xml:space="preserve">https://doi.org/10.1890/0012-9658(1997)078[1388:bmtceo]2.0.co;2</w:t>
         </w:r>
       </w:hyperlink>
     </w:p>
-    <w:bookmarkEnd w:id="144"/>
-    <w:bookmarkStart w:id="146" w:name="ref-Schmitz1997"/>
+    <w:bookmarkEnd w:id="156"/>
+    <w:bookmarkStart w:id="157" w:name="ref-Scott1973"/>
     <w:p>
       <w:pPr>
         <w:pStyle w:val="Bibliography"/>
       </w:pPr>
       <w:r>
-        <w:t xml:space="preserve">Schmitz OJ, Beckerman AP, O’Brien KM (1997) Behaviorally mediated trophic cascades: Effects of predation risk on food web interactions. Ecology 78:1388–1399.</w:t>
-      </w:r>
-      <w:r>
-        <w:t xml:space="preserve"> </w:t>
-      </w:r>
-      <w:hyperlink r:id="rId145">
-        <w:r>
-          <w:rPr>
-            <w:rStyle w:val="Hyperlink"/>
-          </w:rPr>
-          <w:t xml:space="preserve">https://doi.org/10.1890/0012-9658(1997)078[1388:bmtceo]2.0.co;2</w:t>
+        <w:t xml:space="preserve">Scott WB, Crossman EJ (1973) Freshwater fishes of</w:t>
+      </w:r>
+      <w:r>
+        <w:t xml:space="preserve"> </w:t>
+      </w:r>
+      <w:r>
+        <w:t xml:space="preserve">Canada</w:t>
+      </w:r>
+      <w:r>
+        <w:t xml:space="preserve">. Fisheries Research Board of Canada</w:t>
+      </w:r>
+    </w:p>
+    <w:bookmarkEnd w:id="157"/>
+    <w:bookmarkStart w:id="158" w:name="ref-Shave1994"/>
+    <w:p>
+      <w:pPr>
+        <w:pStyle w:val="Bibliography"/>
+      </w:pPr>
+      <w:r>
+        <w:t xml:space="preserve">Shave CathyR, Townsend CR, Crowl TA (1994) Anti-predator behaviours of a freshwater crayfish (</w:t>
+      </w:r>
+      <w:r>
+        <w:rPr>
+          <w:i/>
+          <w:iCs/>
+        </w:rPr>
+        <w:t xml:space="preserve">Paranephrops zealandicus</w:t>
+      </w:r>
+      <w:r>
+        <w:t xml:space="preserve">) to a native and an introduced predator. New Zealand Journal of Ecology 18:1–10</w:t>
+      </w:r>
+    </w:p>
+    <w:bookmarkEnd w:id="158"/>
+    <w:bookmarkStart w:id="160" w:name="ref-Sheriff2020"/>
+    <w:p>
+      <w:pPr>
+        <w:pStyle w:val="Bibliography"/>
+      </w:pPr>
+      <w:r>
+        <w:t xml:space="preserve">Sheriff MJ, Peacor SD, Hawlena D, Thaker M (2020) Non-consumptive predator effects on prey population size: A dearth of evidence. Journal of Animal Ecology 89:1302–1316.</w:t>
+      </w:r>
+      <w:r>
+        <w:t xml:space="preserve"> </w:t>
+      </w:r>
+      <w:hyperlink r:id="rId159">
+        <w:r>
+          <w:rPr>
+            <w:rStyle w:val="Hyperlink"/>
+          </w:rPr>
+          <w:t xml:space="preserve">https://doi.org/10.1111/1365-2656.13213</w:t>
         </w:r>
       </w:hyperlink>
     </w:p>
-    <w:bookmarkEnd w:id="146"/>
-    <w:bookmarkStart w:id="147" w:name="ref-Scott1973"/>
+    <w:bookmarkEnd w:id="160"/>
+    <w:bookmarkStart w:id="162" w:name="ref-Sih2010"/>
     <w:p>
       <w:pPr>
         <w:pStyle w:val="Bibliography"/>
       </w:pPr>
       <w:r>
-        <w:t xml:space="preserve">Scott WB, Crossman EJ (1973) Freshwater fishes of canada. Fisheries Research Board of Canada</w:t>
-      </w:r>
-    </w:p>
-    <w:bookmarkEnd w:id="147"/>
-    <w:bookmarkStart w:id="148" w:name="ref-Shave1994"/>
+        <w:t xml:space="preserve">Sih A, Bolnick DI, Luttbeg B, et al (2010) Predator-prey naïveté, antipredator behavior, and the ecology of predator invasions. Oikos 119:610–621.</w:t>
+      </w:r>
+      <w:r>
+        <w:t xml:space="preserve"> </w:t>
+      </w:r>
+      <w:hyperlink r:id="rId161">
+        <w:r>
+          <w:rPr>
+            <w:rStyle w:val="Hyperlink"/>
+          </w:rPr>
+          <w:t xml:space="preserve">https://doi.org/10.1111/j.1600-0706.2009.18039.x</w:t>
+        </w:r>
+      </w:hyperlink>
+    </w:p>
+    <w:bookmarkEnd w:id="162"/>
+    <w:bookmarkStart w:id="164" w:name="ref-Sih2023"/>
     <w:p>
       <w:pPr>
         <w:pStyle w:val="Bibliography"/>
       </w:pPr>
       <w:r>
-        <w:t xml:space="preserve">Shave CathyR, Townsend CR, Crowl TA (1994) Anti-predator behaviours of a freshwater crayfish (paranephrops zealandicus) to a native and an introduced predator. New Zealand Journal of Ecology 18:1–10</w:t>
-      </w:r>
-    </w:p>
-    <w:bookmarkEnd w:id="148"/>
-    <w:bookmarkStart w:id="150" w:name="ref-Sheriff2020"/>
+        <w:t xml:space="preserve">Sih A, Chung HJ, Neylan I, et al (2023) Fear generalization and behavioral responses to multiple dangers. Trends in Ecology &amp; Evolution 38:369–380.</w:t>
+      </w:r>
+      <w:r>
+        <w:t xml:space="preserve"> </w:t>
+      </w:r>
+      <w:hyperlink r:id="rId163">
+        <w:r>
+          <w:rPr>
+            <w:rStyle w:val="Hyperlink"/>
+          </w:rPr>
+          <w:t xml:space="preserve">https://doi.org/10.1016/j.tree.2022.11.001</w:t>
+        </w:r>
+      </w:hyperlink>
+    </w:p>
+    <w:bookmarkEnd w:id="164"/>
+    <w:bookmarkStart w:id="166" w:name="ref-Sih2011"/>
     <w:p>
       <w:pPr>
         <w:pStyle w:val="Bibliography"/>
       </w:pPr>
       <w:r>
-        <w:t xml:space="preserve">Sheriff MJ, Peacor SD, Hawlena D, Thaker M (2020) Non-consumptive predator effects on prey population size: A dearth of evidence. Journal of Animal Ecology 89:1302–1316.</w:t>
-      </w:r>
-      <w:r>
-        <w:t xml:space="preserve"> </w:t>
-      </w:r>
-      <w:hyperlink r:id="rId149">
-        <w:r>
-          <w:rPr>
-            <w:rStyle w:val="Hyperlink"/>
-          </w:rPr>
-          <w:t xml:space="preserve">https://doi.org/10.1111/1365-2656.13213</w:t>
+        <w:t xml:space="preserve">Sih A, Ferrari MCO, Harris DJ (2011) Evolution and behavioural responses to human‐induced rapid environmental change. Evolutionary Applications 4:367–387.</w:t>
+      </w:r>
+      <w:r>
+        <w:t xml:space="preserve"> </w:t>
+      </w:r>
+      <w:hyperlink r:id="rId165">
+        <w:r>
+          <w:rPr>
+            <w:rStyle w:val="Hyperlink"/>
+          </w:rPr>
+          <w:t xml:space="preserve">https://doi.org/10.1111/j.1752-4571.2010.00166.x</w:t>
         </w:r>
       </w:hyperlink>
     </w:p>
-    <w:bookmarkEnd w:id="150"/>
-    <w:bookmarkStart w:id="152" w:name="ref-Sih2010"/>
+    <w:bookmarkEnd w:id="166"/>
+    <w:bookmarkStart w:id="168" w:name="ref-Smee2006"/>
     <w:p>
       <w:pPr>
         <w:pStyle w:val="Bibliography"/>
       </w:pPr>
       <w:r>
-        <w:t xml:space="preserve">Sih A, Bolnick DI, Luttbeg B, et al (2010) Predator–prey naïveté, antipredator behavior, and the ecology of predator invasions. Oikos 119:610–621.</w:t>
-      </w:r>
-      <w:r>
-        <w:t xml:space="preserve"> </w:t>
-      </w:r>
-      <w:hyperlink r:id="rId151">
-        <w:r>
-          <w:rPr>
-            <w:rStyle w:val="Hyperlink"/>
-          </w:rPr>
-          <w:t xml:space="preserve">https://doi.org/10.1111/j.1600-0706.2009.18039.x</w:t>
+        <w:t xml:space="preserve">Smee DL, Weissburg MJ (2006) Hard clams (</w:t>
+      </w:r>
+      <w:r>
+        <w:rPr>
+          <w:i/>
+          <w:iCs/>
+        </w:rPr>
+        <w:t xml:space="preserve">Mercenaria mercenaria</w:t>
+      </w:r>
+      <w:r>
+        <w:t xml:space="preserve">) evaluate predation risk using chemical signals from predators and injured conspecifics. Journal of Chemical Ecology 32:605–619.</w:t>
+      </w:r>
+      <w:r>
+        <w:t xml:space="preserve"> </w:t>
+      </w:r>
+      <w:hyperlink r:id="rId167">
+        <w:r>
+          <w:rPr>
+            <w:rStyle w:val="Hyperlink"/>
+          </w:rPr>
+          <w:t xml:space="preserve">https://doi.org/10.1007/s10886-005-9021-8</w:t>
         </w:r>
       </w:hyperlink>
     </w:p>
-    <w:bookmarkEnd w:id="152"/>
-    <w:bookmarkStart w:id="154" w:name="ref-Sih2023"/>
+    <w:bookmarkEnd w:id="168"/>
+    <w:bookmarkStart w:id="170" w:name="ref-Sniegula2025"/>
     <w:p>
       <w:pPr>
         <w:pStyle w:val="Bibliography"/>
       </w:pPr>
       <w:r>
-        <w:t xml:space="preserve">Sih A, Chung HJ, Neylan I, et al (2023) Fear generalization and behavioral responses to multiple dangers. Trends in Ecology &amp; Evolution 38:369–380.</w:t>
-      </w:r>
-      <w:r>
-        <w:t xml:space="preserve"> </w:t>
-      </w:r>
-      <w:hyperlink r:id="rId153">
-        <w:r>
-          <w:rPr>
-            <w:rStyle w:val="Hyperlink"/>
-          </w:rPr>
-          <w:t xml:space="preserve">https://doi.org/10.1016/j.tree.2022.11.001</w:t>
+        <w:t xml:space="preserve">Sniegula S, Konczarek D, Bonk M, et al (2025) Non-consumptive effects of native, alien and invasive alien crayfish on damselfly egg life history and carry-over effects on larval physiology. NeoBiota 97:215–235.</w:t>
+      </w:r>
+      <w:r>
+        <w:t xml:space="preserve"> </w:t>
+      </w:r>
+      <w:hyperlink r:id="rId169">
+        <w:r>
+          <w:rPr>
+            <w:rStyle w:val="Hyperlink"/>
+          </w:rPr>
+          <w:t xml:space="preserve">https://doi.org/10.3897/neobiota.97.139760</w:t>
         </w:r>
       </w:hyperlink>
     </w:p>
-    <w:bookmarkEnd w:id="154"/>
-    <w:bookmarkStart w:id="156" w:name="ref-Sih2011"/>
+    <w:bookmarkEnd w:id="170"/>
+    <w:bookmarkStart w:id="172" w:name="ref-Stebbing2010"/>
     <w:p>
       <w:pPr>
         <w:pStyle w:val="Bibliography"/>
       </w:pPr>
       <w:r>
-        <w:t xml:space="preserve">Sih A, Ferrari MCO, Harris DJ (2011) Evolution and behavioural responses to human‐induced rapid environmental change. Evolutionary Applications 4:367–387.</w:t>
-      </w:r>
-      <w:r>
-        <w:t xml:space="preserve"> </w:t>
-      </w:r>
-      <w:hyperlink r:id="rId155">
-        <w:r>
-          <w:rPr>
-            <w:rStyle w:val="Hyperlink"/>
-          </w:rPr>
-          <w:t xml:space="preserve">https://doi.org/10.1111/j.1752-4571.2010.00166.x</w:t>
+        <w:t xml:space="preserve">Stebbing PD, Watson GJ, Bentley MG (2010) The response to disturbance chemicals and predator odours of juvenile and adult signal crayfish</w:t>
+      </w:r>
+      <w:r>
+        <w:t xml:space="preserve"> </w:t>
+      </w:r>
+      <w:r>
+        <w:rPr>
+          <w:i/>
+          <w:iCs/>
+        </w:rPr>
+        <w:t xml:space="preserve">Pacifastacus leniusculus</w:t>
+      </w:r>
+      <w:r>
+        <w:t xml:space="preserve"> </w:t>
+      </w:r>
+      <w:r>
+        <w:t xml:space="preserve">(</w:t>
+      </w:r>
+      <w:r>
+        <w:t xml:space="preserve">Dana</w:t>
+      </w:r>
+      <w:r>
+        <w:t xml:space="preserve">). Marine and Freshwater Behaviour and Physiology 43:183–195.</w:t>
+      </w:r>
+      <w:r>
+        <w:t xml:space="preserve"> </w:t>
+      </w:r>
+      <w:hyperlink r:id="rId171">
+        <w:r>
+          <w:rPr>
+            <w:rStyle w:val="Hyperlink"/>
+          </w:rPr>
+          <w:t xml:space="preserve">https://doi.org/10.1080/10236244.2010.487301</w:t>
         </w:r>
       </w:hyperlink>
     </w:p>
-    <w:bookmarkEnd w:id="156"/>
-    <w:bookmarkStart w:id="158" w:name="ref-Smee2006"/>
+    <w:bookmarkEnd w:id="172"/>
+    <w:bookmarkStart w:id="174" w:name="ref-Stein1976"/>
     <w:p>
       <w:pPr>
         <w:pStyle w:val="Bibliography"/>
       </w:pPr>
       <w:r>
-        <w:t xml:space="preserve">Smee DL, Weissburg MJ (2006) Hard clams (mercenaria mercenaria) evaluate predation risk using chemical signals from predators and injured conspecifics. Journal of Chemical Ecology 32:605–619.</w:t>
-      </w:r>
-      <w:r>
-        <w:t xml:space="preserve"> </w:t>
-      </w:r>
-      <w:hyperlink r:id="rId157">
-        <w:r>
-          <w:rPr>
-            <w:rStyle w:val="Hyperlink"/>
-          </w:rPr>
-          <w:t xml:space="preserve">https://doi.org/10.1007/s10886-005-9021-8</w:t>
+        <w:t xml:space="preserve">Stein RA, Magnuson JJ (1976) Behavioral response of crayfish to a fish predator. Ecology 57:751–761.</w:t>
+      </w:r>
+      <w:r>
+        <w:t xml:space="preserve"> </w:t>
+      </w:r>
+      <w:hyperlink r:id="rId173">
+        <w:r>
+          <w:rPr>
+            <w:rStyle w:val="Hyperlink"/>
+          </w:rPr>
+          <w:t xml:space="preserve">https://doi.org/10.2307/1936188</w:t>
         </w:r>
       </w:hyperlink>
     </w:p>
-    <w:bookmarkEnd w:id="158"/>
-    <w:bookmarkStart w:id="160" w:name="ref-Sniegula2025"/>
+    <w:bookmarkEnd w:id="174"/>
+    <w:bookmarkStart w:id="176" w:name="ref-Usio2004"/>
     <w:p>
       <w:pPr>
         <w:pStyle w:val="Bibliography"/>
       </w:pPr>
       <w:r>
-        <w:t xml:space="preserve">Sniegula S, Konczarek D, Bonk M, et al (2025) Non-consumptive effects of native, alien and invasive alien crayfish on damselfly egg life history and carry-over effects on larval physiology. NeoBiota 97:215–235.</w:t>
-      </w:r>
-      <w:r>
-        <w:t xml:space="preserve"> </w:t>
-      </w:r>
-      <w:hyperlink r:id="rId159">
-        <w:r>
-          <w:rPr>
-            <w:rStyle w:val="Hyperlink"/>
-          </w:rPr>
-          <w:t xml:space="preserve">https://doi.org/10.3897/neobiota.97.139760</w:t>
+        <w:t xml:space="preserve">Usio N, Townsend CR (2004) Roles of crayfish: Consequences of predation and bioturbation for stream invertebrates. Ecology 85:807–822.</w:t>
+      </w:r>
+      <w:r>
+        <w:t xml:space="preserve"> </w:t>
+      </w:r>
+      <w:hyperlink r:id="rId175">
+        <w:r>
+          <w:rPr>
+            <w:rStyle w:val="Hyperlink"/>
+          </w:rPr>
+          <w:t xml:space="preserve">https://doi.org/10.1890/02-0618</w:t>
         </w:r>
       </w:hyperlink>
     </w:p>
-    <w:bookmarkEnd w:id="160"/>
-    <w:bookmarkStart w:id="162" w:name="ref-Stebbing2010"/>
+    <w:bookmarkEnd w:id="176"/>
+    <w:bookmarkStart w:id="178" w:name="ref-Wood2020a"/>
     <w:p>
       <w:pPr>
         <w:pStyle w:val="Bibliography"/>
       </w:pPr>
       <w:r>
-        <w:t xml:space="preserve">Stebbing PD, Watson GJ, Bentley MG (2010) The response to disturbance chemicals and predator odours of juvenile and adult signal crayfish pacifastacus leniusculus (dana). Marine and Freshwater Behaviour and Physiology 43:183–195.</w:t>
-      </w:r>
-      <w:r>
-        <w:t xml:space="preserve"> </w:t>
-      </w:r>
-      <w:hyperlink r:id="rId161">
-        <w:r>
-          <w:rPr>
-            <w:rStyle w:val="Hyperlink"/>
-          </w:rPr>
-          <w:t xml:space="preserve">https://doi.org/10.1080/10236244.2010.487301</w:t>
+        <w:t xml:space="preserve">Wood TC, Moore PA (2020b) Big and bad: How relative predator size and dietary information influence rusty crayfish (</w:t>
+      </w:r>
+      <w:r>
+        <w:rPr>
+          <w:i/>
+          <w:iCs/>
+        </w:rPr>
+        <w:t xml:space="preserve">Faxonius rusticus</w:t>
+      </w:r>
+      <w:r>
+        <w:t xml:space="preserve">) behavior and resource-use decisions. Canadian Journal of Zoology 98:62–72.</w:t>
+      </w:r>
+      <w:r>
+        <w:t xml:space="preserve"> </w:t>
+      </w:r>
+      <w:hyperlink r:id="rId177">
+        <w:r>
+          <w:rPr>
+            <w:rStyle w:val="Hyperlink"/>
+          </w:rPr>
+          <w:t xml:space="preserve">https://doi.org/10.1139/cjz-2019-0089</w:t>
         </w:r>
       </w:hyperlink>
     </w:p>
-    <w:bookmarkEnd w:id="162"/>
-    <w:bookmarkStart w:id="164" w:name="ref-Stein1976"/>
+    <w:bookmarkEnd w:id="178"/>
+    <w:bookmarkStart w:id="180" w:name="ref-Wood2020b"/>
     <w:p>
       <w:pPr>
         <w:pStyle w:val="Bibliography"/>
       </w:pPr>
       <w:r>
-        <w:t xml:space="preserve">Stein RA, Magnuson JJ (1976) Behavioral response of crayfish to a fish predator. Ecology 57:751–761.</w:t>
-      </w:r>
-      <w:r>
-        <w:t xml:space="preserve"> </w:t>
-      </w:r>
-      <w:hyperlink r:id="rId163">
-        <w:r>
-          <w:rPr>
-            <w:rStyle w:val="Hyperlink"/>
-          </w:rPr>
-          <w:t xml:space="preserve">https://doi.org/10.2307/1936188</w:t>
+        <w:t xml:space="preserve">Wood TC, Moore PA (2020a) Fine-tuned responses to chemical landscapes: Crayfish use predator odors to assess threats based on relative size ratios. Ecosphere 11:e03188.</w:t>
+      </w:r>
+      <w:r>
+        <w:t xml:space="preserve"> </w:t>
+      </w:r>
+      <w:hyperlink r:id="rId179">
+        <w:r>
+          <w:rPr>
+            <w:rStyle w:val="Hyperlink"/>
+          </w:rPr>
+          <w:t xml:space="preserve">https://doi.org/10.1002/ecs2.3188</w:t>
         </w:r>
       </w:hyperlink>
     </w:p>
-    <w:bookmarkEnd w:id="164"/>
-    <w:bookmarkStart w:id="166" w:name="ref-Usio2004"/>
+    <w:bookmarkEnd w:id="180"/>
+    <w:bookmarkStart w:id="182" w:name="ref-Wright2010"/>
     <w:p>
       <w:pPr>
         <w:pStyle w:val="Bibliography"/>
       </w:pPr>
       <w:r>
-        <w:t xml:space="preserve">Usio N, Townsend CR (2004) Roles of crayfish: Consequences of predation and bioturbation for stream invertebrates. Ecology 85:807–822.</w:t>
-      </w:r>
-      <w:r>
-        <w:t xml:space="preserve"> </w:t>
-      </w:r>
-      <w:hyperlink r:id="rId165">
-        <w:r>
-          <w:rPr>
-            <w:rStyle w:val="Hyperlink"/>
-          </w:rPr>
-          <w:t xml:space="preserve">https://doi.org/10.1890/02-0618</w:t>
+        <w:t xml:space="preserve">Wright TF, Eberhard JR, Hobson EA, et al (2010) Behavioral flexibility and species invasions: The adaptive flexibility hypothesis. Ethology Ecology &amp; Evolution 22:393–404.</w:t>
+      </w:r>
+      <w:r>
+        <w:t xml:space="preserve"> </w:t>
+      </w:r>
+      <w:hyperlink r:id="rId181">
+        <w:r>
+          <w:rPr>
+            <w:rStyle w:val="Hyperlink"/>
+          </w:rPr>
+          <w:t xml:space="preserve">https://doi.org/10.1080/03949370.2010.505580</w:t>
         </w:r>
       </w:hyperlink>
     </w:p>
-    <w:bookmarkEnd w:id="166"/>
-    <w:bookmarkStart w:id="168" w:name="ref-Wood2020a"/>
+    <w:bookmarkEnd w:id="182"/>
+    <w:bookmarkStart w:id="184" w:name="ref-Zhao2024"/>
     <w:p>
       <w:pPr>
         <w:pStyle w:val="Bibliography"/>
       </w:pPr>
       <w:r>
-        <w:t xml:space="preserve">Wood TC, Moore PA (2020b) Big and bad: How relative predator size and dietary information influence rusty crayfish (faxonius rusticus) behavior and resource-use decisions. Canadian Journal of Zoology 98:62–72.</w:t>
-      </w:r>
-      <w:r>
-        <w:t xml:space="preserve"> </w:t>
-      </w:r>
-      <w:hyperlink r:id="rId167">
-        <w:r>
-          <w:rPr>
-            <w:rStyle w:val="Hyperlink"/>
-          </w:rPr>
-          <w:t xml:space="preserve">https://doi.org/10.1139/cjz-2019-0089</w:t>
+        <w:t xml:space="preserve">Zhao M, Feng G, Wang H, et al (2024) The influence of shelter type and coverage on crayfish (</w:t>
+      </w:r>
+      <w:r>
+        <w:rPr>
+          <w:i/>
+          <w:iCs/>
+        </w:rPr>
+        <w:t xml:space="preserve">Procambarus clarkii</w:t>
+      </w:r>
+      <w:r>
+        <w:t xml:space="preserve">) predation by catfish (</w:t>
+      </w:r>
+      <w:r>
+        <w:rPr>
+          <w:i/>
+          <w:iCs/>
+        </w:rPr>
+        <w:t xml:space="preserve">Silurus asotus</w:t>
+      </w:r>
+      <w:r>
+        <w:t xml:space="preserve">): A controlled environment study. Animals 14:1147.</w:t>
+      </w:r>
+      <w:r>
+        <w:t xml:space="preserve"> </w:t>
+      </w:r>
+      <w:hyperlink r:id="rId183">
+        <w:r>
+          <w:rPr>
+            <w:rStyle w:val="Hyperlink"/>
+          </w:rPr>
+          <w:t xml:space="preserve">https://doi.org/10.3390/ani14081147</w:t>
         </w:r>
       </w:hyperlink>
     </w:p>
-    <w:bookmarkEnd w:id="168"/>
-    <w:bookmarkStart w:id="170" w:name="ref-Wood2020b"/>
-    <w:p>
-      <w:pPr>
-        <w:pStyle w:val="Bibliography"/>
-      </w:pPr>
-      <w:r>
-        <w:t xml:space="preserve">Wood TC, Moore PA (2020a) Fine-tuned responses to chemical landscapes: Crayfish use predator odors to assess threats based on relative size ratios. Ecosphere 11:e03188.</w:t>
-      </w:r>
-      <w:r>
-        <w:t xml:space="preserve"> </w:t>
-      </w:r>
-      <w:hyperlink r:id="rId169">
-        <w:r>
-          <w:rPr>
-            <w:rStyle w:val="Hyperlink"/>
-          </w:rPr>
-          <w:t xml:space="preserve">https://doi.org/10.1002/ecs2.3188</w:t>
-        </w:r>
-      </w:hyperlink>
-    </w:p>
-    <w:bookmarkEnd w:id="170"/>
-    <w:bookmarkStart w:id="172" w:name="ref-Wright2010"/>
-    <w:p>
-      <w:pPr>
-        <w:pStyle w:val="Bibliography"/>
-      </w:pPr>
-      <w:r>
-        <w:t xml:space="preserve">Wright TF, Eberhard JR, Hobson EA, et al (2010) Behavioral flexibility and species invasions: The adaptive flexibility hypothesis. Ethology Ecology &amp; Evolution 22:393–404.</w:t>
-      </w:r>
-      <w:r>
-        <w:t xml:space="preserve"> </w:t>
-      </w:r>
-      <w:hyperlink r:id="rId171">
-        <w:r>
-          <w:rPr>
-            <w:rStyle w:val="Hyperlink"/>
-          </w:rPr>
-          <w:t xml:space="preserve">https://doi.org/10.1080/03949370.2010.505580</w:t>
-        </w:r>
-      </w:hyperlink>
-    </w:p>
-    <w:bookmarkEnd w:id="172"/>
-    <w:bookmarkStart w:id="174" w:name="ref-Zhao2024"/>
-    <w:p>
-      <w:pPr>
-        <w:pStyle w:val="Bibliography"/>
-      </w:pPr>
-      <w:r>
-        <w:t xml:space="preserve">Zhao M, Feng G, Wang H, et al (2024) The influence of shelter type and coverage on crayfish (procambarus clarkii) predation by catfish (silurus asotus): A controlled environment study. Animals 14:1147.</w:t>
-      </w:r>
-      <w:r>
-        <w:t xml:space="preserve"> </w:t>
-      </w:r>
-      <w:hyperlink r:id="rId173">
-        <w:r>
-          <w:rPr>
-            <w:rStyle w:val="Hyperlink"/>
-          </w:rPr>
-          <w:t xml:space="preserve">https://doi.org/10.3390/ani14081147</w:t>
-        </w:r>
-      </w:hyperlink>
-    </w:p>
-    <w:bookmarkEnd w:id="174"/>
-    <w:bookmarkEnd w:id="175"/>
-    <w:bookmarkEnd w:id="176"/>
+    <w:bookmarkEnd w:id="184"/>
+    <w:bookmarkEnd w:id="185"/>
+    <w:bookmarkEnd w:id="186"/>
     <w:sectPr>
       <w:footerReference r:id="rId7" w:type="default"/>
       <w:pgSz w:h="16838" w:w="11906"/>
@@ -5371,6 +6683,10 @@
   <w:style w:default="1" w:styleId="Normal" w:type="paragraph">
     <w:name w:val="Normal"/>
     <w:qFormat/>
+    <w:rsid w:val="00E2075A"/>
+    <w:pPr>
+      <w:spacing w:line="360" w:lineRule="auto"/>
+    </w:pPr>
     <w:rPr>
       <w:lang w:val="en-GB"/>
     </w:rPr>
@@ -5382,17 +6698,17 @@
     <w:link w:val="Heading1Char"/>
     <w:uiPriority w:val="9"/>
     <w:qFormat/>
-    <w:rsid w:val="000654DB"/>
+    <w:rsid w:val="00FB5FD4"/>
     <w:pPr>
       <w:keepNext/>
       <w:keepLines/>
-      <w:spacing w:after="80" w:before="360"/>
+      <w:spacing w:after="120" w:before="120" w:line="240" w:lineRule="auto"/>
       <w:outlineLvl w:val="0"/>
     </w:pPr>
     <w:rPr>
       <w:rFonts w:cstheme="majorBidi" w:eastAsiaTheme="majorEastAsia"/>
       <w:b/>
-      <w:sz w:val="32"/>
+      <w:sz w:val="28"/>
       <w:szCs w:val="40"/>
     </w:rPr>
   </w:style>
@@ -5404,11 +6720,11 @@
     <w:uiPriority w:val="9"/>
     <w:unhideWhenUsed/>
     <w:qFormat/>
-    <w:rsid w:val="000654DB"/>
+    <w:rsid w:val="00FB5FD4"/>
     <w:pPr>
       <w:keepNext/>
       <w:keepLines/>
-      <w:spacing w:after="80" w:before="160"/>
+      <w:spacing w:after="120" w:before="120" w:line="240" w:lineRule="auto"/>
       <w:outlineLvl w:val="1"/>
     </w:pPr>
     <w:rPr>
@@ -5605,11 +6921,11 @@
     <w:basedOn w:val="DefaultParagraphFont"/>
     <w:link w:val="Heading1"/>
     <w:uiPriority w:val="9"/>
-    <w:rsid w:val="000654DB"/>
+    <w:rsid w:val="00FB5FD4"/>
     <w:rPr>
       <w:rFonts w:cstheme="majorBidi" w:eastAsiaTheme="majorEastAsia"/>
       <w:b/>
-      <w:sz w:val="32"/>
+      <w:sz w:val="28"/>
       <w:szCs w:val="40"/>
       <w:lang w:val="en-GB"/>
     </w:rPr>
@@ -5619,7 +6935,7 @@
     <w:basedOn w:val="DefaultParagraphFont"/>
     <w:link w:val="Heading2"/>
     <w:uiPriority w:val="9"/>
-    <w:rsid w:val="000654DB"/>
+    <w:rsid w:val="00FB5FD4"/>
     <w:rPr>
       <w:rFonts w:cstheme="majorBidi" w:eastAsiaTheme="majorEastAsia"/>
       <w:b/>
@@ -5734,16 +7050,17 @@
     <w:link w:val="TitleChar"/>
     <w:uiPriority w:val="10"/>
     <w:qFormat/>
-    <w:rsid w:val="009B7F83"/>
+    <w:rsid w:val="00480FBF"/>
     <w:pPr>
       <w:spacing w:after="80" w:line="240" w:lineRule="auto"/>
       <w:contextualSpacing/>
     </w:pPr>
     <w:rPr>
-      <w:rFonts w:asciiTheme="majorHAnsi" w:cstheme="majorBidi" w:eastAsiaTheme="majorEastAsia" w:hAnsiTheme="majorHAnsi"/>
+      <w:rFonts w:cstheme="majorBidi" w:eastAsiaTheme="majorEastAsia"/>
+      <w:b/>
       <w:spacing w:val="-10"/>
       <w:kern w:val="28"/>
-      <w:sz w:val="56"/>
+      <w:sz w:val="36"/>
       <w:szCs w:val="56"/>
     </w:rPr>
   </w:style>
@@ -5752,12 +7069,13 @@
     <w:basedOn w:val="DefaultParagraphFont"/>
     <w:link w:val="Title"/>
     <w:uiPriority w:val="10"/>
-    <w:rsid w:val="009B7F83"/>
+    <w:rsid w:val="00480FBF"/>
     <w:rPr>
-      <w:rFonts w:asciiTheme="majorHAnsi" w:cstheme="majorBidi" w:eastAsiaTheme="majorEastAsia" w:hAnsiTheme="majorHAnsi"/>
+      <w:rFonts w:cstheme="majorBidi" w:eastAsiaTheme="majorEastAsia"/>
+      <w:b/>
       <w:spacing w:val="-10"/>
       <w:kern w:val="28"/>
-      <w:sz w:val="56"/>
+      <w:sz w:val="36"/>
       <w:szCs w:val="56"/>
       <w:lang w:val="en-GB"/>
     </w:rPr>

</xml_diff>

<commit_message>
see if Si is visable now
</commit_message>
<xml_diff>
--- a/docs/index.docx
+++ b/docs/index.docx
@@ -3603,7 +3603,26 @@
           <w:i/>
           <w:iCs/>
         </w:rPr>
-        <w:t xml:space="preserve">Supplementary tables are provided in the appendices.</w:t>
+        <w:t xml:space="preserve">Supplementary tables are provided in the thesis appendices. For standalone access, render</w:t>
+      </w:r>
+      <w:r>
+        <w:t xml:space="preserve"> </w:t>
+      </w:r>
+      <w:r>
+        <w:rPr>
+          <w:rStyle w:val="VerbatimChar"/>
+        </w:rPr>
+        <w:t xml:space="preserve">supplementary.qmd</w:t>
+      </w:r>
+      <w:r>
+        <w:t xml:space="preserve"> </w:t>
+      </w:r>
+      <w:r>
+        <w:rPr>
+          <w:i/>
+          <w:iCs/>
+        </w:rPr>
+        <w:t xml:space="preserve">in this chapter’s folder.</w:t>
       </w:r>
     </w:p>
     <w:bookmarkEnd w:id="59"/>

</xml_diff>

<commit_message>
now Si updated also?
</commit_message>
<xml_diff>
--- a/docs/index.docx
+++ b/docs/index.docx
@@ -3603,26 +3603,7 @@
           <w:i/>
           <w:iCs/>
         </w:rPr>
-        <w:t xml:space="preserve">Supplementary tables are provided in the thesis appendices. For standalone access, render</w:t>
-      </w:r>
-      <w:r>
-        <w:t xml:space="preserve"> </w:t>
-      </w:r>
-      <w:r>
-        <w:rPr>
-          <w:rStyle w:val="VerbatimChar"/>
-        </w:rPr>
-        <w:t xml:space="preserve">supplementary.qmd</w:t>
-      </w:r>
-      <w:r>
-        <w:t xml:space="preserve"> </w:t>
-      </w:r>
-      <w:r>
-        <w:rPr>
-          <w:i/>
-          <w:iCs/>
-        </w:rPr>
-        <w:t xml:space="preserve">in this chapter’s folder.</w:t>
+        <w:t xml:space="preserve">Supplementary tables are provided in the appendices.</w:t>
       </w:r>
     </w:p>
     <w:bookmarkEnd w:id="59"/>

</xml_diff>